<commit_message>
Adding work from today
</commit_message>
<xml_diff>
--- a/Assessment 1/Ben Timewell - F122A12 - 1. Research and Plan The Development of an AI Simulation Game.docx
+++ b/Assessment 1/Ben Timewell - F122A12 - 1. Research and Plan The Development of an AI Simulation Game.docx
@@ -292,8 +292,13 @@
           </w:tcPr>
           <w:p>
             <w:r>
-              <w:t>Either Pen and Paper, Unity Game Engine, or a digital drawing application (can be Microsoft Paint) for creating the GUI Mockup</w:t>
-            </w:r>
+              <w:t xml:space="preserve">Either Pen and Paper, Unity Game Engine, or a digital drawing application (can be Microsoft Paint) for creating the GUI </w:t>
+            </w:r>
+            <w:proofErr w:type="spellStart"/>
+            <w:r>
+              <w:t>Mockup</w:t>
+            </w:r>
+            <w:proofErr w:type="spellEnd"/>
           </w:p>
         </w:tc>
       </w:tr>
@@ -722,9 +727,11 @@
                 <w:numId w:val="41"/>
               </w:numPr>
             </w:pPr>
+            <w:proofErr w:type="spellStart"/>
             <w:r>
               <w:t>Navmesh</w:t>
             </w:r>
+            <w:proofErr w:type="spellEnd"/>
           </w:p>
           <w:p>
             <w:pPr>
@@ -1072,7 +1079,21 @@
               <w:rPr>
                 <w:szCs w:val="22"/>
               </w:rPr>
-              <w:t>In this section you will need to research Goal Oriented Action Planning, Utility AI, A* Pathfinding, and Navmesh Pathfinding provide answers for the questions provided in order to understand the Systems you will be implementing on the project</w:t>
+              <w:t xml:space="preserve">In this section you will need to research Goal Oriented Action Planning, Utility AI, A* Pathfinding, and </w:t>
+            </w:r>
+            <w:proofErr w:type="spellStart"/>
+            <w:r>
+              <w:rPr>
+                <w:szCs w:val="22"/>
+              </w:rPr>
+              <w:t>Navmesh</w:t>
+            </w:r>
+            <w:proofErr w:type="spellEnd"/>
+            <w:r>
+              <w:rPr>
+                <w:szCs w:val="22"/>
+              </w:rPr>
+              <w:t xml:space="preserve"> Pathfinding provide answers for the questions provided in order to understand the Systems you will be implementing on the project</w:t>
             </w:r>
           </w:p>
           <w:p>
@@ -1477,7 +1498,21 @@
               <w:rPr>
                 <w:iCs/>
               </w:rPr>
-              <w:t>Goal oriented action planning is an AI system that directs an AI actor, such as an NPC, based on given values from a world state, goals and actions that it can perform. It then plans out it’s own behaviour based on that information. This allows an NPC to make decisions for itself within the limits of the information provided with guidance from priority weighting to help it achieve its goals.</w:t>
+              <w:t xml:space="preserve">Goal oriented action planning is an AI system that directs an AI actor, such as an NPC, based on given values from a world state, goals and actions that it can perform. It then plans out </w:t>
+            </w:r>
+            <w:proofErr w:type="spellStart"/>
+            <w:r>
+              <w:rPr>
+                <w:iCs/>
+              </w:rPr>
+              <w:t>it’s</w:t>
+            </w:r>
+            <w:proofErr w:type="spellEnd"/>
+            <w:r>
+              <w:rPr>
+                <w:iCs/>
+              </w:rPr>
+              <w:t xml:space="preserve"> own behaviour based on that information. This allows an NPC to make decisions for itself within the limits of the information provided with guidance from priority weighting to help it achieve its goals.</w:t>
             </w:r>
           </w:p>
         </w:tc>
@@ -1538,7 +1573,35 @@
               <w:rPr>
                 <w:iCs/>
               </w:rPr>
-              <w:t>World states is the repository of information that represents everything an AI actor or NPC needs to know in order to preform actions in the game world. These can also dictate if an NPC can heal if a Boolean is set as “is_damaged = True” or if they need to sleep if it’s nighttime (“is_day = False”) etc.</w:t>
+              <w:t>World states is the repository of information that represents everything an AI actor or NPC needs to know in order to preform actions in the game world. These can also dictate if an NPC can heal if a Boolean is set as “</w:t>
+            </w:r>
+            <w:proofErr w:type="spellStart"/>
+            <w:r>
+              <w:rPr>
+                <w:iCs/>
+              </w:rPr>
+              <w:t>is_damaged</w:t>
+            </w:r>
+            <w:proofErr w:type="spellEnd"/>
+            <w:r>
+              <w:rPr>
+                <w:iCs/>
+              </w:rPr>
+              <w:t xml:space="preserve"> = True” or if they need to sleep if it’s nighttime (“</w:t>
+            </w:r>
+            <w:proofErr w:type="spellStart"/>
+            <w:r>
+              <w:rPr>
+                <w:iCs/>
+              </w:rPr>
+              <w:t>is_day</w:t>
+            </w:r>
+            <w:proofErr w:type="spellEnd"/>
+            <w:r>
+              <w:rPr>
+                <w:iCs/>
+              </w:rPr>
+              <w:t xml:space="preserve"> = False”) etc.</w:t>
             </w:r>
           </w:p>
         </w:tc>
@@ -2213,7 +2276,21 @@
               <w:rPr>
                 <w:iCs/>
               </w:rPr>
-              <w:t>F.E.A.R. uses GOAP for it’s enemy AI</w:t>
+              <w:t xml:space="preserve">F.E.A.R. uses GOAP for </w:t>
+            </w:r>
+            <w:proofErr w:type="spellStart"/>
+            <w:r>
+              <w:rPr>
+                <w:iCs/>
+              </w:rPr>
+              <w:t>it’s</w:t>
+            </w:r>
+            <w:proofErr w:type="spellEnd"/>
+            <w:r>
+              <w:rPr>
+                <w:iCs/>
+              </w:rPr>
+              <w:t xml:space="preserve"> enemy AI</w:t>
             </w:r>
             <w:r>
               <w:rPr>
@@ -2245,7 +2322,21 @@
               <w:rPr>
                 <w:iCs/>
               </w:rPr>
-              <w:t>Side note: F.E.A.R. gave me nightmares as a kid at how scary it was, so I spent a long time trying to figure out ways to out smart the AI. I didn’t know about GOAP at the time, so I was very confused why the same tactic didn’t work twice. It makes sense now.</w:t>
+              <w:t xml:space="preserve">Side note: F.E.A.R. gave me nightmares as a kid at how scary it was, so I spent a long time trying to figure out ways to </w:t>
+            </w:r>
+            <w:proofErr w:type="spellStart"/>
+            <w:r>
+              <w:rPr>
+                <w:iCs/>
+              </w:rPr>
+              <w:t>out smart</w:t>
+            </w:r>
+            <w:proofErr w:type="spellEnd"/>
+            <w:r>
+              <w:rPr>
+                <w:iCs/>
+              </w:rPr>
+              <w:t xml:space="preserve"> the AI. I didn’t know about GOAP at the time, so I was very confused why the same tactic didn’t work twice. It makes sense now.</w:t>
             </w:r>
           </w:p>
           <w:p>
@@ -2365,26 +2456,18 @@
                 <w:iCs/>
               </w:rPr>
             </w:pPr>
-          </w:p>
-          <w:p>
-            <w:pPr>
-              <w:pStyle w:val="ListParagraph"/>
-              <w:spacing w:line="240" w:lineRule="auto"/>
-              <w:ind w:left="0"/>
-              <w:rPr>
-                <w:iCs/>
-              </w:rPr>
-            </w:pPr>
-          </w:p>
-          <w:p>
-            <w:pPr>
-              <w:pStyle w:val="ListParagraph"/>
-              <w:spacing w:line="240" w:lineRule="auto"/>
-              <w:ind w:left="0"/>
-              <w:rPr>
-                <w:iCs/>
-              </w:rPr>
-            </w:pPr>
+            <w:r>
+              <w:rPr>
+                <w:iCs/>
+              </w:rPr>
+              <w:t>Utility AI looks at all available actions and assigns each one a score</w:t>
+            </w:r>
+            <w:r>
+              <w:rPr>
+                <w:iCs/>
+              </w:rPr>
+              <w:t>, which is based on a number of stats and how likely each action will succeed. The action with the highest chance of succeeding gets picked and then ran. Overall, Utility AI is a very effective way of decision making, so long as it’s configured correctly from the start.</w:t>
+            </w:r>
           </w:p>
         </w:tc>
       </w:tr>
@@ -2440,26 +2523,18 @@
                 <w:iCs/>
               </w:rPr>
             </w:pPr>
-          </w:p>
-          <w:p>
-            <w:pPr>
-              <w:pStyle w:val="ListParagraph"/>
-              <w:spacing w:line="240" w:lineRule="auto"/>
-              <w:ind w:left="0"/>
-              <w:rPr>
-                <w:iCs/>
-              </w:rPr>
-            </w:pPr>
-          </w:p>
-          <w:p>
-            <w:pPr>
-              <w:pStyle w:val="ListParagraph"/>
-              <w:spacing w:line="240" w:lineRule="auto"/>
-              <w:ind w:left="0"/>
-              <w:rPr>
-                <w:iCs/>
-              </w:rPr>
-            </w:pPr>
+            <w:r>
+              <w:rPr>
+                <w:iCs/>
+              </w:rPr>
+              <w:t>In Utility AI, each possible action is given a score based on how desirable it is in the current situation. Actions do not consider every stat, as that would make it an even score every time. Instead, each action evaluates the specific factors that are relevant to it, like health of the NPC, if they are near cover, how many enemies are in range</w:t>
+            </w:r>
+            <w:r>
+              <w:rPr>
+                <w:iCs/>
+              </w:rPr>
+              <w:t>, etc. With all these factors combined would produce a single utility score, which higher the score, the more desirable the action is. The AI would then compare the scores of all actions and then selects the one with the highest score.</w:t>
+            </w:r>
           </w:p>
         </w:tc>
       </w:tr>
@@ -2515,26 +2590,18 @@
                 <w:iCs/>
               </w:rPr>
             </w:pPr>
-          </w:p>
-          <w:p>
-            <w:pPr>
-              <w:pStyle w:val="ListParagraph"/>
-              <w:spacing w:line="240" w:lineRule="auto"/>
-              <w:ind w:left="0"/>
-              <w:rPr>
-                <w:iCs/>
-              </w:rPr>
-            </w:pPr>
-          </w:p>
-          <w:p>
-            <w:pPr>
-              <w:pStyle w:val="ListParagraph"/>
-              <w:spacing w:line="240" w:lineRule="auto"/>
-              <w:ind w:left="0"/>
-              <w:rPr>
-                <w:iCs/>
-              </w:rPr>
-            </w:pPr>
+            <w:r>
+              <w:rPr>
+                <w:iCs/>
+              </w:rPr>
+              <w:t xml:space="preserve">Bucketing in Utility AI is grouping similar actions into a “bucket” (basically, a group of actions). It’s also a way of managing actions that would be considered and others that wouldn’t, such as an NPC </w:t>
+            </w:r>
+            <w:r>
+              <w:rPr>
+                <w:iCs/>
+              </w:rPr>
+              <w:t>that’s hungry, won’t go do another action, they’ll focus on getting food. It’s worth noting that if two buckets score the same and are selected, it’ll check all actions within the buckets and the one with the highest individual action score will be selected from that bucket.</w:t>
+            </w:r>
           </w:p>
         </w:tc>
       </w:tr>
@@ -2590,26 +2657,12 @@
                 <w:iCs/>
               </w:rPr>
             </w:pPr>
-          </w:p>
-          <w:p>
-            <w:pPr>
-              <w:pStyle w:val="ListParagraph"/>
-              <w:spacing w:line="240" w:lineRule="auto"/>
-              <w:ind w:left="0"/>
-              <w:rPr>
-                <w:iCs/>
-              </w:rPr>
-            </w:pPr>
-          </w:p>
-          <w:p>
-            <w:pPr>
-              <w:pStyle w:val="ListParagraph"/>
-              <w:spacing w:line="240" w:lineRule="auto"/>
-              <w:ind w:left="0"/>
-              <w:rPr>
-                <w:iCs/>
-              </w:rPr>
-            </w:pPr>
+            <w:r>
+              <w:rPr>
+                <w:iCs/>
+              </w:rPr>
+              <w:t>Weighting is an alternative to bucketing, but rather than grouping actions, all actions have their base score, and the weighting is a modifier applied to the base value. Such as, an aggressive NPC would have a higher modifier for attacking, compared to being defensive, so even though the base value for attacking is lower than a defensive action, the weight / modifier increases it’s score (also known as the weighted score).</w:t>
+            </w:r>
           </w:p>
         </w:tc>
       </w:tr>
@@ -2665,26 +2718,105 @@
                 <w:iCs/>
               </w:rPr>
             </w:pPr>
+            <w:r>
+              <w:rPr>
+                <w:iCs/>
+              </w:rPr>
+              <w:t>The benefits of a Utility AI are:</w:t>
+            </w:r>
           </w:p>
           <w:p>
             <w:pPr>
               <w:pStyle w:val="ListParagraph"/>
-              <w:spacing w:line="240" w:lineRule="auto"/>
-              <w:ind w:left="0"/>
-              <w:rPr>
-                <w:iCs/>
-              </w:rPr>
-            </w:pPr>
+              <w:numPr>
+                <w:ilvl w:val="0"/>
+                <w:numId w:val="43"/>
+              </w:numPr>
+              <w:spacing w:line="240" w:lineRule="auto"/>
+              <w:rPr>
+                <w:iCs/>
+              </w:rPr>
+            </w:pPr>
+            <w:r>
+              <w:rPr>
+                <w:b/>
+                <w:bCs w:val="0"/>
+                <w:iCs/>
+              </w:rPr>
+              <w:t>Dynamic decisions</w:t>
+            </w:r>
+            <w:r>
+              <w:rPr>
+                <w:iCs/>
+              </w:rPr>
+              <w:t>: The AI adapts to changing situations based on factors fed into it</w:t>
+            </w:r>
           </w:p>
           <w:p>
             <w:pPr>
               <w:pStyle w:val="ListParagraph"/>
-              <w:spacing w:line="240" w:lineRule="auto"/>
-              <w:ind w:left="0"/>
-              <w:rPr>
-                <w:iCs/>
-              </w:rPr>
-            </w:pPr>
+              <w:numPr>
+                <w:ilvl w:val="0"/>
+                <w:numId w:val="43"/>
+              </w:numPr>
+              <w:spacing w:line="240" w:lineRule="auto"/>
+              <w:rPr>
+                <w:iCs/>
+              </w:rPr>
+            </w:pPr>
+            <w:r>
+              <w:rPr>
+                <w:b/>
+                <w:bCs w:val="0"/>
+                <w:iCs/>
+              </w:rPr>
+              <w:t>Individual control:</w:t>
+            </w:r>
+            <w:r>
+              <w:rPr>
+                <w:iCs/>
+              </w:rPr>
+              <w:t xml:space="preserve"> Weighting can be adjusted on the fly by the AI to slowly learn and adjust what actions </w:t>
+            </w:r>
+            <w:r>
+              <w:rPr>
+                <w:iCs/>
+              </w:rPr>
+              <w:t>it</w:t>
+            </w:r>
+            <w:r>
+              <w:rPr>
+                <w:iCs/>
+              </w:rPr>
+              <w:t xml:space="preserve"> would do, compared to another agent that might go down a different route when it comes to adjusting its own weighting (EG: an NPC that decides to focus more on farming, than another that focuses on mining)</w:t>
+            </w:r>
+          </w:p>
+          <w:p>
+            <w:pPr>
+              <w:pStyle w:val="ListParagraph"/>
+              <w:numPr>
+                <w:ilvl w:val="0"/>
+                <w:numId w:val="43"/>
+              </w:numPr>
+              <w:spacing w:line="240" w:lineRule="auto"/>
+              <w:rPr>
+                <w:iCs/>
+              </w:rPr>
+            </w:pPr>
+            <w:r>
+              <w:rPr>
+                <w:b/>
+                <w:bCs w:val="0"/>
+                <w:iCs/>
+              </w:rPr>
+              <w:t>Scalable:</w:t>
+            </w:r>
+            <w:r>
+              <w:rPr>
+                <w:iCs/>
+              </w:rPr>
+              <w:t xml:space="preserve"> If setup correctly, it can easily scale with new factors</w:t>
+            </w:r>
           </w:p>
         </w:tc>
       </w:tr>
@@ -2713,6 +2845,7 @@
         <w:rPr>
           <w:iCs/>
         </w:rPr>
+        <w:lastRenderedPageBreak/>
         <w:t>What are the downsides of using Utility AI?</w:t>
       </w:r>
     </w:p>
@@ -2740,26 +2873,120 @@
                 <w:iCs/>
               </w:rPr>
             </w:pPr>
+            <w:r>
+              <w:rPr>
+                <w:iCs/>
+              </w:rPr>
+              <w:t>The downsides of Utility AI are:</w:t>
+            </w:r>
           </w:p>
           <w:p>
             <w:pPr>
               <w:pStyle w:val="ListParagraph"/>
-              <w:spacing w:line="240" w:lineRule="auto"/>
-              <w:ind w:left="0"/>
-              <w:rPr>
-                <w:iCs/>
-              </w:rPr>
-            </w:pPr>
+              <w:numPr>
+                <w:ilvl w:val="0"/>
+                <w:numId w:val="43"/>
+              </w:numPr>
+              <w:spacing w:line="240" w:lineRule="auto"/>
+              <w:rPr>
+                <w:iCs/>
+              </w:rPr>
+            </w:pPr>
+            <w:r>
+              <w:rPr>
+                <w:b/>
+                <w:bCs w:val="0"/>
+                <w:iCs/>
+              </w:rPr>
+              <w:t>Complexity:</w:t>
+            </w:r>
+            <w:r>
+              <w:rPr>
+                <w:iCs/>
+              </w:rPr>
+              <w:t xml:space="preserve"> Designing the right factors from the start, with the right weights and curves can be tricky, and will need tweaking as development goes on</w:t>
+            </w:r>
           </w:p>
           <w:p>
             <w:pPr>
               <w:pStyle w:val="ListParagraph"/>
-              <w:spacing w:line="240" w:lineRule="auto"/>
-              <w:ind w:left="0"/>
-              <w:rPr>
-                <w:iCs/>
-              </w:rPr>
-            </w:pPr>
+              <w:numPr>
+                <w:ilvl w:val="0"/>
+                <w:numId w:val="43"/>
+              </w:numPr>
+              <w:spacing w:line="240" w:lineRule="auto"/>
+              <w:rPr>
+                <w:iCs/>
+              </w:rPr>
+            </w:pPr>
+            <w:r>
+              <w:rPr>
+                <w:b/>
+                <w:bCs w:val="0"/>
+                <w:iCs/>
+              </w:rPr>
+              <w:t>Performance:</w:t>
+            </w:r>
+            <w:r>
+              <w:rPr>
+                <w:iCs/>
+              </w:rPr>
+              <w:t xml:space="preserve"> Scoring many actions at once can cause drops in performance if there are many NPC’s trying to perform actions</w:t>
+            </w:r>
+          </w:p>
+          <w:p>
+            <w:pPr>
+              <w:pStyle w:val="ListParagraph"/>
+              <w:numPr>
+                <w:ilvl w:val="0"/>
+                <w:numId w:val="43"/>
+              </w:numPr>
+              <w:spacing w:line="240" w:lineRule="auto"/>
+              <w:rPr>
+                <w:iCs/>
+              </w:rPr>
+            </w:pPr>
+            <w:r>
+              <w:rPr>
+                <w:b/>
+                <w:bCs w:val="0"/>
+                <w:iCs/>
+              </w:rPr>
+              <w:t>Balancing issues:</w:t>
+            </w:r>
+            <w:r>
+              <w:rPr>
+                <w:iCs/>
+              </w:rPr>
+              <w:t xml:space="preserve"> If weights or scores aren’t properly configured or balanced, the AI will pick incorrect actions</w:t>
+            </w:r>
+          </w:p>
+          <w:p>
+            <w:pPr>
+              <w:pStyle w:val="ListParagraph"/>
+              <w:numPr>
+                <w:ilvl w:val="0"/>
+                <w:numId w:val="43"/>
+              </w:numPr>
+              <w:spacing w:line="240" w:lineRule="auto"/>
+              <w:rPr>
+                <w:iCs/>
+              </w:rPr>
+            </w:pPr>
+            <w:r>
+              <w:rPr>
+                <w:b/>
+                <w:bCs w:val="0"/>
+                <w:iCs/>
+              </w:rPr>
+              <w:t xml:space="preserve">Tuning: </w:t>
+            </w:r>
+            <w:r>
+              <w:rPr>
+                <w:iCs/>
+              </w:rPr>
+              <w:t>Finding the right balance for scores and weights can take a long time, requiring lots of retuning and testing for it to be perfect</w:t>
+            </w:r>
           </w:p>
         </w:tc>
       </w:tr>
@@ -2815,6 +3042,12 @@
                 <w:iCs/>
               </w:rPr>
             </w:pPr>
+            <w:r>
+              <w:rPr>
+                <w:iCs/>
+              </w:rPr>
+              <w:t>The Sims series.</w:t>
+            </w:r>
           </w:p>
           <w:p>
             <w:pPr>
@@ -2835,6 +3068,12 @@
                 <w:iCs/>
               </w:rPr>
             </w:pPr>
+            <w:r>
+              <w:rPr>
+                <w:iCs/>
+              </w:rPr>
+              <w:t>The Sims uses Utility AI to decide what actions each Sim should take, such as getting food if their hunger meter is empty, or using the bathroom if their bladder is full. But it takes into account all factors, so it can properly adjust what action the Sim needs to take. For example, if hunger is empty, but bladder is near full, the Sim will get food before using the restroom. Or if their fun meter is empty, they may decide to do something fun before eating.</w:t>
+            </w:r>
           </w:p>
         </w:tc>
       </w:tr>
@@ -2945,26 +3184,12 @@
                 <w:iCs/>
               </w:rPr>
             </w:pPr>
-          </w:p>
-          <w:p>
-            <w:pPr>
-              <w:pStyle w:val="ListParagraph"/>
-              <w:spacing w:line="240" w:lineRule="auto"/>
-              <w:ind w:left="0"/>
-              <w:rPr>
-                <w:iCs/>
-              </w:rPr>
-            </w:pPr>
-          </w:p>
-          <w:p>
-            <w:pPr>
-              <w:pStyle w:val="ListParagraph"/>
-              <w:spacing w:line="240" w:lineRule="auto"/>
-              <w:ind w:left="0"/>
-              <w:rPr>
-                <w:iCs/>
-              </w:rPr>
-            </w:pPr>
+            <w:r>
+              <w:rPr>
+                <w:iCs/>
+              </w:rPr>
+              <w:t>A* pathfinding is an algorithm used to find the shortest path between two points on a map / grid. It evaluates possible routes by combining two costs, the actual distance from the start as the estimated distance to the goal. Adding these together, A* chooses a path that is efficient and likely lead to the goal quickly.</w:t>
+            </w:r>
           </w:p>
         </w:tc>
       </w:tr>
@@ -3021,6 +3246,12 @@
                 <w:iCs/>
               </w:rPr>
             </w:pPr>
+            <w:r>
+              <w:rPr>
+                <w:iCs/>
+              </w:rPr>
+              <w:t>A* works by exploring possible paths from a start point and the end point, it keeps an open list of nodes to visit and a closed list of nodes that it’s already checked, for each node, it calculates the g-cost (distance from the start), the h-cost (estimate distance to the goal) and f-cost, which is g-cost + h-cost.</w:t>
+            </w:r>
           </w:p>
           <w:p>
             <w:pPr>
@@ -3041,6 +3272,12 @@
                 <w:iCs/>
               </w:rPr>
             </w:pPr>
+            <w:r>
+              <w:rPr>
+                <w:iCs/>
+              </w:rPr>
+              <w:t>The algorithm always chooses the node with the lowest f-cost to explore next, and continues to do so until it reaches the goal / end point, then it traces back through the nodes to create the shortest path.</w:t>
+            </w:r>
           </w:p>
         </w:tc>
       </w:tr>
@@ -3103,26 +3340,128 @@
                 <w:iCs/>
               </w:rPr>
             </w:pPr>
+            <w:r>
+              <w:rPr>
+                <w:iCs/>
+              </w:rPr>
+              <w:t>The benefits of A* pathfinding are:</w:t>
+            </w:r>
           </w:p>
           <w:p>
             <w:pPr>
               <w:pStyle w:val="ListParagraph"/>
-              <w:spacing w:line="240" w:lineRule="auto"/>
-              <w:ind w:left="0"/>
-              <w:rPr>
-                <w:iCs/>
-              </w:rPr>
-            </w:pPr>
+              <w:numPr>
+                <w:ilvl w:val="0"/>
+                <w:numId w:val="43"/>
+              </w:numPr>
+              <w:spacing w:line="240" w:lineRule="auto"/>
+              <w:rPr>
+                <w:b/>
+                <w:bCs w:val="0"/>
+                <w:iCs/>
+              </w:rPr>
+            </w:pPr>
+            <w:r>
+              <w:rPr>
+                <w:b/>
+                <w:bCs w:val="0"/>
+                <w:iCs/>
+              </w:rPr>
+              <w:t xml:space="preserve">Finds the shortest path: </w:t>
+            </w:r>
+            <w:r>
+              <w:rPr>
+                <w:iCs/>
+              </w:rPr>
+              <w:t>A* will always find the shortest and most efficient route between two points</w:t>
+            </w:r>
           </w:p>
           <w:p>
             <w:pPr>
               <w:pStyle w:val="ListParagraph"/>
-              <w:spacing w:line="240" w:lineRule="auto"/>
-              <w:ind w:left="0"/>
-              <w:rPr>
-                <w:iCs/>
-              </w:rPr>
-            </w:pPr>
+              <w:numPr>
+                <w:ilvl w:val="0"/>
+                <w:numId w:val="43"/>
+              </w:numPr>
+              <w:spacing w:line="240" w:lineRule="auto"/>
+              <w:rPr>
+                <w:b/>
+                <w:bCs w:val="0"/>
+                <w:iCs/>
+              </w:rPr>
+            </w:pPr>
+            <w:r>
+              <w:rPr>
+                <w:b/>
+                <w:bCs w:val="0"/>
+                <w:iCs/>
+              </w:rPr>
+              <w:t xml:space="preserve">Flexibility: </w:t>
+            </w:r>
+            <w:r>
+              <w:rPr>
+                <w:iCs/>
+              </w:rPr>
+              <w:t>Works well with grids, graphs and other navigation meshes</w:t>
+            </w:r>
+          </w:p>
+          <w:p>
+            <w:pPr>
+              <w:pStyle w:val="ListParagraph"/>
+              <w:numPr>
+                <w:ilvl w:val="0"/>
+                <w:numId w:val="43"/>
+              </w:numPr>
+              <w:spacing w:line="240" w:lineRule="auto"/>
+              <w:rPr>
+                <w:b/>
+                <w:bCs w:val="0"/>
+                <w:iCs/>
+              </w:rPr>
+            </w:pPr>
+            <w:r>
+              <w:rPr>
+                <w:b/>
+                <w:bCs w:val="0"/>
+                <w:iCs/>
+              </w:rPr>
+              <w:t xml:space="preserve">Efficient: </w:t>
+            </w:r>
+            <w:r>
+              <w:rPr>
+                <w:iCs/>
+              </w:rPr>
+              <w:t>Uses a heuristic to focus the search, reducing unnecessary checks</w:t>
+            </w:r>
+          </w:p>
+          <w:p>
+            <w:pPr>
+              <w:pStyle w:val="ListParagraph"/>
+              <w:numPr>
+                <w:ilvl w:val="0"/>
+                <w:numId w:val="43"/>
+              </w:numPr>
+              <w:spacing w:line="240" w:lineRule="auto"/>
+              <w:rPr>
+                <w:b/>
+                <w:bCs w:val="0"/>
+                <w:iCs/>
+              </w:rPr>
+            </w:pPr>
+            <w:r>
+              <w:rPr>
+                <w:b/>
+                <w:bCs w:val="0"/>
+                <w:iCs/>
+              </w:rPr>
+              <w:t xml:space="preserve">Common: </w:t>
+            </w:r>
+            <w:r>
+              <w:rPr>
+                <w:iCs/>
+              </w:rPr>
+              <w:t>It’s widely used and implemented in many games with AI systems</w:t>
+            </w:r>
           </w:p>
         </w:tc>
       </w:tr>
@@ -3179,26 +3518,148 @@
                 <w:iCs/>
               </w:rPr>
             </w:pPr>
+            <w:r>
+              <w:rPr>
+                <w:iCs/>
+              </w:rPr>
+              <w:t>The downsides of using A* pathfinding are:</w:t>
+            </w:r>
           </w:p>
           <w:p>
             <w:pPr>
               <w:pStyle w:val="ListParagraph"/>
-              <w:spacing w:line="240" w:lineRule="auto"/>
-              <w:ind w:left="0"/>
-              <w:rPr>
-                <w:iCs/>
-              </w:rPr>
-            </w:pPr>
+              <w:numPr>
+                <w:ilvl w:val="0"/>
+                <w:numId w:val="43"/>
+              </w:numPr>
+              <w:spacing w:line="240" w:lineRule="auto"/>
+              <w:rPr>
+                <w:iCs/>
+              </w:rPr>
+            </w:pPr>
+            <w:r>
+              <w:rPr>
+                <w:b/>
+                <w:bCs w:val="0"/>
+                <w:iCs/>
+              </w:rPr>
+              <w:t xml:space="preserve">Performance cost: </w:t>
+            </w:r>
+            <w:r>
+              <w:rPr>
+                <w:iCs/>
+              </w:rPr>
+              <w:t>Can be slow on larger or complex maps, requiring more node checking</w:t>
+            </w:r>
           </w:p>
           <w:p>
             <w:pPr>
               <w:pStyle w:val="ListParagraph"/>
-              <w:spacing w:line="240" w:lineRule="auto"/>
-              <w:ind w:left="0"/>
-              <w:rPr>
-                <w:iCs/>
-              </w:rPr>
-            </w:pPr>
+              <w:numPr>
+                <w:ilvl w:val="0"/>
+                <w:numId w:val="43"/>
+              </w:numPr>
+              <w:spacing w:line="240" w:lineRule="auto"/>
+              <w:rPr>
+                <w:iCs/>
+              </w:rPr>
+            </w:pPr>
+            <w:r>
+              <w:rPr>
+                <w:b/>
+                <w:bCs w:val="0"/>
+                <w:iCs/>
+              </w:rPr>
+              <w:t>Memory usage:</w:t>
+            </w:r>
+            <w:r>
+              <w:rPr>
+                <w:iCs/>
+              </w:rPr>
+              <w:t xml:space="preserve"> Directly relates to performance cost, but due it’s nature of opening and closing lists, these can grow very large and can hit memory limits on low-end systems</w:t>
+            </w:r>
+          </w:p>
+          <w:p>
+            <w:pPr>
+              <w:pStyle w:val="ListParagraph"/>
+              <w:numPr>
+                <w:ilvl w:val="0"/>
+                <w:numId w:val="43"/>
+              </w:numPr>
+              <w:spacing w:line="240" w:lineRule="auto"/>
+              <w:rPr>
+                <w:iCs/>
+              </w:rPr>
+            </w:pPr>
+            <w:r>
+              <w:rPr>
+                <w:b/>
+                <w:bCs w:val="0"/>
+                <w:iCs/>
+              </w:rPr>
+              <w:t>Static assumptions:</w:t>
+            </w:r>
+            <w:r>
+              <w:rPr>
+                <w:iCs/>
+              </w:rPr>
+              <w:t xml:space="preserve"> A* assumes the map doesn’t change or obstacles </w:t>
+            </w:r>
+            <w:r>
+              <w:rPr>
+                <w:iCs/>
+              </w:rPr>
+              <w:t xml:space="preserve">can move into the path chosen, requiring the NPC to stop and re-evaluate </w:t>
+            </w:r>
+            <w:proofErr w:type="spellStart"/>
+            <w:r>
+              <w:rPr>
+                <w:iCs/>
+              </w:rPr>
+              <w:t>it’s</w:t>
+            </w:r>
+            <w:proofErr w:type="spellEnd"/>
+            <w:r>
+              <w:rPr>
+                <w:iCs/>
+              </w:rPr>
+              <w:t xml:space="preserve"> path.</w:t>
+            </w:r>
+          </w:p>
+          <w:p>
+            <w:pPr>
+              <w:pStyle w:val="ListParagraph"/>
+              <w:numPr>
+                <w:ilvl w:val="0"/>
+                <w:numId w:val="43"/>
+              </w:numPr>
+              <w:spacing w:line="240" w:lineRule="auto"/>
+              <w:rPr>
+                <w:iCs/>
+              </w:rPr>
+            </w:pPr>
+            <w:r>
+              <w:rPr>
+                <w:b/>
+                <w:bCs w:val="0"/>
+                <w:iCs/>
+              </w:rPr>
+              <w:t>Heuristic dependent:</w:t>
+            </w:r>
+            <w:r>
+              <w:rPr>
+                <w:b/>
+                <w:bCs w:val="0"/>
+                <w:iCs/>
+              </w:rPr>
+              <w:t xml:space="preserve"> </w:t>
+            </w:r>
+            <w:r>
+              <w:rPr>
+                <w:iCs/>
+              </w:rPr>
+              <w:t>Poor heuristics can make it inefficient or produce suboptimal paths</w:t>
+            </w:r>
           </w:p>
         </w:tc>
       </w:tr>
@@ -3261,6 +3722,12 @@
                 <w:iCs/>
               </w:rPr>
             </w:pPr>
+            <w:r>
+              <w:rPr>
+                <w:iCs/>
+              </w:rPr>
+              <w:t>A* pathfinding was created as part of the Shakey project at the Standard Research Institute, which aimed to build a mobile robot that could plan its own actions.</w:t>
+            </w:r>
           </w:p>
           <w:p>
             <w:pPr>
@@ -3281,39 +3748,49 @@
                 <w:iCs/>
               </w:rPr>
             </w:pPr>
+            <w:r>
+              <w:rPr>
+                <w:iCs/>
+              </w:rPr>
+              <w:t>The original A* paper was published in 1968, by Nils Nilsson, Bertram Raphael and Peter Hart.</w:t>
+            </w:r>
+          </w:p>
+          <w:p>
+            <w:pPr>
+              <w:pStyle w:val="ListParagraph"/>
+              <w:spacing w:line="240" w:lineRule="auto"/>
+              <w:ind w:left="0"/>
+              <w:rPr>
+                <w:iCs/>
+              </w:rPr>
+            </w:pPr>
+            <w:r>
+              <w:rPr>
+                <w:iCs/>
+              </w:rPr>
+              <w:t xml:space="preserve">Source: </w:t>
+            </w:r>
+            <w:hyperlink r:id="rId12" w:history="1">
+              <w:r>
+                <w:rPr>
+                  <w:rStyle w:val="Hyperlink"/>
+                  <w:iCs/>
+                </w:rPr>
+                <w:t>https://en.wikipedia.org/wiki/A%2A_search_algorithm#History</w:t>
+              </w:r>
+            </w:hyperlink>
+            <w:r>
+              <w:rPr>
+                <w:iCs/>
+              </w:rPr>
+              <w:t xml:space="preserve"> </w:t>
+            </w:r>
           </w:p>
         </w:tc>
       </w:tr>
     </w:tbl>
     <w:p>
       <w:pPr>
-        <w:pStyle w:val="ListParagraph"/>
-        <w:spacing w:line="240" w:lineRule="auto"/>
-        <w:rPr>
-          <w:iCs/>
-        </w:rPr>
-      </w:pPr>
-    </w:p>
-    <w:p>
-      <w:pPr>
-        <w:spacing w:line="240" w:lineRule="auto"/>
-        <w:rPr>
-          <w:b/>
-          <w:bCs w:val="0"/>
-          <w:iCs/>
-        </w:rPr>
-      </w:pPr>
-      <w:r>
-        <w:rPr>
-          <w:b/>
-          <w:bCs w:val="0"/>
-          <w:iCs/>
-        </w:rPr>
-        <w:br w:type="page"/>
-      </w:r>
-    </w:p>
-    <w:p>
-      <w:pPr>
         <w:spacing w:line="240" w:lineRule="auto"/>
         <w:rPr>
           <w:b/>
@@ -3328,8 +3805,18 @@
           <w:iCs/>
         </w:rPr>
         <w:lastRenderedPageBreak/>
-        <w:t>4. Navmesh</w:t>
-      </w:r>
+        <w:t xml:space="preserve">4. </w:t>
+      </w:r>
+      <w:proofErr w:type="spellStart"/>
+      <w:r>
+        <w:rPr>
+          <w:b/>
+          <w:bCs w:val="0"/>
+          <w:iCs/>
+        </w:rPr>
+        <w:t>Navmesh</w:t>
+      </w:r>
+      <w:proofErr w:type="spellEnd"/>
       <w:r>
         <w:rPr>
           <w:b/>
@@ -3371,7 +3858,21 @@
         <w:rPr>
           <w:iCs/>
         </w:rPr>
-        <w:t>What is Navmesh?</w:t>
+        <w:t xml:space="preserve">What is </w:t>
+      </w:r>
+      <w:proofErr w:type="spellStart"/>
+      <w:r>
+        <w:rPr>
+          <w:iCs/>
+        </w:rPr>
+        <w:t>Navmesh</w:t>
+      </w:r>
+      <w:proofErr w:type="spellEnd"/>
+      <w:r>
+        <w:rPr>
+          <w:iCs/>
+        </w:rPr>
+        <w:t>?</w:t>
       </w:r>
     </w:p>
     <w:tbl>
@@ -3398,26 +3899,20 @@
                 <w:iCs/>
               </w:rPr>
             </w:pPr>
-          </w:p>
-          <w:p>
-            <w:pPr>
-              <w:pStyle w:val="ListParagraph"/>
-              <w:spacing w:line="240" w:lineRule="auto"/>
-              <w:ind w:left="0"/>
-              <w:rPr>
-                <w:iCs/>
-              </w:rPr>
-            </w:pPr>
-          </w:p>
-          <w:p>
-            <w:pPr>
-              <w:pStyle w:val="ListParagraph"/>
-              <w:spacing w:line="240" w:lineRule="auto"/>
-              <w:ind w:left="0"/>
-              <w:rPr>
-                <w:iCs/>
-              </w:rPr>
-            </w:pPr>
+            <w:proofErr w:type="spellStart"/>
+            <w:r>
+              <w:rPr>
+                <w:iCs/>
+              </w:rPr>
+              <w:t>Navmesh</w:t>
+            </w:r>
+            <w:proofErr w:type="spellEnd"/>
+            <w:r>
+              <w:rPr>
+                <w:iCs/>
+              </w:rPr>
+              <w:t xml:space="preserve"> is a data structure used in games to represent the walkable areas of a level or environment.</w:t>
+            </w:r>
           </w:p>
         </w:tc>
       </w:tr>
@@ -3447,7 +3942,21 @@
         <w:rPr>
           <w:iCs/>
         </w:rPr>
-        <w:t>How does Navmesh generate a walkable map?</w:t>
+        <w:t xml:space="preserve">How does </w:t>
+      </w:r>
+      <w:proofErr w:type="spellStart"/>
+      <w:r>
+        <w:rPr>
+          <w:iCs/>
+        </w:rPr>
+        <w:t>Navmesh</w:t>
+      </w:r>
+      <w:proofErr w:type="spellEnd"/>
+      <w:r>
+        <w:rPr>
+          <w:iCs/>
+        </w:rPr>
+        <w:t xml:space="preserve"> generate a walkable map?</w:t>
       </w:r>
     </w:p>
     <w:tbl>
@@ -3474,26 +3983,50 @@
                 <w:iCs/>
               </w:rPr>
             </w:pPr>
-          </w:p>
-          <w:p>
-            <w:pPr>
-              <w:pStyle w:val="ListParagraph"/>
-              <w:spacing w:line="240" w:lineRule="auto"/>
-              <w:ind w:left="0"/>
-              <w:rPr>
-                <w:iCs/>
-              </w:rPr>
-            </w:pPr>
-          </w:p>
-          <w:p>
-            <w:pPr>
-              <w:pStyle w:val="ListParagraph"/>
-              <w:spacing w:line="240" w:lineRule="auto"/>
-              <w:ind w:left="0"/>
-              <w:rPr>
-                <w:iCs/>
-              </w:rPr>
-            </w:pPr>
+            <w:r>
+              <w:rPr>
+                <w:iCs/>
+              </w:rPr>
+              <w:t xml:space="preserve">A </w:t>
+            </w:r>
+            <w:proofErr w:type="spellStart"/>
+            <w:r>
+              <w:rPr>
+                <w:iCs/>
+              </w:rPr>
+              <w:t>Navmesh</w:t>
+            </w:r>
+            <w:proofErr w:type="spellEnd"/>
+            <w:r>
+              <w:rPr>
+                <w:iCs/>
+              </w:rPr>
+              <w:t xml:space="preserve"> generates a walkable map by analysing the level of geometry and identifying all areas that an AI agent can walk </w:t>
+            </w:r>
+            <w:r>
+              <w:rPr>
+                <w:iCs/>
+              </w:rPr>
+              <w:t>o</w:t>
+            </w:r>
+            <w:r>
+              <w:rPr>
+                <w:iCs/>
+              </w:rPr>
+              <w:t xml:space="preserve">n. It creates a connected convex polygons over these areas, ensuring that every point inside a polygon is </w:t>
+            </w:r>
+            <w:r>
+              <w:rPr>
+                <w:iCs/>
+              </w:rPr>
+              <w:t>reachable</w:t>
+            </w:r>
+            <w:r>
+              <w:rPr>
+                <w:iCs/>
+              </w:rPr>
+              <w:t xml:space="preserve"> without obstacles. </w:t>
+            </w:r>
           </w:p>
         </w:tc>
       </w:tr>
@@ -3523,7 +4056,21 @@
         <w:rPr>
           <w:iCs/>
         </w:rPr>
-        <w:t>How does an agent use a Navmesh’s pathfinding algorithm work in Unity?</w:t>
+        <w:t xml:space="preserve">How does an agent use a </w:t>
+      </w:r>
+      <w:proofErr w:type="spellStart"/>
+      <w:r>
+        <w:rPr>
+          <w:iCs/>
+        </w:rPr>
+        <w:t>Navmesh’s</w:t>
+      </w:r>
+      <w:proofErr w:type="spellEnd"/>
+      <w:r>
+        <w:rPr>
+          <w:iCs/>
+        </w:rPr>
+        <w:t xml:space="preserve"> pathfinding algorithm work in Unity?</w:t>
       </w:r>
     </w:p>
     <w:tbl>
@@ -3550,26 +4097,82 @@
                 <w:iCs/>
               </w:rPr>
             </w:pPr>
-          </w:p>
-          <w:p>
-            <w:pPr>
-              <w:pStyle w:val="ListParagraph"/>
-              <w:spacing w:line="240" w:lineRule="auto"/>
-              <w:ind w:left="0"/>
-              <w:rPr>
-                <w:iCs/>
-              </w:rPr>
-            </w:pPr>
-          </w:p>
-          <w:p>
-            <w:pPr>
-              <w:pStyle w:val="ListParagraph"/>
-              <w:spacing w:line="240" w:lineRule="auto"/>
-              <w:ind w:left="0"/>
-              <w:rPr>
-                <w:iCs/>
-              </w:rPr>
-            </w:pPr>
+            <w:r>
+              <w:rPr>
+                <w:iCs/>
+              </w:rPr>
+              <w:t xml:space="preserve">In Unity, an agent uses </w:t>
+            </w:r>
+            <w:proofErr w:type="spellStart"/>
+            <w:r>
+              <w:rPr>
+                <w:iCs/>
+              </w:rPr>
+              <w:t>Navmesh</w:t>
+            </w:r>
+            <w:proofErr w:type="spellEnd"/>
+            <w:r>
+              <w:rPr>
+                <w:iCs/>
+              </w:rPr>
+              <w:t xml:space="preserve"> by first baking the walkable areas of the level into the </w:t>
+            </w:r>
+            <w:proofErr w:type="spellStart"/>
+            <w:r>
+              <w:rPr>
+                <w:iCs/>
+              </w:rPr>
+              <w:t>Navmesh</w:t>
+            </w:r>
+            <w:proofErr w:type="spellEnd"/>
+            <w:r>
+              <w:rPr>
+                <w:iCs/>
+              </w:rPr>
+              <w:t xml:space="preserve">. The agent is assigned a </w:t>
+            </w:r>
+            <w:proofErr w:type="spellStart"/>
+            <w:r>
+              <w:rPr>
+                <w:iCs/>
+              </w:rPr>
+              <w:t>NavMeshAgent</w:t>
+            </w:r>
+            <w:proofErr w:type="spellEnd"/>
+            <w:r>
+              <w:rPr>
+                <w:iCs/>
+              </w:rPr>
+              <w:t xml:space="preserve"> component, which knows its current position and target destination. When the agent is given a destination, it uses the </w:t>
+            </w:r>
+            <w:proofErr w:type="spellStart"/>
+            <w:r>
+              <w:rPr>
+                <w:iCs/>
+              </w:rPr>
+              <w:t>Navmesh</w:t>
+            </w:r>
+            <w:proofErr w:type="spellEnd"/>
+            <w:r>
+              <w:rPr>
+                <w:iCs/>
+              </w:rPr>
+              <w:t xml:space="preserve"> to calculate a path across the connected polygons using a pathfinding algorithm, like A*. the </w:t>
+            </w:r>
+            <w:proofErr w:type="spellStart"/>
+            <w:r>
+              <w:rPr>
+                <w:iCs/>
+              </w:rPr>
+              <w:t>NavMeshAgent</w:t>
+            </w:r>
+            <w:proofErr w:type="spellEnd"/>
+            <w:r>
+              <w:rPr>
+                <w:iCs/>
+              </w:rPr>
+              <w:t xml:space="preserve"> then follows that path, automatically avoiding obstacles and adjusting its movement to stay on the walkable polygons.</w:t>
+            </w:r>
           </w:p>
         </w:tc>
       </w:tr>
@@ -3599,7 +4202,21 @@
         <w:rPr>
           <w:iCs/>
         </w:rPr>
-        <w:t>What are the benefits of Navmesh?</w:t>
+        <w:t xml:space="preserve">What are the benefits of </w:t>
+      </w:r>
+      <w:proofErr w:type="spellStart"/>
+      <w:r>
+        <w:rPr>
+          <w:iCs/>
+        </w:rPr>
+        <w:t>Navmesh</w:t>
+      </w:r>
+      <w:proofErr w:type="spellEnd"/>
+      <w:r>
+        <w:rPr>
+          <w:iCs/>
+        </w:rPr>
+        <w:t>?</w:t>
       </w:r>
     </w:p>
     <w:tbl>
@@ -3626,26 +4243,113 @@
                 <w:iCs/>
               </w:rPr>
             </w:pPr>
+            <w:r>
+              <w:rPr>
+                <w:iCs/>
+              </w:rPr>
+              <w:t xml:space="preserve">The benefits of </w:t>
+            </w:r>
+            <w:proofErr w:type="spellStart"/>
+            <w:r>
+              <w:rPr>
+                <w:iCs/>
+              </w:rPr>
+              <w:t>Navmesh</w:t>
+            </w:r>
+            <w:proofErr w:type="spellEnd"/>
+            <w:r>
+              <w:rPr>
+                <w:iCs/>
+              </w:rPr>
+              <w:t xml:space="preserve"> are:</w:t>
+            </w:r>
           </w:p>
           <w:p>
             <w:pPr>
               <w:pStyle w:val="ListParagraph"/>
-              <w:spacing w:line="240" w:lineRule="auto"/>
-              <w:ind w:left="0"/>
-              <w:rPr>
-                <w:iCs/>
-              </w:rPr>
-            </w:pPr>
+              <w:numPr>
+                <w:ilvl w:val="0"/>
+                <w:numId w:val="43"/>
+              </w:numPr>
+              <w:spacing w:line="240" w:lineRule="auto"/>
+              <w:rPr>
+                <w:b/>
+                <w:bCs w:val="0"/>
+                <w:iCs/>
+              </w:rPr>
+            </w:pPr>
+            <w:r>
+              <w:rPr>
+                <w:b/>
+                <w:bCs w:val="0"/>
+                <w:iCs/>
+              </w:rPr>
+              <w:t xml:space="preserve">Efficient pathfinding: </w:t>
+            </w:r>
+            <w:r>
+              <w:rPr>
+                <w:iCs/>
+              </w:rPr>
+              <w:t>AI can calculate paths quickly using pre-baked polygons</w:t>
+            </w:r>
           </w:p>
           <w:p>
             <w:pPr>
               <w:pStyle w:val="ListParagraph"/>
-              <w:spacing w:line="240" w:lineRule="auto"/>
-              <w:ind w:left="0"/>
-              <w:rPr>
-                <w:iCs/>
-              </w:rPr>
-            </w:pPr>
+              <w:numPr>
+                <w:ilvl w:val="0"/>
+                <w:numId w:val="43"/>
+              </w:numPr>
+              <w:spacing w:line="240" w:lineRule="auto"/>
+              <w:rPr>
+                <w:b/>
+                <w:bCs w:val="0"/>
+                <w:iCs/>
+              </w:rPr>
+            </w:pPr>
+            <w:r>
+              <w:rPr>
+                <w:b/>
+                <w:bCs w:val="0"/>
+                <w:iCs/>
+              </w:rPr>
+              <w:t xml:space="preserve">Natural movement: </w:t>
+            </w:r>
+            <w:r>
+              <w:rPr>
+                <w:iCs/>
+              </w:rPr>
+              <w:t>Agents move smoothly and avoid obstacles without grid restrictions</w:t>
+            </w:r>
+          </w:p>
+          <w:p>
+            <w:pPr>
+              <w:pStyle w:val="ListParagraph"/>
+              <w:numPr>
+                <w:ilvl w:val="0"/>
+                <w:numId w:val="43"/>
+              </w:numPr>
+              <w:spacing w:line="240" w:lineRule="auto"/>
+              <w:rPr>
+                <w:b/>
+                <w:bCs w:val="0"/>
+                <w:iCs/>
+              </w:rPr>
+            </w:pPr>
+            <w:r>
+              <w:rPr>
+                <w:b/>
+                <w:bCs w:val="0"/>
+                <w:iCs/>
+              </w:rPr>
+              <w:t xml:space="preserve">Scalable: </w:t>
+            </w:r>
+            <w:r>
+              <w:rPr>
+                <w:iCs/>
+              </w:rPr>
+              <w:t>Works well in large or complex environments</w:t>
+            </w:r>
           </w:p>
         </w:tc>
       </w:tr>
@@ -3675,7 +4379,21 @@
         <w:rPr>
           <w:iCs/>
         </w:rPr>
-        <w:t>What are the downsides of Navmesh?</w:t>
+        <w:t xml:space="preserve">What are the downsides of </w:t>
+      </w:r>
+      <w:proofErr w:type="spellStart"/>
+      <w:r>
+        <w:rPr>
+          <w:iCs/>
+        </w:rPr>
+        <w:t>Navmesh</w:t>
+      </w:r>
+      <w:proofErr w:type="spellEnd"/>
+      <w:r>
+        <w:rPr>
+          <w:iCs/>
+        </w:rPr>
+        <w:t>?</w:t>
       </w:r>
     </w:p>
     <w:tbl>
@@ -3702,30 +4420,251 @@
                 <w:iCs/>
               </w:rPr>
             </w:pPr>
+            <w:r>
+              <w:rPr>
+                <w:iCs/>
+              </w:rPr>
+              <w:t xml:space="preserve">The downsides of </w:t>
+            </w:r>
+            <w:proofErr w:type="spellStart"/>
+            <w:r>
+              <w:rPr>
+                <w:iCs/>
+              </w:rPr>
+              <w:t>Navmesh</w:t>
+            </w:r>
+            <w:proofErr w:type="spellEnd"/>
+            <w:r>
+              <w:rPr>
+                <w:iCs/>
+              </w:rPr>
+              <w:t xml:space="preserve"> are:</w:t>
+            </w:r>
           </w:p>
           <w:p>
             <w:pPr>
               <w:pStyle w:val="ListParagraph"/>
-              <w:spacing w:line="240" w:lineRule="auto"/>
-              <w:ind w:left="0"/>
-              <w:rPr>
-                <w:iCs/>
-              </w:rPr>
-            </w:pPr>
+              <w:numPr>
+                <w:ilvl w:val="0"/>
+                <w:numId w:val="43"/>
+              </w:numPr>
+              <w:spacing w:line="240" w:lineRule="auto"/>
+              <w:rPr>
+                <w:b/>
+                <w:bCs w:val="0"/>
+                <w:iCs/>
+              </w:rPr>
+            </w:pPr>
+            <w:r>
+              <w:rPr>
+                <w:b/>
+                <w:bCs w:val="0"/>
+                <w:iCs/>
+              </w:rPr>
+              <w:t xml:space="preserve">Pre-baking required: </w:t>
+            </w:r>
+            <w:proofErr w:type="spellStart"/>
+            <w:r>
+              <w:rPr>
+                <w:iCs/>
+              </w:rPr>
+              <w:t>Navmeshes</w:t>
+            </w:r>
+            <w:proofErr w:type="spellEnd"/>
+            <w:r>
+              <w:rPr>
+                <w:iCs/>
+              </w:rPr>
+              <w:t xml:space="preserve"> require pre-baking before runtime, which can be time consuming for large levels or areas</w:t>
+            </w:r>
           </w:p>
           <w:p>
             <w:pPr>
               <w:pStyle w:val="ListParagraph"/>
-              <w:spacing w:line="240" w:lineRule="auto"/>
-              <w:ind w:left="0"/>
-              <w:rPr>
-                <w:iCs/>
-              </w:rPr>
-            </w:pPr>
+              <w:numPr>
+                <w:ilvl w:val="0"/>
+                <w:numId w:val="43"/>
+              </w:numPr>
+              <w:spacing w:line="240" w:lineRule="auto"/>
+              <w:rPr>
+                <w:b/>
+                <w:bCs w:val="0"/>
+                <w:iCs/>
+              </w:rPr>
+            </w:pPr>
+            <w:r>
+              <w:rPr>
+                <w:b/>
+                <w:bCs w:val="0"/>
+                <w:iCs/>
+              </w:rPr>
+              <w:t xml:space="preserve">Dynamic changes are troublesome: </w:t>
+            </w:r>
+            <w:r>
+              <w:rPr>
+                <w:iCs/>
+              </w:rPr>
+              <w:t xml:space="preserve">Because pre-baking is required, sudden changes to the environment can require updating or </w:t>
+            </w:r>
+            <w:proofErr w:type="spellStart"/>
+            <w:r>
+              <w:rPr>
+                <w:iCs/>
+              </w:rPr>
+              <w:t>rebaking</w:t>
+            </w:r>
+            <w:proofErr w:type="spellEnd"/>
+            <w:r>
+              <w:rPr>
+                <w:iCs/>
+              </w:rPr>
+              <w:t xml:space="preserve"> the </w:t>
+            </w:r>
+            <w:proofErr w:type="spellStart"/>
+            <w:r>
+              <w:rPr>
+                <w:iCs/>
+              </w:rPr>
+              <w:t>Navmesh</w:t>
+            </w:r>
+            <w:proofErr w:type="spellEnd"/>
+          </w:p>
+          <w:p>
+            <w:pPr>
+              <w:pStyle w:val="ListParagraph"/>
+              <w:numPr>
+                <w:ilvl w:val="0"/>
+                <w:numId w:val="43"/>
+              </w:numPr>
+              <w:spacing w:line="240" w:lineRule="auto"/>
+              <w:rPr>
+                <w:b/>
+                <w:bCs w:val="0"/>
+                <w:iCs/>
+              </w:rPr>
+            </w:pPr>
+            <w:r>
+              <w:rPr>
+                <w:b/>
+                <w:bCs w:val="0"/>
+                <w:iCs/>
+              </w:rPr>
+              <w:t xml:space="preserve">Memory usage: </w:t>
+            </w:r>
+            <w:r>
+              <w:rPr>
+                <w:iCs/>
+              </w:rPr>
+              <w:t>Storing polygons and links for large environments can use a large amount of memory</w:t>
+            </w:r>
+          </w:p>
+          <w:p>
+            <w:pPr>
+              <w:pStyle w:val="ListParagraph"/>
+              <w:numPr>
+                <w:ilvl w:val="0"/>
+                <w:numId w:val="43"/>
+              </w:numPr>
+              <w:spacing w:line="240" w:lineRule="auto"/>
+              <w:rPr>
+                <w:b/>
+                <w:bCs w:val="0"/>
+                <w:iCs/>
+              </w:rPr>
+            </w:pPr>
+            <w:r>
+              <w:rPr>
+                <w:b/>
+                <w:bCs w:val="0"/>
+                <w:iCs/>
+              </w:rPr>
+              <w:t xml:space="preserve">Struggles </w:t>
+            </w:r>
+            <w:r>
+              <w:rPr>
+                <w:b/>
+                <w:bCs w:val="0"/>
+                <w:iCs/>
+              </w:rPr>
+              <w:t xml:space="preserve">vertically: </w:t>
+            </w:r>
+            <w:proofErr w:type="spellStart"/>
+            <w:r>
+              <w:rPr>
+                <w:iCs/>
+              </w:rPr>
+              <w:t>Navmesh</w:t>
+            </w:r>
+            <w:proofErr w:type="spellEnd"/>
+            <w:r>
+              <w:rPr>
+                <w:iCs/>
+              </w:rPr>
+              <w:t xml:space="preserve"> struggles with </w:t>
+            </w:r>
+            <w:proofErr w:type="spellStart"/>
+            <w:r>
+              <w:rPr>
+                <w:iCs/>
+              </w:rPr>
+              <w:t>mutli</w:t>
+            </w:r>
+            <w:proofErr w:type="spellEnd"/>
+            <w:r>
+              <w:rPr>
+                <w:iCs/>
+              </w:rPr>
+              <w:t>-level or vertical environments without additional configuration</w:t>
+            </w:r>
           </w:p>
         </w:tc>
       </w:tr>
     </w:tbl>
+    <w:p>
+      <w:pPr>
+        <w:pStyle w:val="ListParagraph"/>
+        <w:spacing w:line="240" w:lineRule="auto"/>
+        <w:rPr>
+          <w:iCs/>
+        </w:rPr>
+      </w:pPr>
+    </w:p>
+    <w:p>
+      <w:pPr>
+        <w:pStyle w:val="ListParagraph"/>
+        <w:spacing w:line="240" w:lineRule="auto"/>
+        <w:rPr>
+          <w:iCs/>
+        </w:rPr>
+      </w:pPr>
+    </w:p>
+    <w:p>
+      <w:pPr>
+        <w:pStyle w:val="ListParagraph"/>
+        <w:spacing w:line="240" w:lineRule="auto"/>
+        <w:rPr>
+          <w:iCs/>
+        </w:rPr>
+      </w:pPr>
+    </w:p>
+    <w:p>
+      <w:pPr>
+        <w:pStyle w:val="ListParagraph"/>
+        <w:spacing w:line="240" w:lineRule="auto"/>
+        <w:rPr>
+          <w:iCs/>
+        </w:rPr>
+      </w:pPr>
+    </w:p>
+    <w:p>
+      <w:pPr>
+        <w:pStyle w:val="ListParagraph"/>
+        <w:spacing w:line="240" w:lineRule="auto"/>
+        <w:rPr>
+          <w:iCs/>
+        </w:rPr>
+      </w:pPr>
+    </w:p>
     <w:p>
       <w:pPr>
         <w:pStyle w:val="ListParagraph"/>
@@ -3751,7 +4690,22 @@
         <w:rPr>
           <w:iCs/>
         </w:rPr>
-        <w:t>Where was Navmesh first conceptualised and used?</w:t>
+        <w:lastRenderedPageBreak/>
+        <w:t xml:space="preserve">Where was </w:t>
+      </w:r>
+      <w:proofErr w:type="spellStart"/>
+      <w:r>
+        <w:rPr>
+          <w:iCs/>
+        </w:rPr>
+        <w:t>Navmesh</w:t>
+      </w:r>
+      <w:proofErr w:type="spellEnd"/>
+      <w:r>
+        <w:rPr>
+          <w:iCs/>
+        </w:rPr>
+        <w:t xml:space="preserve"> first conceptualised and used?</w:t>
       </w:r>
     </w:p>
     <w:tbl>
@@ -3778,6 +4732,20 @@
                 <w:iCs/>
               </w:rPr>
             </w:pPr>
+            <w:proofErr w:type="spellStart"/>
+            <w:r>
+              <w:rPr>
+                <w:iCs/>
+              </w:rPr>
+              <w:t>Navmesh</w:t>
+            </w:r>
+            <w:proofErr w:type="spellEnd"/>
+            <w:r>
+              <w:rPr>
+                <w:iCs/>
+              </w:rPr>
+              <w:t xml:space="preserve"> was first conceptualised in 1986 by Ronald C. Arkin, but was called “meadow mapping”, used mainly in robotics.</w:t>
+            </w:r>
           </w:p>
           <w:p>
             <w:pPr>
@@ -3798,6 +4766,61 @@
                 <w:iCs/>
               </w:rPr>
             </w:pPr>
+            <w:r>
+              <w:rPr>
+                <w:iCs/>
+              </w:rPr>
+              <w:t xml:space="preserve">It wasn’t until around 2000 after Greg Snook’s article on “simplified 3D movement and pathfinding using navigation meshes” did it become popular in video games. Like the bots in Quake 3 Arena, but under the name “Area Awareness System”, described by J.M.P. van </w:t>
+            </w:r>
+            <w:proofErr w:type="spellStart"/>
+            <w:r>
+              <w:rPr>
+                <w:iCs/>
+              </w:rPr>
+              <w:t>Waveren</w:t>
+            </w:r>
+            <w:proofErr w:type="spellEnd"/>
+          </w:p>
+          <w:p>
+            <w:pPr>
+              <w:pStyle w:val="ListParagraph"/>
+              <w:spacing w:line="240" w:lineRule="auto"/>
+              <w:ind w:left="0"/>
+              <w:rPr>
+                <w:iCs/>
+              </w:rPr>
+            </w:pPr>
+          </w:p>
+          <w:p>
+            <w:pPr>
+              <w:pStyle w:val="ListParagraph"/>
+              <w:spacing w:line="240" w:lineRule="auto"/>
+              <w:ind w:left="0"/>
+              <w:rPr>
+                <w:iCs/>
+              </w:rPr>
+            </w:pPr>
+            <w:r>
+              <w:rPr>
+                <w:iCs/>
+              </w:rPr>
+              <w:t xml:space="preserve">Source: </w:t>
+            </w:r>
+            <w:hyperlink r:id="rId13" w:history="1">
+              <w:r>
+                <w:rPr>
+                  <w:rStyle w:val="Hyperlink"/>
+                  <w:iCs/>
+                </w:rPr>
+                <w:t>https://en.wikipedia.org/wiki/Navigation_mesh?#History</w:t>
+              </w:r>
+            </w:hyperlink>
+            <w:r>
+              <w:rPr>
+                <w:iCs/>
+              </w:rPr>
+              <w:t xml:space="preserve"> </w:t>
+            </w:r>
           </w:p>
         </w:tc>
       </w:tr>
@@ -3983,7 +5006,7 @@
           <w:bCs w:val="0"/>
           <w:iCs/>
         </w:rPr>
-        <w:t>[Component Name]</w:t>
+        <w:t>Rendering Engine / Graphics Engine</w:t>
       </w:r>
     </w:p>
     <w:tbl>
@@ -4009,6 +5032,12 @@
                 <w:iCs/>
               </w:rPr>
             </w:pPr>
+            <w:r>
+              <w:rPr>
+                <w:iCs/>
+              </w:rPr>
+              <w:t>Handles drawing all visuals on screen, like 3D models, textures, lighting, shadows and special effects.</w:t>
+            </w:r>
           </w:p>
         </w:tc>
       </w:tr>
@@ -4041,7 +5070,7 @@
           <w:bCs w:val="0"/>
           <w:iCs/>
         </w:rPr>
-        <w:t>[Component Name]</w:t>
+        <w:t>Physics Engine</w:t>
       </w:r>
     </w:p>
     <w:tbl>
@@ -4068,6 +5097,12 @@
                 <w:iCs/>
               </w:rPr>
             </w:pPr>
+            <w:r>
+              <w:rPr>
+                <w:iCs/>
+              </w:rPr>
+              <w:t>Simulates physical behaviours between objects, like collisions, gravity, rigid body dynamics and other “forces” in the game world.</w:t>
+            </w:r>
           </w:p>
         </w:tc>
       </w:tr>
@@ -4101,7 +5136,7 @@
           <w:bCs w:val="0"/>
           <w:iCs/>
         </w:rPr>
-        <w:t>[Component Name]</w:t>
+        <w:t>Audio Engine</w:t>
       </w:r>
     </w:p>
     <w:tbl>
@@ -4128,6 +5163,12 @@
                 <w:iCs/>
               </w:rPr>
             </w:pPr>
+            <w:r>
+              <w:rPr>
+                <w:iCs/>
+              </w:rPr>
+              <w:t>Manages all sounds in the game, like background music, sound effects, spatial audio, 3D positional audio, basically anything audio related is handled in this engine.</w:t>
+            </w:r>
           </w:p>
         </w:tc>
       </w:tr>
@@ -4161,7 +5202,7 @@
           <w:bCs w:val="0"/>
           <w:iCs/>
         </w:rPr>
-        <w:t>[Component Name]</w:t>
+        <w:t>Animation System</w:t>
       </w:r>
     </w:p>
     <w:tbl>
@@ -4188,6 +5229,12 @@
                 <w:iCs/>
               </w:rPr>
             </w:pPr>
+            <w:r>
+              <w:rPr>
+                <w:iCs/>
+              </w:rPr>
+              <w:t>Controls character and object animations, blending between different states and applying skeletal or morph animations to models.</w:t>
+            </w:r>
           </w:p>
         </w:tc>
       </w:tr>
@@ -4221,7 +5268,7 @@
           <w:bCs w:val="0"/>
           <w:iCs/>
         </w:rPr>
-        <w:t>[Component Name]</w:t>
+        <w:t>AI System</w:t>
       </w:r>
     </w:p>
     <w:tbl>
@@ -4248,6 +5295,12 @@
                 <w:iCs/>
               </w:rPr>
             </w:pPr>
+            <w:r>
+              <w:rPr>
+                <w:iCs/>
+              </w:rPr>
+              <w:t>This handles decision making for NPCs, including pathfinding, behaviour trees and GOAP</w:t>
+            </w:r>
           </w:p>
         </w:tc>
       </w:tr>
@@ -4281,7 +5334,7 @@
           <w:bCs w:val="0"/>
           <w:iCs/>
         </w:rPr>
-        <w:t>[Component Name]</w:t>
+        <w:t>Multiplayer System</w:t>
       </w:r>
     </w:p>
     <w:tbl>
@@ -4308,6 +5361,12 @@
                 <w:iCs/>
               </w:rPr>
             </w:pPr>
+            <w:r>
+              <w:rPr>
+                <w:iCs/>
+              </w:rPr>
+              <w:t>This manages the communication between clients and servers in multiplayer games, including synchronising game state, player inputs and dealing with latency (like disconnecting a player if their ping is too high)</w:t>
+            </w:r>
           </w:p>
         </w:tc>
       </w:tr>
@@ -4561,7 +5620,7 @@
                 <w:bCs w:val="0"/>
                 <w:iCs/>
               </w:rPr>
-              <w:t>Engine 1</w:t>
+              <w:t>Unity</w:t>
             </w:r>
           </w:p>
         </w:tc>
@@ -4571,35 +5630,93 @@
           </w:tcPr>
           <w:p>
             <w:pPr>
-              <w:spacing w:line="240" w:lineRule="auto"/>
-              <w:rPr>
-                <w:iCs/>
-              </w:rPr>
-            </w:pPr>
-          </w:p>
-          <w:p>
-            <w:pPr>
-              <w:spacing w:line="240" w:lineRule="auto"/>
-              <w:rPr>
-                <w:iCs/>
-              </w:rPr>
-            </w:pPr>
-          </w:p>
-          <w:p>
-            <w:pPr>
-              <w:spacing w:line="240" w:lineRule="auto"/>
-              <w:rPr>
-                <w:iCs/>
-              </w:rPr>
-            </w:pPr>
-          </w:p>
-          <w:p>
-            <w:pPr>
-              <w:spacing w:line="240" w:lineRule="auto"/>
-              <w:rPr>
-                <w:iCs/>
-              </w:rPr>
-            </w:pPr>
+              <w:pStyle w:val="ListParagraph"/>
+              <w:numPr>
+                <w:ilvl w:val="0"/>
+                <w:numId w:val="43"/>
+              </w:numPr>
+              <w:spacing w:line="240" w:lineRule="auto"/>
+              <w:rPr>
+                <w:iCs/>
+              </w:rPr>
+            </w:pPr>
+            <w:r>
+              <w:rPr>
+                <w:iCs/>
+              </w:rPr>
+              <w:t>Great 3D support with robust rendering engine</w:t>
+            </w:r>
+          </w:p>
+          <w:p>
+            <w:pPr>
+              <w:pStyle w:val="ListParagraph"/>
+              <w:numPr>
+                <w:ilvl w:val="0"/>
+                <w:numId w:val="43"/>
+              </w:numPr>
+              <w:spacing w:line="240" w:lineRule="auto"/>
+              <w:rPr>
+                <w:iCs/>
+              </w:rPr>
+            </w:pPr>
+            <w:r>
+              <w:rPr>
+                <w:iCs/>
+              </w:rPr>
+              <w:t xml:space="preserve">Built-In </w:t>
+            </w:r>
+            <w:proofErr w:type="spellStart"/>
+            <w:r>
+              <w:rPr>
+                <w:iCs/>
+              </w:rPr>
+              <w:t>Navmesh</w:t>
+            </w:r>
+            <w:proofErr w:type="spellEnd"/>
+            <w:r>
+              <w:rPr>
+                <w:iCs/>
+              </w:rPr>
+              <w:t xml:space="preserve"> and A* pathfinding</w:t>
+            </w:r>
+          </w:p>
+          <w:p>
+            <w:pPr>
+              <w:pStyle w:val="ListParagraph"/>
+              <w:numPr>
+                <w:ilvl w:val="0"/>
+                <w:numId w:val="43"/>
+              </w:numPr>
+              <w:spacing w:line="240" w:lineRule="auto"/>
+              <w:rPr>
+                <w:iCs/>
+              </w:rPr>
+            </w:pPr>
+            <w:r>
+              <w:rPr>
+                <w:iCs/>
+              </w:rPr>
+              <w:t>Large asset store and community support</w:t>
+            </w:r>
+          </w:p>
+          <w:p>
+            <w:pPr>
+              <w:pStyle w:val="ListParagraph"/>
+              <w:numPr>
+                <w:ilvl w:val="0"/>
+                <w:numId w:val="43"/>
+              </w:numPr>
+              <w:spacing w:line="240" w:lineRule="auto"/>
+              <w:rPr>
+                <w:iCs/>
+              </w:rPr>
+            </w:pPr>
+            <w:r>
+              <w:rPr>
+                <w:iCs/>
+              </w:rPr>
+              <w:t>Easy to spawn and control NPCs via scripting</w:t>
+            </w:r>
           </w:p>
         </w:tc>
         <w:tc>
@@ -4608,19 +5725,41 @@
           </w:tcPr>
           <w:p>
             <w:pPr>
-              <w:spacing w:line="240" w:lineRule="auto"/>
-              <w:rPr>
-                <w:iCs/>
-              </w:rPr>
-            </w:pPr>
-          </w:p>
-          <w:p>
-            <w:pPr>
-              <w:spacing w:line="240" w:lineRule="auto"/>
-              <w:rPr>
-                <w:iCs/>
-              </w:rPr>
-            </w:pPr>
+              <w:pStyle w:val="ListParagraph"/>
+              <w:numPr>
+                <w:ilvl w:val="0"/>
+                <w:numId w:val="43"/>
+              </w:numPr>
+              <w:spacing w:line="240" w:lineRule="auto"/>
+              <w:rPr>
+                <w:iCs/>
+              </w:rPr>
+            </w:pPr>
+            <w:r>
+              <w:rPr>
+                <w:iCs/>
+              </w:rPr>
+              <w:t>More advanced AI can become complex, and may require external plugins to work correctly</w:t>
+            </w:r>
+          </w:p>
+          <w:p>
+            <w:pPr>
+              <w:pStyle w:val="ListParagraph"/>
+              <w:numPr>
+                <w:ilvl w:val="0"/>
+                <w:numId w:val="43"/>
+              </w:numPr>
+              <w:spacing w:line="240" w:lineRule="auto"/>
+              <w:rPr>
+                <w:iCs/>
+              </w:rPr>
+            </w:pPr>
+            <w:r>
+              <w:rPr>
+                <w:iCs/>
+              </w:rPr>
+              <w:t>Not performance optimised for large scenes</w:t>
+            </w:r>
           </w:p>
           <w:p>
             <w:pPr>
@@ -4660,7 +5799,7 @@
                 <w:bCs w:val="0"/>
                 <w:iCs/>
               </w:rPr>
-              <w:t>Engine 2</w:t>
+              <w:t>Unreal Engine</w:t>
             </w:r>
           </w:p>
         </w:tc>
@@ -4670,35 +5809,68 @@
           </w:tcPr>
           <w:p>
             <w:pPr>
-              <w:spacing w:line="240" w:lineRule="auto"/>
-              <w:rPr>
-                <w:iCs/>
-              </w:rPr>
-            </w:pPr>
-          </w:p>
-          <w:p>
-            <w:pPr>
-              <w:spacing w:line="240" w:lineRule="auto"/>
-              <w:rPr>
-                <w:iCs/>
-              </w:rPr>
-            </w:pPr>
-          </w:p>
-          <w:p>
-            <w:pPr>
-              <w:spacing w:line="240" w:lineRule="auto"/>
-              <w:rPr>
-                <w:iCs/>
-              </w:rPr>
-            </w:pPr>
-          </w:p>
-          <w:p>
-            <w:pPr>
-              <w:spacing w:line="240" w:lineRule="auto"/>
-              <w:rPr>
-                <w:iCs/>
-              </w:rPr>
-            </w:pPr>
+              <w:pStyle w:val="ListParagraph"/>
+              <w:numPr>
+                <w:ilvl w:val="0"/>
+                <w:numId w:val="43"/>
+              </w:numPr>
+              <w:spacing w:line="240" w:lineRule="auto"/>
+              <w:rPr>
+                <w:iCs/>
+              </w:rPr>
+            </w:pPr>
+            <w:r>
+              <w:rPr>
+                <w:iCs/>
+              </w:rPr>
+              <w:t>Fantastic visuals out of the box</w:t>
+            </w:r>
+          </w:p>
+          <w:p>
+            <w:pPr>
+              <w:pStyle w:val="ListParagraph"/>
+              <w:numPr>
+                <w:ilvl w:val="0"/>
+                <w:numId w:val="43"/>
+              </w:numPr>
+              <w:spacing w:line="240" w:lineRule="auto"/>
+              <w:rPr>
+                <w:iCs/>
+              </w:rPr>
+            </w:pPr>
+            <w:r>
+              <w:rPr>
+                <w:iCs/>
+              </w:rPr>
+              <w:t xml:space="preserve">Built in AI tools for behaviour trees and </w:t>
+            </w:r>
+            <w:proofErr w:type="spellStart"/>
+            <w:r>
+              <w:rPr>
+                <w:iCs/>
+              </w:rPr>
+              <w:t>Navmesh</w:t>
+            </w:r>
+            <w:proofErr w:type="spellEnd"/>
+          </w:p>
+          <w:p>
+            <w:pPr>
+              <w:pStyle w:val="ListParagraph"/>
+              <w:numPr>
+                <w:ilvl w:val="0"/>
+                <w:numId w:val="43"/>
+              </w:numPr>
+              <w:spacing w:line="240" w:lineRule="auto"/>
+              <w:rPr>
+                <w:iCs/>
+              </w:rPr>
+            </w:pPr>
+            <w:r>
+              <w:rPr>
+                <w:iCs/>
+              </w:rPr>
+              <w:t>Visual scripting via blueprints, making prototyping faster</w:t>
+            </w:r>
           </w:p>
         </w:tc>
         <w:tc>
@@ -4707,35 +5879,60 @@
           </w:tcPr>
           <w:p>
             <w:pPr>
-              <w:spacing w:line="240" w:lineRule="auto"/>
-              <w:rPr>
-                <w:iCs/>
-              </w:rPr>
-            </w:pPr>
-          </w:p>
-          <w:p>
-            <w:pPr>
-              <w:spacing w:line="240" w:lineRule="auto"/>
-              <w:rPr>
-                <w:iCs/>
-              </w:rPr>
-            </w:pPr>
-          </w:p>
-          <w:p>
-            <w:pPr>
-              <w:spacing w:line="240" w:lineRule="auto"/>
-              <w:rPr>
-                <w:iCs/>
-              </w:rPr>
-            </w:pPr>
-          </w:p>
-          <w:p>
-            <w:pPr>
-              <w:spacing w:line="240" w:lineRule="auto"/>
-              <w:rPr>
-                <w:iCs/>
-              </w:rPr>
-            </w:pPr>
+              <w:pStyle w:val="ListParagraph"/>
+              <w:numPr>
+                <w:ilvl w:val="0"/>
+                <w:numId w:val="43"/>
+              </w:numPr>
+              <w:spacing w:line="240" w:lineRule="auto"/>
+              <w:rPr>
+                <w:iCs/>
+              </w:rPr>
+            </w:pPr>
+            <w:r>
+              <w:rPr>
+                <w:iCs/>
+              </w:rPr>
+              <w:t>Steep learning curve compared to other engines</w:t>
+            </w:r>
+          </w:p>
+          <w:p>
+            <w:pPr>
+              <w:pStyle w:val="ListParagraph"/>
+              <w:numPr>
+                <w:ilvl w:val="0"/>
+                <w:numId w:val="43"/>
+              </w:numPr>
+              <w:spacing w:line="240" w:lineRule="auto"/>
+              <w:rPr>
+                <w:iCs/>
+              </w:rPr>
+            </w:pPr>
+            <w:r>
+              <w:rPr>
+                <w:iCs/>
+              </w:rPr>
+              <w:t>Can be resource intensive on low to mid systems</w:t>
+            </w:r>
+          </w:p>
+          <w:p>
+            <w:pPr>
+              <w:pStyle w:val="ListParagraph"/>
+              <w:numPr>
+                <w:ilvl w:val="0"/>
+                <w:numId w:val="43"/>
+              </w:numPr>
+              <w:spacing w:line="240" w:lineRule="auto"/>
+              <w:rPr>
+                <w:iCs/>
+              </w:rPr>
+            </w:pPr>
+            <w:r>
+              <w:rPr>
+                <w:iCs/>
+              </w:rPr>
+              <w:t>Asset store is much smaller and not many free to use items, compared to Unity</w:t>
+            </w:r>
           </w:p>
         </w:tc>
       </w:tr>
@@ -4759,7 +5956,7 @@
                 <w:bCs w:val="0"/>
                 <w:iCs/>
               </w:rPr>
-              <w:t>Engine 3</w:t>
+              <w:t>Godot V4</w:t>
             </w:r>
           </w:p>
         </w:tc>
@@ -4769,35 +5966,91 @@
           </w:tcPr>
           <w:p>
             <w:pPr>
-              <w:spacing w:line="240" w:lineRule="auto"/>
-              <w:rPr>
-                <w:iCs/>
-              </w:rPr>
-            </w:pPr>
-          </w:p>
-          <w:p>
-            <w:pPr>
-              <w:spacing w:line="240" w:lineRule="auto"/>
-              <w:rPr>
-                <w:iCs/>
-              </w:rPr>
-            </w:pPr>
-          </w:p>
-          <w:p>
-            <w:pPr>
-              <w:spacing w:line="240" w:lineRule="auto"/>
-              <w:rPr>
-                <w:iCs/>
-              </w:rPr>
-            </w:pPr>
-          </w:p>
-          <w:p>
-            <w:pPr>
-              <w:spacing w:line="240" w:lineRule="auto"/>
-              <w:rPr>
-                <w:iCs/>
-              </w:rPr>
-            </w:pPr>
+              <w:pStyle w:val="ListParagraph"/>
+              <w:numPr>
+                <w:ilvl w:val="0"/>
+                <w:numId w:val="43"/>
+              </w:numPr>
+              <w:spacing w:line="240" w:lineRule="auto"/>
+              <w:rPr>
+                <w:iCs/>
+              </w:rPr>
+            </w:pPr>
+            <w:r>
+              <w:rPr>
+                <w:iCs/>
+              </w:rPr>
+              <w:t>Lightweight and easy to use</w:t>
+            </w:r>
+          </w:p>
+          <w:p>
+            <w:pPr>
+              <w:pStyle w:val="ListParagraph"/>
+              <w:numPr>
+                <w:ilvl w:val="0"/>
+                <w:numId w:val="43"/>
+              </w:numPr>
+              <w:spacing w:line="240" w:lineRule="auto"/>
+              <w:rPr>
+                <w:iCs/>
+              </w:rPr>
+            </w:pPr>
+            <w:r>
+              <w:rPr>
+                <w:iCs/>
+              </w:rPr>
+              <w:t>Supports 3D animation</w:t>
+            </w:r>
+          </w:p>
+          <w:p>
+            <w:pPr>
+              <w:pStyle w:val="ListParagraph"/>
+              <w:numPr>
+                <w:ilvl w:val="0"/>
+                <w:numId w:val="43"/>
+              </w:numPr>
+              <w:spacing w:line="240" w:lineRule="auto"/>
+              <w:rPr>
+                <w:iCs/>
+              </w:rPr>
+            </w:pPr>
+            <w:r>
+              <w:rPr>
+                <w:iCs/>
+              </w:rPr>
+              <w:t>Open source and free to use</w:t>
+            </w:r>
+          </w:p>
+          <w:p>
+            <w:pPr>
+              <w:pStyle w:val="ListParagraph"/>
+              <w:numPr>
+                <w:ilvl w:val="0"/>
+                <w:numId w:val="43"/>
+              </w:numPr>
+              <w:spacing w:line="240" w:lineRule="auto"/>
+              <w:rPr>
+                <w:iCs/>
+              </w:rPr>
+            </w:pPr>
+            <w:r>
+              <w:rPr>
+                <w:iCs/>
+              </w:rPr>
+              <w:t>Supports AI and pathfinding via s</w:t>
+            </w:r>
+            <w:r>
+              <w:rPr>
+                <w:iCs/>
+              </w:rPr>
+              <w:t>cript</w:t>
+            </w:r>
+            <w:r>
+              <w:rPr>
+                <w:iCs/>
+              </w:rPr>
+              <w:t>s</w:t>
+            </w:r>
           </w:p>
         </w:tc>
         <w:tc>
@@ -4806,35 +6059,79 @@
           </w:tcPr>
           <w:p>
             <w:pPr>
-              <w:spacing w:line="240" w:lineRule="auto"/>
-              <w:rPr>
-                <w:iCs/>
-              </w:rPr>
-            </w:pPr>
-          </w:p>
-          <w:p>
-            <w:pPr>
-              <w:spacing w:line="240" w:lineRule="auto"/>
-              <w:rPr>
-                <w:iCs/>
-              </w:rPr>
-            </w:pPr>
-          </w:p>
-          <w:p>
-            <w:pPr>
-              <w:spacing w:line="240" w:lineRule="auto"/>
-              <w:rPr>
-                <w:iCs/>
-              </w:rPr>
-            </w:pPr>
-          </w:p>
-          <w:p>
-            <w:pPr>
-              <w:spacing w:line="240" w:lineRule="auto"/>
-              <w:rPr>
-                <w:iCs/>
-              </w:rPr>
-            </w:pPr>
+              <w:pStyle w:val="ListParagraph"/>
+              <w:numPr>
+                <w:ilvl w:val="0"/>
+                <w:numId w:val="43"/>
+              </w:numPr>
+              <w:spacing w:line="240" w:lineRule="auto"/>
+              <w:rPr>
+                <w:iCs/>
+              </w:rPr>
+            </w:pPr>
+            <w:r>
+              <w:rPr>
+                <w:iCs/>
+              </w:rPr>
+              <w:t>3D tools not as mature as Unity or Unreal</w:t>
+            </w:r>
+          </w:p>
+          <w:p>
+            <w:pPr>
+              <w:pStyle w:val="ListParagraph"/>
+              <w:numPr>
+                <w:ilvl w:val="0"/>
+                <w:numId w:val="43"/>
+              </w:numPr>
+              <w:spacing w:line="240" w:lineRule="auto"/>
+              <w:rPr>
+                <w:iCs/>
+              </w:rPr>
+            </w:pPr>
+            <w:r>
+              <w:rPr>
+                <w:iCs/>
+              </w:rPr>
+              <w:t>Fewer tutorials and community resources</w:t>
+            </w:r>
+          </w:p>
+          <w:p>
+            <w:pPr>
+              <w:pStyle w:val="ListParagraph"/>
+              <w:numPr>
+                <w:ilvl w:val="0"/>
+                <w:numId w:val="43"/>
+              </w:numPr>
+              <w:spacing w:line="240" w:lineRule="auto"/>
+              <w:rPr>
+                <w:iCs/>
+              </w:rPr>
+            </w:pPr>
+            <w:r>
+              <w:rPr>
+                <w:iCs/>
+              </w:rPr>
+              <w:t>Less built in support for high end graphics and large projects</w:t>
+            </w:r>
+          </w:p>
+          <w:p>
+            <w:pPr>
+              <w:pStyle w:val="ListParagraph"/>
+              <w:numPr>
+                <w:ilvl w:val="0"/>
+                <w:numId w:val="43"/>
+              </w:numPr>
+              <w:spacing w:line="240" w:lineRule="auto"/>
+              <w:rPr>
+                <w:iCs/>
+              </w:rPr>
+            </w:pPr>
+            <w:r>
+              <w:rPr>
+                <w:iCs/>
+              </w:rPr>
+              <w:t>In this use case, not designed for the game we’re creating</w:t>
+            </w:r>
           </w:p>
         </w:tc>
       </w:tr>
@@ -4890,22 +6187,18 @@
                 <w:iCs/>
               </w:rPr>
             </w:pPr>
-          </w:p>
-          <w:p>
-            <w:pPr>
-              <w:spacing w:line="240" w:lineRule="auto"/>
-              <w:rPr>
-                <w:iCs/>
-              </w:rPr>
-            </w:pPr>
-          </w:p>
-          <w:p>
-            <w:pPr>
-              <w:spacing w:line="240" w:lineRule="auto"/>
-              <w:rPr>
-                <w:iCs/>
-              </w:rPr>
-            </w:pPr>
+            <w:r>
+              <w:rPr>
+                <w:iCs/>
+              </w:rPr>
+              <w:t>I’m using Unity for this project</w:t>
+            </w:r>
+            <w:r>
+              <w:rPr>
+                <w:iCs/>
+              </w:rPr>
+              <w:t>. I have experience with Unity and has a large community base if I need support, as well as a large asset store that I can use for this project. It also aligns better with the requirements for this project than Unreal or Godot</w:t>
+            </w:r>
           </w:p>
         </w:tc>
       </w:tr>
@@ -4947,31 +6240,22 @@
           <w:iCs/>
         </w:rPr>
       </w:pPr>
-      <w:r>
-        <w:rPr>
-          <w:b/>
-          <w:bCs w:val="0"/>
-          <w:iCs/>
-        </w:rPr>
-        <w:br w:type="page"/>
-      </w:r>
-    </w:p>
-    <w:p>
-      <w:pPr>
-        <w:spacing w:line="240" w:lineRule="auto"/>
-        <w:rPr>
-          <w:b/>
-          <w:bCs w:val="0"/>
-          <w:iCs/>
-        </w:rPr>
-      </w:pPr>
-      <w:r>
-        <w:rPr>
-          <w:b/>
-          <w:bCs w:val="0"/>
-          <w:iCs/>
-        </w:rPr>
-        <w:lastRenderedPageBreak/>
+    </w:p>
+    <w:p>
+      <w:pPr>
+        <w:spacing w:line="240" w:lineRule="auto"/>
+        <w:rPr>
+          <w:b/>
+          <w:bCs w:val="0"/>
+          <w:iCs/>
+        </w:rPr>
+      </w:pPr>
+      <w:r>
+        <w:rPr>
+          <w:b/>
+          <w:bCs w:val="0"/>
+          <w:iCs/>
+        </w:rPr>
         <w:t>3</w:t>
       </w:r>
       <w:r>
@@ -5111,7 +6395,21 @@
         <w:rPr>
           <w:iCs/>
         </w:rPr>
-        <w:t xml:space="preserve"> (this can be one of the engines from your engine comparsion)</w:t>
+        <w:t xml:space="preserve"> (this can be one of the engines from your engine </w:t>
+      </w:r>
+      <w:proofErr w:type="spellStart"/>
+      <w:r>
+        <w:rPr>
+          <w:iCs/>
+        </w:rPr>
+        <w:t>comparsion</w:t>
+      </w:r>
+      <w:proofErr w:type="spellEnd"/>
+      <w:r>
+        <w:rPr>
+          <w:iCs/>
+        </w:rPr>
+        <w:t>)</w:t>
       </w:r>
     </w:p>
     <w:tbl>
@@ -6099,7 +7397,23 @@
           <w:b/>
           <w:bCs w:val="0"/>
         </w:rPr>
-        <w:t>[Pathfinding System 1 – Navmesh]</w:t>
+        <w:t xml:space="preserve">[Pathfinding System 1 – </w:t>
+      </w:r>
+      <w:proofErr w:type="spellStart"/>
+      <w:r>
+        <w:rPr>
+          <w:b/>
+          <w:bCs w:val="0"/>
+        </w:rPr>
+        <w:t>Navmesh</w:t>
+      </w:r>
+      <w:proofErr w:type="spellEnd"/>
+      <w:r>
+        <w:rPr>
+          <w:b/>
+          <w:bCs w:val="0"/>
+        </w:rPr>
+        <w:t>]</w:t>
       </w:r>
     </w:p>
     <w:tbl>
@@ -6490,7 +7804,21 @@
         <w:rPr>
           <w:iCs/>
         </w:rPr>
-        <w:t>In Unity, there are 3 GUI systems: Canvas (also known as UnityUI), IMGUI (Immediate Mode GUI), and Visual Elements</w:t>
+        <w:t xml:space="preserve">In Unity, there are 3 GUI systems: Canvas (also known as </w:t>
+      </w:r>
+      <w:proofErr w:type="spellStart"/>
+      <w:r>
+        <w:rPr>
+          <w:iCs/>
+        </w:rPr>
+        <w:t>UnityUI</w:t>
+      </w:r>
+      <w:proofErr w:type="spellEnd"/>
+      <w:r>
+        <w:rPr>
+          <w:iCs/>
+        </w:rPr>
+        <w:t>), IMGUI (Immediate Mode GUI), and Visual Elements</w:t>
       </w:r>
     </w:p>
     <w:p>
@@ -6535,8 +7863,18 @@
           <w:bCs w:val="0"/>
           <w:iCs/>
         </w:rPr>
-        <w:t>Canvas/uGUI</w:t>
-      </w:r>
+        <w:t>Canvas/</w:t>
+      </w:r>
+      <w:proofErr w:type="spellStart"/>
+      <w:r>
+        <w:rPr>
+          <w:b/>
+          <w:bCs w:val="0"/>
+          <w:iCs/>
+        </w:rPr>
+        <w:t>uGUI</w:t>
+      </w:r>
+      <w:proofErr w:type="spellEnd"/>
     </w:p>
     <w:tbl>
       <w:tblPr>
@@ -6999,8 +8337,18 @@
           <w:bCs w:val="0"/>
           <w:iCs/>
         </w:rPr>
-        <w:t>GUI Design Mockup</w:t>
-      </w:r>
+        <w:t xml:space="preserve">GUI Design </w:t>
+      </w:r>
+      <w:proofErr w:type="spellStart"/>
+      <w:r>
+        <w:rPr>
+          <w:b/>
+          <w:bCs w:val="0"/>
+          <w:iCs/>
+        </w:rPr>
+        <w:t>Mockup</w:t>
+      </w:r>
+      <w:proofErr w:type="spellEnd"/>
       <w:r>
         <w:rPr>
           <w:b/>
@@ -7065,29 +8413,57 @@
         <w:rPr>
           <w:iCs/>
         </w:rPr>
-        <w:t>Once you have created your prototype/mockup, take a screenshot/insert it into this document.</w:t>
-      </w:r>
-    </w:p>
-    <w:p>
-      <w:pPr>
-        <w:spacing w:line="240" w:lineRule="auto"/>
-        <w:rPr>
-          <w:iCs/>
-        </w:rPr>
-      </w:pPr>
-    </w:p>
-    <w:p>
-      <w:pPr>
-        <w:spacing w:line="240" w:lineRule="auto"/>
-        <w:rPr>
-          <w:iCs/>
-        </w:rPr>
-      </w:pPr>
-      <w:r>
-        <w:rPr>
-          <w:iCs/>
-        </w:rPr>
-        <w:t>Have a small description of each of the elements presented in the GUI below the image to clearly explain everything that you have placed in the design and it’s purpose.</w:t>
+        <w:t>Once you have created your prototype/</w:t>
+      </w:r>
+      <w:proofErr w:type="spellStart"/>
+      <w:r>
+        <w:rPr>
+          <w:iCs/>
+        </w:rPr>
+        <w:t>mockup</w:t>
+      </w:r>
+      <w:proofErr w:type="spellEnd"/>
+      <w:r>
+        <w:rPr>
+          <w:iCs/>
+        </w:rPr>
+        <w:t>, take a screenshot/insert it into this document.</w:t>
+      </w:r>
+    </w:p>
+    <w:p>
+      <w:pPr>
+        <w:spacing w:line="240" w:lineRule="auto"/>
+        <w:rPr>
+          <w:iCs/>
+        </w:rPr>
+      </w:pPr>
+    </w:p>
+    <w:p>
+      <w:pPr>
+        <w:spacing w:line="240" w:lineRule="auto"/>
+        <w:rPr>
+          <w:iCs/>
+        </w:rPr>
+      </w:pPr>
+      <w:r>
+        <w:rPr>
+          <w:iCs/>
+        </w:rPr>
+        <w:t xml:space="preserve">Have a small description of each of the elements presented in the GUI below the image to clearly explain everything that you have placed in the design and </w:t>
+      </w:r>
+      <w:proofErr w:type="spellStart"/>
+      <w:r>
+        <w:rPr>
+          <w:iCs/>
+        </w:rPr>
+        <w:t>it’s</w:t>
+      </w:r>
+      <w:proofErr w:type="spellEnd"/>
+      <w:r>
+        <w:rPr>
+          <w:iCs/>
+        </w:rPr>
+        <w:t xml:space="preserve"> purpose.</w:t>
       </w:r>
     </w:p>
     <w:p>
@@ -7148,7 +8524,25 @@
                 <w:bCs w:val="0"/>
                 <w:iCs/>
               </w:rPr>
-              <w:t>[Mockup]</w:t>
+              <w:t>[</w:t>
+            </w:r>
+            <w:proofErr w:type="spellStart"/>
+            <w:r>
+              <w:rPr>
+                <w:b/>
+                <w:bCs w:val="0"/>
+                <w:iCs/>
+              </w:rPr>
+              <w:t>Mockup</w:t>
+            </w:r>
+            <w:proofErr w:type="spellEnd"/>
+            <w:r>
+              <w:rPr>
+                <w:b/>
+                <w:bCs w:val="0"/>
+                <w:iCs/>
+              </w:rPr>
+              <w:t>]</w:t>
             </w:r>
           </w:p>
           <w:p>
@@ -8449,8 +9843,8 @@
     <w:p/>
     <w:p/>
     <w:sectPr>
-      <w:headerReference w:type="default" r:id="rId12"/>
-      <w:footerReference w:type="default" r:id="rId13"/>
+      <w:headerReference w:type="default" r:id="rId14"/>
+      <w:footerReference w:type="default" r:id="rId15"/>
       <w:pgSz w:w="11906" w:h="16838" w:code="9"/>
       <w:pgMar w:top="851" w:right="851" w:bottom="851" w:left="851" w:header="567" w:footer="342" w:gutter="0"/>
       <w:cols w:space="720"/>
@@ -9375,6 +10769,118 @@
     </w:lvl>
   </w:abstractNum>
   <w:abstractNum w:abstractNumId="2" w15:restartNumberingAfterBreak="0">
+    <w:nsid w:val="04FA11FC"/>
+    <w:multiLevelType w:val="hybridMultilevel"/>
+    <w:tmpl w:val="7270CA86"/>
+    <w:lvl w:ilvl="0" w:tplc="D0E2F916">
+      <w:numFmt w:val="bullet"/>
+      <w:lvlText w:val=""/>
+      <w:lvlJc w:val="left"/>
+      <w:pPr>
+        <w:ind w:left="720" w:hanging="360"/>
+      </w:pPr>
+      <w:rPr>
+        <w:rFonts w:ascii="Wingdings" w:eastAsia="Calibri" w:hAnsi="Wingdings" w:cs="Times New Roman" w:hint="default"/>
+      </w:rPr>
+    </w:lvl>
+    <w:lvl w:ilvl="1" w:tplc="0C090003" w:tentative="1">
+      <w:start w:val="1"/>
+      <w:numFmt w:val="bullet"/>
+      <w:lvlText w:val="o"/>
+      <w:lvlJc w:val="left"/>
+      <w:pPr>
+        <w:ind w:left="1440" w:hanging="360"/>
+      </w:pPr>
+      <w:rPr>
+        <w:rFonts w:ascii="Courier New" w:hAnsi="Courier New" w:cs="Courier New" w:hint="default"/>
+      </w:rPr>
+    </w:lvl>
+    <w:lvl w:ilvl="2" w:tplc="0C090005" w:tentative="1">
+      <w:start w:val="1"/>
+      <w:numFmt w:val="bullet"/>
+      <w:lvlText w:val=""/>
+      <w:lvlJc w:val="left"/>
+      <w:pPr>
+        <w:ind w:left="2160" w:hanging="360"/>
+      </w:pPr>
+      <w:rPr>
+        <w:rFonts w:ascii="Wingdings" w:hAnsi="Wingdings" w:hint="default"/>
+      </w:rPr>
+    </w:lvl>
+    <w:lvl w:ilvl="3" w:tplc="0C090001" w:tentative="1">
+      <w:start w:val="1"/>
+      <w:numFmt w:val="bullet"/>
+      <w:lvlText w:val=""/>
+      <w:lvlJc w:val="left"/>
+      <w:pPr>
+        <w:ind w:left="2880" w:hanging="360"/>
+      </w:pPr>
+      <w:rPr>
+        <w:rFonts w:ascii="Symbol" w:hAnsi="Symbol" w:hint="default"/>
+      </w:rPr>
+    </w:lvl>
+    <w:lvl w:ilvl="4" w:tplc="0C090003" w:tentative="1">
+      <w:start w:val="1"/>
+      <w:numFmt w:val="bullet"/>
+      <w:lvlText w:val="o"/>
+      <w:lvlJc w:val="left"/>
+      <w:pPr>
+        <w:ind w:left="3600" w:hanging="360"/>
+      </w:pPr>
+      <w:rPr>
+        <w:rFonts w:ascii="Courier New" w:hAnsi="Courier New" w:cs="Courier New" w:hint="default"/>
+      </w:rPr>
+    </w:lvl>
+    <w:lvl w:ilvl="5" w:tplc="0C090005" w:tentative="1">
+      <w:start w:val="1"/>
+      <w:numFmt w:val="bullet"/>
+      <w:lvlText w:val=""/>
+      <w:lvlJc w:val="left"/>
+      <w:pPr>
+        <w:ind w:left="4320" w:hanging="360"/>
+      </w:pPr>
+      <w:rPr>
+        <w:rFonts w:ascii="Wingdings" w:hAnsi="Wingdings" w:hint="default"/>
+      </w:rPr>
+    </w:lvl>
+    <w:lvl w:ilvl="6" w:tplc="0C090001" w:tentative="1">
+      <w:start w:val="1"/>
+      <w:numFmt w:val="bullet"/>
+      <w:lvlText w:val=""/>
+      <w:lvlJc w:val="left"/>
+      <w:pPr>
+        <w:ind w:left="5040" w:hanging="360"/>
+      </w:pPr>
+      <w:rPr>
+        <w:rFonts w:ascii="Symbol" w:hAnsi="Symbol" w:hint="default"/>
+      </w:rPr>
+    </w:lvl>
+    <w:lvl w:ilvl="7" w:tplc="0C090003" w:tentative="1">
+      <w:start w:val="1"/>
+      <w:numFmt w:val="bullet"/>
+      <w:lvlText w:val="o"/>
+      <w:lvlJc w:val="left"/>
+      <w:pPr>
+        <w:ind w:left="5760" w:hanging="360"/>
+      </w:pPr>
+      <w:rPr>
+        <w:rFonts w:ascii="Courier New" w:hAnsi="Courier New" w:cs="Courier New" w:hint="default"/>
+      </w:rPr>
+    </w:lvl>
+    <w:lvl w:ilvl="8" w:tplc="0C090005" w:tentative="1">
+      <w:start w:val="1"/>
+      <w:numFmt w:val="bullet"/>
+      <w:lvlText w:val=""/>
+      <w:lvlJc w:val="left"/>
+      <w:pPr>
+        <w:ind w:left="6480" w:hanging="360"/>
+      </w:pPr>
+      <w:rPr>
+        <w:rFonts w:ascii="Wingdings" w:hAnsi="Wingdings" w:hint="default"/>
+      </w:rPr>
+    </w:lvl>
+  </w:abstractNum>
+  <w:abstractNum w:abstractNumId="3" w15:restartNumberingAfterBreak="0">
     <w:nsid w:val="06D135B5"/>
     <w:multiLevelType w:val="hybridMultilevel"/>
     <w:tmpl w:val="8B6C2120"/>
@@ -9463,7 +10969,7 @@
       </w:pPr>
     </w:lvl>
   </w:abstractNum>
-  <w:abstractNum w:abstractNumId="3" w15:restartNumberingAfterBreak="0">
+  <w:abstractNum w:abstractNumId="4" w15:restartNumberingAfterBreak="0">
     <w:nsid w:val="07086F8C"/>
     <w:multiLevelType w:val="hybridMultilevel"/>
     <w:tmpl w:val="D710381A"/>
@@ -9552,7 +11058,7 @@
       </w:pPr>
     </w:lvl>
   </w:abstractNum>
-  <w:abstractNum w:abstractNumId="4" w15:restartNumberingAfterBreak="0">
+  <w:abstractNum w:abstractNumId="5" w15:restartNumberingAfterBreak="0">
     <w:nsid w:val="08750F01"/>
     <w:multiLevelType w:val="multilevel"/>
     <w:tmpl w:val="2FA05BE6"/>
@@ -9693,7 +11199,7 @@
       </w:rPr>
     </w:lvl>
   </w:abstractNum>
-  <w:abstractNum w:abstractNumId="5" w15:restartNumberingAfterBreak="0">
+  <w:abstractNum w:abstractNumId="6" w15:restartNumberingAfterBreak="0">
     <w:nsid w:val="0A841CAE"/>
     <w:multiLevelType w:val="hybridMultilevel"/>
     <w:tmpl w:val="AB5C76B8"/>
@@ -9782,7 +11288,7 @@
       </w:pPr>
     </w:lvl>
   </w:abstractNum>
-  <w:abstractNum w:abstractNumId="6" w15:restartNumberingAfterBreak="0">
+  <w:abstractNum w:abstractNumId="7" w15:restartNumberingAfterBreak="0">
     <w:nsid w:val="0BA611B1"/>
     <w:multiLevelType w:val="multilevel"/>
     <w:tmpl w:val="D8247744"/>
@@ -9895,7 +11401,7 @@
       </w:rPr>
     </w:lvl>
   </w:abstractNum>
-  <w:abstractNum w:abstractNumId="7" w15:restartNumberingAfterBreak="0">
+  <w:abstractNum w:abstractNumId="8" w15:restartNumberingAfterBreak="0">
     <w:nsid w:val="13363AA4"/>
     <w:multiLevelType w:val="hybridMultilevel"/>
     <w:tmpl w:val="183611A6"/>
@@ -9984,7 +11490,7 @@
       </w:pPr>
     </w:lvl>
   </w:abstractNum>
-  <w:abstractNum w:abstractNumId="8" w15:restartNumberingAfterBreak="0">
+  <w:abstractNum w:abstractNumId="9" w15:restartNumberingAfterBreak="0">
     <w:nsid w:val="171A0597"/>
     <w:multiLevelType w:val="hybridMultilevel"/>
     <w:tmpl w:val="C4F0DE7A"/>
@@ -10073,7 +11579,7 @@
       </w:pPr>
     </w:lvl>
   </w:abstractNum>
-  <w:abstractNum w:abstractNumId="9" w15:restartNumberingAfterBreak="0">
+  <w:abstractNum w:abstractNumId="10" w15:restartNumberingAfterBreak="0">
     <w:nsid w:val="197B2EF0"/>
     <w:multiLevelType w:val="hybridMultilevel"/>
     <w:tmpl w:val="FA9AB140"/>
@@ -10162,7 +11668,7 @@
       </w:pPr>
     </w:lvl>
   </w:abstractNum>
-  <w:abstractNum w:abstractNumId="10" w15:restartNumberingAfterBreak="0">
+  <w:abstractNum w:abstractNumId="11" w15:restartNumberingAfterBreak="0">
     <w:nsid w:val="1DC367EB"/>
     <w:multiLevelType w:val="hybridMultilevel"/>
     <w:tmpl w:val="89589A52"/>
@@ -10251,7 +11757,7 @@
       </w:pPr>
     </w:lvl>
   </w:abstractNum>
-  <w:abstractNum w:abstractNumId="11" w15:restartNumberingAfterBreak="0">
+  <w:abstractNum w:abstractNumId="12" w15:restartNumberingAfterBreak="0">
     <w:nsid w:val="23FF1E9A"/>
     <w:multiLevelType w:val="singleLevel"/>
     <w:tmpl w:val="4546F4BE"/>
@@ -10271,7 +11777,7 @@
       </w:rPr>
     </w:lvl>
   </w:abstractNum>
-  <w:abstractNum w:abstractNumId="12" w15:restartNumberingAfterBreak="0">
+  <w:abstractNum w:abstractNumId="13" w15:restartNumberingAfterBreak="0">
     <w:nsid w:val="2686147E"/>
     <w:multiLevelType w:val="hybridMultilevel"/>
     <w:tmpl w:val="2340A6C4"/>
@@ -10360,7 +11866,7 @@
       </w:pPr>
     </w:lvl>
   </w:abstractNum>
-  <w:abstractNum w:abstractNumId="13" w15:restartNumberingAfterBreak="0">
+  <w:abstractNum w:abstractNumId="14" w15:restartNumberingAfterBreak="0">
     <w:nsid w:val="29334B39"/>
     <w:multiLevelType w:val="hybridMultilevel"/>
     <w:tmpl w:val="047203D4"/>
@@ -10473,7 +11979,7 @@
       </w:rPr>
     </w:lvl>
   </w:abstractNum>
-  <w:abstractNum w:abstractNumId="14" w15:restartNumberingAfterBreak="0">
+  <w:abstractNum w:abstractNumId="15" w15:restartNumberingAfterBreak="0">
     <w:nsid w:val="2BC02D24"/>
     <w:multiLevelType w:val="hybridMultilevel"/>
     <w:tmpl w:val="0830538A"/>
@@ -10586,7 +12092,7 @@
       </w:rPr>
     </w:lvl>
   </w:abstractNum>
-  <w:abstractNum w:abstractNumId="15" w15:restartNumberingAfterBreak="0">
+  <w:abstractNum w:abstractNumId="16" w15:restartNumberingAfterBreak="0">
     <w:nsid w:val="2CB1431F"/>
     <w:multiLevelType w:val="hybridMultilevel"/>
     <w:tmpl w:val="9176D36E"/>
@@ -10672,7 +12178,7 @@
       </w:pPr>
     </w:lvl>
   </w:abstractNum>
-  <w:abstractNum w:abstractNumId="16" w15:restartNumberingAfterBreak="0">
+  <w:abstractNum w:abstractNumId="17" w15:restartNumberingAfterBreak="0">
     <w:nsid w:val="32872F54"/>
     <w:multiLevelType w:val="hybridMultilevel"/>
     <w:tmpl w:val="770C708A"/>
@@ -10761,7 +12267,7 @@
       </w:pPr>
     </w:lvl>
   </w:abstractNum>
-  <w:abstractNum w:abstractNumId="17" w15:restartNumberingAfterBreak="0">
+  <w:abstractNum w:abstractNumId="18" w15:restartNumberingAfterBreak="0">
     <w:nsid w:val="334A6E14"/>
     <w:multiLevelType w:val="hybridMultilevel"/>
     <w:tmpl w:val="07826880"/>
@@ -10850,7 +12356,7 @@
       </w:pPr>
     </w:lvl>
   </w:abstractNum>
-  <w:abstractNum w:abstractNumId="18" w15:restartNumberingAfterBreak="0">
+  <w:abstractNum w:abstractNumId="19" w15:restartNumberingAfterBreak="0">
     <w:nsid w:val="34D21D1A"/>
     <w:multiLevelType w:val="hybridMultilevel"/>
     <w:tmpl w:val="3A02C3C4"/>
@@ -10939,7 +12445,7 @@
       </w:pPr>
     </w:lvl>
   </w:abstractNum>
-  <w:abstractNum w:abstractNumId="19" w15:restartNumberingAfterBreak="0">
+  <w:abstractNum w:abstractNumId="20" w15:restartNumberingAfterBreak="0">
     <w:nsid w:val="38D16205"/>
     <w:multiLevelType w:val="multilevel"/>
     <w:tmpl w:val="5A106F58"/>
@@ -11052,7 +12558,7 @@
       </w:rPr>
     </w:lvl>
   </w:abstractNum>
-  <w:abstractNum w:abstractNumId="20" w15:restartNumberingAfterBreak="0">
+  <w:abstractNum w:abstractNumId="21" w15:restartNumberingAfterBreak="0">
     <w:nsid w:val="397E56B0"/>
     <w:multiLevelType w:val="hybridMultilevel"/>
     <w:tmpl w:val="D966BADC"/>
@@ -11165,7 +12671,7 @@
       </w:rPr>
     </w:lvl>
   </w:abstractNum>
-  <w:abstractNum w:abstractNumId="21" w15:restartNumberingAfterBreak="0">
+  <w:abstractNum w:abstractNumId="22" w15:restartNumberingAfterBreak="0">
     <w:nsid w:val="414E220D"/>
     <w:multiLevelType w:val="hybridMultilevel"/>
     <w:tmpl w:val="9740E27C"/>
@@ -11254,7 +12760,7 @@
       </w:pPr>
     </w:lvl>
   </w:abstractNum>
-  <w:abstractNum w:abstractNumId="22" w15:restartNumberingAfterBreak="0">
+  <w:abstractNum w:abstractNumId="23" w15:restartNumberingAfterBreak="0">
     <w:nsid w:val="44385CE4"/>
     <w:multiLevelType w:val="hybridMultilevel"/>
     <w:tmpl w:val="FA9AB140"/>
@@ -11343,7 +12849,7 @@
       </w:pPr>
     </w:lvl>
   </w:abstractNum>
-  <w:abstractNum w:abstractNumId="23" w15:restartNumberingAfterBreak="0">
+  <w:abstractNum w:abstractNumId="24" w15:restartNumberingAfterBreak="0">
     <w:nsid w:val="47927793"/>
     <w:multiLevelType w:val="hybridMultilevel"/>
     <w:tmpl w:val="1590B70C"/>
@@ -11433,7 +12939,7 @@
       </w:pPr>
     </w:lvl>
   </w:abstractNum>
-  <w:abstractNum w:abstractNumId="24" w15:restartNumberingAfterBreak="0">
+  <w:abstractNum w:abstractNumId="25" w15:restartNumberingAfterBreak="0">
     <w:nsid w:val="48AB06A4"/>
     <w:multiLevelType w:val="hybridMultilevel"/>
     <w:tmpl w:val="DDA0E4A4"/>
@@ -11522,7 +13028,7 @@
       </w:pPr>
     </w:lvl>
   </w:abstractNum>
-  <w:abstractNum w:abstractNumId="25" w15:restartNumberingAfterBreak="0">
+  <w:abstractNum w:abstractNumId="26" w15:restartNumberingAfterBreak="0">
     <w:nsid w:val="4A740A1A"/>
     <w:multiLevelType w:val="hybridMultilevel"/>
     <w:tmpl w:val="17FA5642"/>
@@ -11611,7 +13117,7 @@
       </w:pPr>
     </w:lvl>
   </w:abstractNum>
-  <w:abstractNum w:abstractNumId="26" w15:restartNumberingAfterBreak="0">
+  <w:abstractNum w:abstractNumId="27" w15:restartNumberingAfterBreak="0">
     <w:nsid w:val="4D9B7495"/>
     <w:multiLevelType w:val="hybridMultilevel"/>
     <w:tmpl w:val="B5A8A436"/>
@@ -11700,7 +13206,7 @@
       </w:pPr>
     </w:lvl>
   </w:abstractNum>
-  <w:abstractNum w:abstractNumId="27" w15:restartNumberingAfterBreak="0">
+  <w:abstractNum w:abstractNumId="28" w15:restartNumberingAfterBreak="0">
     <w:nsid w:val="4E1A1140"/>
     <w:multiLevelType w:val="hybridMultilevel"/>
     <w:tmpl w:val="1736BFCA"/>
@@ -11812,7 +13318,7 @@
       </w:rPr>
     </w:lvl>
   </w:abstractNum>
-  <w:abstractNum w:abstractNumId="28" w15:restartNumberingAfterBreak="0">
+  <w:abstractNum w:abstractNumId="29" w15:restartNumberingAfterBreak="0">
     <w:nsid w:val="51BA0F04"/>
     <w:multiLevelType w:val="hybridMultilevel"/>
     <w:tmpl w:val="DDA0E4A4"/>
@@ -11901,7 +13407,7 @@
       </w:pPr>
     </w:lvl>
   </w:abstractNum>
-  <w:abstractNum w:abstractNumId="29" w15:restartNumberingAfterBreak="0">
+  <w:abstractNum w:abstractNumId="30" w15:restartNumberingAfterBreak="0">
     <w:nsid w:val="53687FCD"/>
     <w:multiLevelType w:val="hybridMultilevel"/>
     <w:tmpl w:val="85F8F098"/>
@@ -11990,7 +13496,7 @@
       </w:pPr>
     </w:lvl>
   </w:abstractNum>
-  <w:abstractNum w:abstractNumId="30" w15:restartNumberingAfterBreak="0">
+  <w:abstractNum w:abstractNumId="31" w15:restartNumberingAfterBreak="0">
     <w:nsid w:val="59875EB1"/>
     <w:multiLevelType w:val="hybridMultilevel"/>
     <w:tmpl w:val="C4A47B1C"/>
@@ -12102,7 +13608,7 @@
       </w:rPr>
     </w:lvl>
   </w:abstractNum>
-  <w:abstractNum w:abstractNumId="31" w15:restartNumberingAfterBreak="0">
+  <w:abstractNum w:abstractNumId="32" w15:restartNumberingAfterBreak="0">
     <w:nsid w:val="604A5037"/>
     <w:multiLevelType w:val="hybridMultilevel"/>
     <w:tmpl w:val="F96C6EE6"/>
@@ -12191,7 +13697,7 @@
       </w:pPr>
     </w:lvl>
   </w:abstractNum>
-  <w:abstractNum w:abstractNumId="32" w15:restartNumberingAfterBreak="0">
+  <w:abstractNum w:abstractNumId="33" w15:restartNumberingAfterBreak="0">
     <w:nsid w:val="69261BD5"/>
     <w:multiLevelType w:val="hybridMultilevel"/>
     <w:tmpl w:val="296A2ABC"/>
@@ -12280,7 +13786,7 @@
       </w:pPr>
     </w:lvl>
   </w:abstractNum>
-  <w:abstractNum w:abstractNumId="33" w15:restartNumberingAfterBreak="0">
+  <w:abstractNum w:abstractNumId="34" w15:restartNumberingAfterBreak="0">
     <w:nsid w:val="69EA72EA"/>
     <w:multiLevelType w:val="hybridMultilevel"/>
     <w:tmpl w:val="DD48BEEC"/>
@@ -12369,7 +13875,7 @@
       </w:pPr>
     </w:lvl>
   </w:abstractNum>
-  <w:abstractNum w:abstractNumId="34" w15:restartNumberingAfterBreak="0">
+  <w:abstractNum w:abstractNumId="35" w15:restartNumberingAfterBreak="0">
     <w:nsid w:val="6CAD715F"/>
     <w:multiLevelType w:val="multilevel"/>
     <w:tmpl w:val="440C05F8"/>
@@ -12482,7 +13988,7 @@
       </w:rPr>
     </w:lvl>
   </w:abstractNum>
-  <w:abstractNum w:abstractNumId="35" w15:restartNumberingAfterBreak="0">
+  <w:abstractNum w:abstractNumId="36" w15:restartNumberingAfterBreak="0">
     <w:nsid w:val="6E143E1F"/>
     <w:multiLevelType w:val="hybridMultilevel"/>
     <w:tmpl w:val="E8A0D6CC"/>
@@ -12571,7 +14077,7 @@
       </w:pPr>
     </w:lvl>
   </w:abstractNum>
-  <w:abstractNum w:abstractNumId="36" w15:restartNumberingAfterBreak="0">
+  <w:abstractNum w:abstractNumId="37" w15:restartNumberingAfterBreak="0">
     <w:nsid w:val="702B6813"/>
     <w:multiLevelType w:val="hybridMultilevel"/>
     <w:tmpl w:val="8E968358"/>
@@ -12660,7 +14166,7 @@
       </w:pPr>
     </w:lvl>
   </w:abstractNum>
-  <w:abstractNum w:abstractNumId="37" w15:restartNumberingAfterBreak="0">
+  <w:abstractNum w:abstractNumId="38" w15:restartNumberingAfterBreak="0">
     <w:nsid w:val="74FB08E8"/>
     <w:multiLevelType w:val="hybridMultilevel"/>
     <w:tmpl w:val="A162AB1A"/>
@@ -12749,7 +14255,7 @@
       </w:pPr>
     </w:lvl>
   </w:abstractNum>
-  <w:abstractNum w:abstractNumId="38" w15:restartNumberingAfterBreak="0">
+  <w:abstractNum w:abstractNumId="39" w15:restartNumberingAfterBreak="0">
     <w:nsid w:val="77304D81"/>
     <w:multiLevelType w:val="hybridMultilevel"/>
     <w:tmpl w:val="99667CE4"/>
@@ -12838,7 +14344,7 @@
       </w:pPr>
     </w:lvl>
   </w:abstractNum>
-  <w:abstractNum w:abstractNumId="39" w15:restartNumberingAfterBreak="0">
+  <w:abstractNum w:abstractNumId="40" w15:restartNumberingAfterBreak="0">
     <w:nsid w:val="7B204928"/>
     <w:multiLevelType w:val="hybridMultilevel"/>
     <w:tmpl w:val="32DCAFC2"/>
@@ -12951,19 +14457,19 @@
     </w:lvl>
   </w:abstractNum>
   <w:num w:numId="1" w16cid:durableId="498935142">
-    <w:abstractNumId w:val="11"/>
+    <w:abstractNumId w:val="12"/>
   </w:num>
   <w:num w:numId="2" w16cid:durableId="1353874293">
-    <w:abstractNumId w:val="4"/>
+    <w:abstractNumId w:val="5"/>
   </w:num>
   <w:num w:numId="3" w16cid:durableId="748188388">
-    <w:abstractNumId w:val="27"/>
+    <w:abstractNumId w:val="28"/>
   </w:num>
   <w:num w:numId="4" w16cid:durableId="1027366734">
-    <w:abstractNumId w:val="39"/>
+    <w:abstractNumId w:val="40"/>
   </w:num>
   <w:num w:numId="5" w16cid:durableId="941063157">
-    <w:abstractNumId w:val="15"/>
+    <w:abstractNumId w:val="16"/>
     <w:lvlOverride w:ilvl="0">
       <w:startOverride w:val="1"/>
     </w:lvlOverride>
@@ -12993,25 +14499,25 @@
     </w:lvlOverride>
   </w:num>
   <w:num w:numId="6" w16cid:durableId="1711372799">
-    <w:abstractNumId w:val="20"/>
+    <w:abstractNumId w:val="21"/>
   </w:num>
   <w:num w:numId="7" w16cid:durableId="1721900789">
-    <w:abstractNumId w:val="23"/>
+    <w:abstractNumId w:val="24"/>
   </w:num>
   <w:num w:numId="8" w16cid:durableId="382102882">
-    <w:abstractNumId w:val="26"/>
+    <w:abstractNumId w:val="27"/>
   </w:num>
   <w:num w:numId="9" w16cid:durableId="336734406">
-    <w:abstractNumId w:val="18"/>
+    <w:abstractNumId w:val="19"/>
   </w:num>
   <w:num w:numId="10" w16cid:durableId="1668093247">
-    <w:abstractNumId w:val="37"/>
+    <w:abstractNumId w:val="38"/>
   </w:num>
   <w:num w:numId="11" w16cid:durableId="829755388">
     <w:abstractNumId w:val="1"/>
   </w:num>
   <w:num w:numId="12" w16cid:durableId="1710716074">
-    <w:abstractNumId w:val="26"/>
+    <w:abstractNumId w:val="27"/>
     <w:lvlOverride w:ilvl="0">
       <w:startOverride w:val="1"/>
     </w:lvlOverride>
@@ -13041,7 +14547,7 @@
     </w:lvlOverride>
   </w:num>
   <w:num w:numId="13" w16cid:durableId="1754088233">
-    <w:abstractNumId w:val="18"/>
+    <w:abstractNumId w:val="19"/>
     <w:lvlOverride w:ilvl="0">
       <w:startOverride w:val="1"/>
     </w:lvlOverride>
@@ -13071,7 +14577,7 @@
     </w:lvlOverride>
   </w:num>
   <w:num w:numId="14" w16cid:durableId="1792554269">
-    <w:abstractNumId w:val="37"/>
+    <w:abstractNumId w:val="38"/>
     <w:lvlOverride w:ilvl="0">
       <w:startOverride w:val="1"/>
     </w:lvlOverride>
@@ -13101,91 +14607,94 @@
     </w:lvlOverride>
   </w:num>
   <w:num w:numId="15" w16cid:durableId="2085443238">
-    <w:abstractNumId w:val="19"/>
+    <w:abstractNumId w:val="20"/>
   </w:num>
   <w:num w:numId="16" w16cid:durableId="2083140355">
+    <w:abstractNumId w:val="10"/>
+  </w:num>
+  <w:num w:numId="17" w16cid:durableId="866721188">
+    <w:abstractNumId w:val="7"/>
+  </w:num>
+  <w:num w:numId="18" w16cid:durableId="1057315098">
+    <w:abstractNumId w:val="23"/>
+  </w:num>
+  <w:num w:numId="19" w16cid:durableId="961380315">
+    <w:abstractNumId w:val="35"/>
+  </w:num>
+  <w:num w:numId="20" w16cid:durableId="1986204980">
+    <w:abstractNumId w:val="13"/>
+  </w:num>
+  <w:num w:numId="21" w16cid:durableId="679703945">
+    <w:abstractNumId w:val="39"/>
+  </w:num>
+  <w:num w:numId="22" w16cid:durableId="372459657">
     <w:abstractNumId w:val="9"/>
   </w:num>
-  <w:num w:numId="17" w16cid:durableId="866721188">
-    <w:abstractNumId w:val="6"/>
+  <w:num w:numId="23" w16cid:durableId="589118782">
+    <w:abstractNumId w:val="11"/>
   </w:num>
-  <w:num w:numId="18" w16cid:durableId="1057315098">
+  <w:num w:numId="24" w16cid:durableId="1297223708">
+    <w:abstractNumId w:val="17"/>
+  </w:num>
+  <w:num w:numId="25" w16cid:durableId="55127735">
+    <w:abstractNumId w:val="34"/>
+  </w:num>
+  <w:num w:numId="26" w16cid:durableId="1983998551">
     <w:abstractNumId w:val="22"/>
   </w:num>
-  <w:num w:numId="19" w16cid:durableId="961380315">
-    <w:abstractNumId w:val="34"/>
+  <w:num w:numId="27" w16cid:durableId="877396990">
+    <w:abstractNumId w:val="3"/>
   </w:num>
-  <w:num w:numId="20" w16cid:durableId="1986204980">
-    <w:abstractNumId w:val="12"/>
+  <w:num w:numId="28" w16cid:durableId="1208570848">
+    <w:abstractNumId w:val="25"/>
   </w:num>
-  <w:num w:numId="21" w16cid:durableId="679703945">
-    <w:abstractNumId w:val="38"/>
-  </w:num>
-  <w:num w:numId="22" w16cid:durableId="372459657">
+  <w:num w:numId="29" w16cid:durableId="627469506">
     <w:abstractNumId w:val="8"/>
   </w:num>
-  <w:num w:numId="23" w16cid:durableId="589118782">
-    <w:abstractNumId w:val="10"/>
-  </w:num>
-  <w:num w:numId="24" w16cid:durableId="1297223708">
-    <w:abstractNumId w:val="16"/>
-  </w:num>
-  <w:num w:numId="25" w16cid:durableId="55127735">
+  <w:num w:numId="30" w16cid:durableId="678780183">
     <w:abstractNumId w:val="33"/>
   </w:num>
-  <w:num w:numId="26" w16cid:durableId="1983998551">
-    <w:abstractNumId w:val="21"/>
-  </w:num>
-  <w:num w:numId="27" w16cid:durableId="877396990">
-    <w:abstractNumId w:val="2"/>
-  </w:num>
-  <w:num w:numId="28" w16cid:durableId="1208570848">
-    <w:abstractNumId w:val="24"/>
-  </w:num>
-  <w:num w:numId="29" w16cid:durableId="627469506">
-    <w:abstractNumId w:val="7"/>
-  </w:num>
-  <w:num w:numId="30" w16cid:durableId="678780183">
-    <w:abstractNumId w:val="32"/>
-  </w:num>
   <w:num w:numId="31" w16cid:durableId="570627571">
-    <w:abstractNumId w:val="29"/>
+    <w:abstractNumId w:val="30"/>
   </w:num>
   <w:num w:numId="32" w16cid:durableId="1246259848">
     <w:abstractNumId w:val="0"/>
   </w:num>
   <w:num w:numId="33" w16cid:durableId="1791632344">
-    <w:abstractNumId w:val="5"/>
+    <w:abstractNumId w:val="6"/>
   </w:num>
   <w:num w:numId="34" w16cid:durableId="1186098480">
-    <w:abstractNumId w:val="25"/>
+    <w:abstractNumId w:val="26"/>
   </w:num>
   <w:num w:numId="35" w16cid:durableId="1726874149">
-    <w:abstractNumId w:val="3"/>
+    <w:abstractNumId w:val="4"/>
   </w:num>
   <w:num w:numId="36" w16cid:durableId="1073236623">
-    <w:abstractNumId w:val="35"/>
+    <w:abstractNumId w:val="36"/>
   </w:num>
   <w:num w:numId="37" w16cid:durableId="863515946">
-    <w:abstractNumId w:val="36"/>
+    <w:abstractNumId w:val="37"/>
   </w:num>
   <w:num w:numId="38" w16cid:durableId="1715931793">
+    <w:abstractNumId w:val="32"/>
+  </w:num>
+  <w:num w:numId="39" w16cid:durableId="1514032035">
+    <w:abstractNumId w:val="18"/>
+  </w:num>
+  <w:num w:numId="40" w16cid:durableId="1150446154">
+    <w:abstractNumId w:val="29"/>
+  </w:num>
+  <w:num w:numId="41" w16cid:durableId="1450469383">
+    <w:abstractNumId w:val="15"/>
+  </w:num>
+  <w:num w:numId="42" w16cid:durableId="73478081">
+    <w:abstractNumId w:val="14"/>
+  </w:num>
+  <w:num w:numId="43" w16cid:durableId="1592808942">
     <w:abstractNumId w:val="31"/>
   </w:num>
-  <w:num w:numId="39" w16cid:durableId="1514032035">
-    <w:abstractNumId w:val="17"/>
-  </w:num>
-  <w:num w:numId="40" w16cid:durableId="1150446154">
-    <w:abstractNumId w:val="28"/>
-  </w:num>
-  <w:num w:numId="41" w16cid:durableId="1450469383">
-    <w:abstractNumId w:val="14"/>
-  </w:num>
-  <w:num w:numId="42" w16cid:durableId="73478081">
-    <w:abstractNumId w:val="13"/>
-  </w:num>
-  <w:num w:numId="43" w16cid:durableId="1592808942">
-    <w:abstractNumId w:val="30"/>
+  <w:num w:numId="44" w16cid:durableId="948974477">
+    <w:abstractNumId w:val="2"/>
   </w:num>
 </w:numbering>
 </file>
@@ -14108,6 +15617,28 @@
       </w:tblBorders>
     </w:tblPr>
   </w:style>
+  <w:style w:type="character" w:styleId="Hyperlink">
+    <w:name w:val="Hyperlink"/>
+    <w:basedOn w:val="DefaultParagraphFont"/>
+    <w:unhideWhenUsed/>
+    <w:rsid w:val="000C26BF"/>
+    <w:rPr>
+      <w:color w:val="0000FF" w:themeColor="hyperlink"/>
+      <w:u w:val="single"/>
+    </w:rPr>
+  </w:style>
+  <w:style w:type="character" w:styleId="UnresolvedMention">
+    <w:name w:val="Unresolved Mention"/>
+    <w:basedOn w:val="DefaultParagraphFont"/>
+    <w:uiPriority w:val="99"/>
+    <w:semiHidden/>
+    <w:unhideWhenUsed/>
+    <w:rsid w:val="000C26BF"/>
+    <w:rPr>
+      <w:color w:val="605E5C"/>
+      <w:shd w:val="clear" w:color="auto" w:fill="E1DFDD"/>
+    </w:rPr>
+  </w:style>
 </w:styles>
 </file>
 
@@ -14158,12 +15689,19 @@
     <w:pitch w:val="variable"/>
     <w:sig w:usb0="E0002EFF" w:usb1="C000785B" w:usb2="00000009" w:usb3="00000000" w:csb0="000001FF" w:csb1="00000000"/>
   </w:font>
-  <w:font w:name="Symbol">
-    <w:panose1 w:val="05050102010706020507"/>
+  <w:font w:name="Wingdings">
+    <w:panose1 w:val="05000000000000000000"/>
     <w:charset w:val="02"/>
-    <w:family w:val="roman"/>
+    <w:family w:val="auto"/>
     <w:pitch w:val="variable"/>
     <w:sig w:usb0="00000000" w:usb1="10000000" w:usb2="00000000" w:usb3="00000000" w:csb0="80000000" w:csb1="00000000"/>
+  </w:font>
+  <w:font w:name="Calibri">
+    <w:panose1 w:val="020F0502020204030204"/>
+    <w:charset w:val="00"/>
+    <w:family w:val="swiss"/>
+    <w:pitch w:val="variable"/>
+    <w:sig w:usb0="E4002EFF" w:usb1="C000247B" w:usb2="00000009" w:usb3="00000000" w:csb0="000001FF" w:csb1="00000000"/>
   </w:font>
   <w:font w:name="Courier New">
     <w:panose1 w:val="02070309020205020404"/>
@@ -14172,10 +15710,10 @@
     <w:pitch w:val="fixed"/>
     <w:sig w:usb0="E0002EFF" w:usb1="C0007843" w:usb2="00000009" w:usb3="00000000" w:csb0="000001FF" w:csb1="00000000"/>
   </w:font>
-  <w:font w:name="Wingdings">
-    <w:panose1 w:val="05000000000000000000"/>
+  <w:font w:name="Symbol">
+    <w:panose1 w:val="05050102010706020507"/>
     <w:charset w:val="02"/>
-    <w:family w:val="auto"/>
+    <w:family w:val="roman"/>
     <w:pitch w:val="variable"/>
     <w:sig w:usb0="00000000" w:usb1="10000000" w:usb2="00000000" w:usb3="00000000" w:csb0="80000000" w:csb1="00000000"/>
   </w:font>
@@ -14193,13 +15731,6 @@
     <w:family w:val="auto"/>
     <w:pitch w:val="variable"/>
     <w:sig w:usb0="00000203" w:usb1="288F0000" w:usb2="00000016" w:usb3="00000000" w:csb0="00040001" w:csb1="00000000"/>
-  </w:font>
-  <w:font w:name="Calibri">
-    <w:panose1 w:val="020F0502020204030204"/>
-    <w:charset w:val="00"/>
-    <w:family w:val="swiss"/>
-    <w:pitch w:val="variable"/>
-    <w:sig w:usb0="E4002EFF" w:usb1="C000247B" w:usb2="00000009" w:usb3="00000000" w:csb0="000001FF" w:csb1="00000000"/>
   </w:font>
   <w:font w:name="Palatino">
     <w:altName w:val="Book Antiqua"/>
@@ -14263,15 +15794,18 @@
   </w:compat>
   <w:rsids>
     <w:rsidRoot w:val="001C0F3D"/>
+    <w:rsid w:val="00056126"/>
     <w:rsid w:val="000F7AA8"/>
     <w:rsid w:val="001267A7"/>
     <w:rsid w:val="001C0F3D"/>
     <w:rsid w:val="00277740"/>
+    <w:rsid w:val="00277A4E"/>
     <w:rsid w:val="002A7697"/>
     <w:rsid w:val="004033F8"/>
     <w:rsid w:val="00434508"/>
     <w:rsid w:val="004B1DFD"/>
     <w:rsid w:val="00546C8A"/>
+    <w:rsid w:val="005B62FA"/>
     <w:rsid w:val="005D56E3"/>
     <w:rsid w:val="00640DCB"/>
     <w:rsid w:val="0066722D"/>
@@ -14281,7 +15815,9 @@
     <w:rsid w:val="00C5646E"/>
     <w:rsid w:val="00DF4D8D"/>
     <w:rsid w:val="00E44F2C"/>
+    <w:rsid w:val="00E662E8"/>
     <w:rsid w:val="00E70D6A"/>
+    <w:rsid w:val="00F56F06"/>
     <w:rsid w:val="00FD45B2"/>
     <w:rsid w:val="00FE1F5A"/>
   </w:rsids>

</xml_diff>

<commit_message>
Doing more work on Assessment 1
</commit_message>
<xml_diff>
--- a/Assessment 1/Ben Timewell - F122A12 - 1. Research and Plan The Development of an AI Simulation Game.docx
+++ b/Assessment 1/Ben Timewell - F122A12 - 1. Research and Plan The Development of an AI Simulation Game.docx
@@ -424,7 +424,21 @@
               <w:rPr>
                 <w:szCs w:val="22"/>
               </w:rPr>
-              <w:t>This prototype will focus on the AI and Pathfinding implementation, but will also require you to create the base implementation of the Project which will be expanded upon in the next phase of development.</w:t>
+              <w:t xml:space="preserve">This prototype will focus on the AI and Pathfinding </w:t>
+            </w:r>
+            <w:proofErr w:type="gramStart"/>
+            <w:r>
+              <w:rPr>
+                <w:szCs w:val="22"/>
+              </w:rPr>
+              <w:t>implementation, but</w:t>
+            </w:r>
+            <w:proofErr w:type="gramEnd"/>
+            <w:r>
+              <w:rPr>
+                <w:szCs w:val="22"/>
+              </w:rPr>
+              <w:t xml:space="preserve"> will also require you to create the base implementation of the Project which will be expanded upon in the next phase of development.</w:t>
             </w:r>
           </w:p>
           <w:p>
@@ -661,11 +675,16 @@
                 <w:numId w:val="41"/>
               </w:numPr>
             </w:pPr>
+            <w:proofErr w:type="gramStart"/>
             <w:r>
               <w:t xml:space="preserve">Include </w:t>
             </w:r>
             <w:r>
-              <w:t xml:space="preserve"> at least a Main Menu for entering the game and a way to Exit the game at runtime</w:t>
+              <w:t xml:space="preserve"> at</w:t>
+            </w:r>
+            <w:proofErr w:type="gramEnd"/>
+            <w:r>
+              <w:t xml:space="preserve"> least a Main Menu for entering the game and a way to Exit the game at runtime</w:t>
             </w:r>
           </w:p>
           <w:p>
@@ -1009,12 +1028,20 @@
                 <w:szCs w:val="22"/>
               </w:rPr>
             </w:pPr>
+            <w:proofErr w:type="gramStart"/>
             <w:r>
               <w:rPr>
                 <w:szCs w:val="22"/>
               </w:rPr>
               <w:lastRenderedPageBreak/>
-              <w:t>In the course of planning, you will need to cover the following points:</w:t>
+              <w:t>In the course of</w:t>
+            </w:r>
+            <w:proofErr w:type="gramEnd"/>
+            <w:r>
+              <w:rPr>
+                <w:szCs w:val="22"/>
+              </w:rPr>
+              <w:t xml:space="preserve"> planning, you will need to cover the following points:</w:t>
             </w:r>
           </w:p>
           <w:p>
@@ -1093,7 +1120,21 @@
               <w:rPr>
                 <w:szCs w:val="22"/>
               </w:rPr>
-              <w:t xml:space="preserve"> Pathfinding provide answers for the questions provided in order to understand the Systems you will be implementing on the project</w:t>
+              <w:t xml:space="preserve"> Pathfinding provide answers for the questions provided </w:t>
+            </w:r>
+            <w:proofErr w:type="gramStart"/>
+            <w:r>
+              <w:rPr>
+                <w:szCs w:val="22"/>
+              </w:rPr>
+              <w:t>in order to</w:t>
+            </w:r>
+            <w:proofErr w:type="gramEnd"/>
+            <w:r>
+              <w:rPr>
+                <w:szCs w:val="22"/>
+              </w:rPr>
+              <w:t xml:space="preserve"> understand the Systems you will be implementing on the project</w:t>
             </w:r>
           </w:p>
           <w:p>
@@ -1169,12 +1210,21 @@
               </w:rPr>
               <w:t xml:space="preserve">In this section you will research Game Engines and Release Platforms </w:t>
             </w:r>
+            <w:proofErr w:type="gramStart"/>
             <w:r>
               <w:rPr>
                 <w:bCs w:val="0"/>
                 <w:szCs w:val="22"/>
               </w:rPr>
-              <w:t>in order to better understand the software and hardware you will be using/building for and make informed decision as to what Engine to use and what Platform to release on</w:t>
+              <w:t>in order to</w:t>
+            </w:r>
+            <w:proofErr w:type="gramEnd"/>
+            <w:r>
+              <w:rPr>
+                <w:bCs w:val="0"/>
+                <w:szCs w:val="22"/>
+              </w:rPr>
+              <w:t xml:space="preserve"> better understand the software and hardware you will be using/building for and make informed decision as to what Engine to use and what Platform to release on</w:t>
             </w:r>
           </w:p>
           <w:p>
@@ -1267,7 +1317,21 @@
               <w:rPr>
                 <w:szCs w:val="22"/>
               </w:rPr>
-              <w:t>The rest of this document is a Template for covering all of the above requirem</w:t>
+              <w:t xml:space="preserve">The rest of this document is a Template for covering </w:t>
+            </w:r>
+            <w:proofErr w:type="gramStart"/>
+            <w:r>
+              <w:rPr>
+                <w:szCs w:val="22"/>
+              </w:rPr>
+              <w:t>all of</w:t>
+            </w:r>
+            <w:proofErr w:type="gramEnd"/>
+            <w:r>
+              <w:rPr>
+                <w:szCs w:val="22"/>
+              </w:rPr>
+              <w:t xml:space="preserve"> the above requirem</w:t>
             </w:r>
             <w:r>
               <w:rPr>
@@ -1501,6 +1565,7 @@
               <w:t xml:space="preserve">Goal oriented action planning is an AI system that directs an AI actor, such as an NPC, based on given values from a world state, goals and actions that it can perform. It then plans out </w:t>
             </w:r>
             <w:proofErr w:type="spellStart"/>
+            <w:proofErr w:type="gramStart"/>
             <w:r>
               <w:rPr>
                 <w:iCs/>
@@ -1508,6 +1573,7 @@
               <w:t>it’s</w:t>
             </w:r>
             <w:proofErr w:type="spellEnd"/>
+            <w:proofErr w:type="gramEnd"/>
             <w:r>
               <w:rPr>
                 <w:iCs/>
@@ -1573,7 +1639,35 @@
               <w:rPr>
                 <w:iCs/>
               </w:rPr>
-              <w:t>World states is the repository of information that represents everything an AI actor or NPC needs to know in order to preform actions in the game world. These can also dictate if an NPC can heal if a Boolean is set as “</w:t>
+              <w:t xml:space="preserve">World states </w:t>
+            </w:r>
+            <w:proofErr w:type="gramStart"/>
+            <w:r>
+              <w:rPr>
+                <w:iCs/>
+              </w:rPr>
+              <w:t>is</w:t>
+            </w:r>
+            <w:proofErr w:type="gramEnd"/>
+            <w:r>
+              <w:rPr>
+                <w:iCs/>
+              </w:rPr>
+              <w:t xml:space="preserve"> the repository of information that represents everything an AI actor or NPC needs to know </w:t>
+            </w:r>
+            <w:proofErr w:type="gramStart"/>
+            <w:r>
+              <w:rPr>
+                <w:iCs/>
+              </w:rPr>
+              <w:t>in order to</w:t>
+            </w:r>
+            <w:proofErr w:type="gramEnd"/>
+            <w:r>
+              <w:rPr>
+                <w:iCs/>
+              </w:rPr>
+              <w:t xml:space="preserve"> preform actions in the game world. These can also dictate if an NPC can heal if a Boolean is set as “</w:t>
             </w:r>
             <w:proofErr w:type="spellStart"/>
             <w:r>
@@ -1723,7 +1817,21 @@
               <w:rPr>
                 <w:iCs/>
               </w:rPr>
-              <w:t xml:space="preserve">Actions are the game behaviours that an NPC can actually perform based on the effects, preconditions and a cost to perform. </w:t>
+              <w:t xml:space="preserve">Actions are the game behaviours that an NPC can </w:t>
+            </w:r>
+            <w:proofErr w:type="gramStart"/>
+            <w:r>
+              <w:rPr>
+                <w:iCs/>
+              </w:rPr>
+              <w:t>actually perform</w:t>
+            </w:r>
+            <w:proofErr w:type="gramEnd"/>
+            <w:r>
+              <w:rPr>
+                <w:iCs/>
+              </w:rPr>
+              <w:t xml:space="preserve"> based on the effects, preconditions and a cost to perform. </w:t>
             </w:r>
             <w:r>
               <w:rPr>
@@ -1911,7 +2019,21 @@
               <w:rPr>
                 <w:iCs/>
               </w:rPr>
-              <w:t xml:space="preserve"> If you need to account for additional actions and world information, you can just add it in and the system will take care of the rest.</w:t>
+              <w:t xml:space="preserve"> If you need to account for additional actions and world information, you can just add it </w:t>
+            </w:r>
+            <w:proofErr w:type="gramStart"/>
+            <w:r>
+              <w:rPr>
+                <w:iCs/>
+              </w:rPr>
+              <w:t>in</w:t>
+            </w:r>
+            <w:proofErr w:type="gramEnd"/>
+            <w:r>
+              <w:rPr>
+                <w:iCs/>
+              </w:rPr>
+              <w:t xml:space="preserve"> and the system will take care of the rest.</w:t>
             </w:r>
           </w:p>
           <w:p>
@@ -2466,7 +2588,21 @@
               <w:rPr>
                 <w:iCs/>
               </w:rPr>
-              <w:t>, which is based on a number of stats and how likely each action will succeed. The action with the highest chance of succeeding gets picked and then ran. Overall, Utility AI is a very effective way of decision making, so long as it’s configured correctly from the start.</w:t>
+              <w:t xml:space="preserve">, which is based on </w:t>
+            </w:r>
+            <w:proofErr w:type="gramStart"/>
+            <w:r>
+              <w:rPr>
+                <w:iCs/>
+              </w:rPr>
+              <w:t>a number of</w:t>
+            </w:r>
+            <w:proofErr w:type="gramEnd"/>
+            <w:r>
+              <w:rPr>
+                <w:iCs/>
+              </w:rPr>
+              <w:t xml:space="preserve"> stats and how likely each action will succeed. The action with the highest chance of succeeding gets picked and then ran. Overall, Utility AI is a very effective way of decision making, so long as it’s configured correctly from the start.</w:t>
             </w:r>
           </w:p>
         </w:tc>
@@ -2661,7 +2797,21 @@
               <w:rPr>
                 <w:iCs/>
               </w:rPr>
-              <w:t>Weighting is an alternative to bucketing, but rather than grouping actions, all actions have their base score, and the weighting is a modifier applied to the base value. Such as, an aggressive NPC would have a higher modifier for attacking, compared to being defensive, so even though the base value for attacking is lower than a defensive action, the weight / modifier increases it’s score (also known as the weighted score).</w:t>
+              <w:t xml:space="preserve">Weighting is an alternative to bucketing, but rather than grouping actions, all actions have their base score, and the weighting is a modifier applied to the base value. Such as, an aggressive NPC would have a higher modifier for attacking, compared to being defensive, so even though the base value for attacking is lower than a defensive action, the weight / modifier increases </w:t>
+            </w:r>
+            <w:proofErr w:type="gramStart"/>
+            <w:r>
+              <w:rPr>
+                <w:iCs/>
+              </w:rPr>
+              <w:t>it’s</w:t>
+            </w:r>
+            <w:proofErr w:type="gramEnd"/>
+            <w:r>
+              <w:rPr>
+                <w:iCs/>
+              </w:rPr>
+              <w:t xml:space="preserve"> score (also known as the weighted score).</w:t>
             </w:r>
           </w:p>
         </w:tc>
@@ -3072,7 +3222,21 @@
               <w:rPr>
                 <w:iCs/>
               </w:rPr>
-              <w:t>The Sims uses Utility AI to decide what actions each Sim should take, such as getting food if their hunger meter is empty, or using the bathroom if their bladder is full. But it takes into account all factors, so it can properly adjust what action the Sim needs to take. For example, if hunger is empty, but bladder is near full, the Sim will get food before using the restroom. Or if their fun meter is empty, they may decide to do something fun before eating.</w:t>
+              <w:t xml:space="preserve">The Sims uses Utility AI to decide what actions each Sim should take, such as getting food if their hunger meter is empty, or using the bathroom if their bladder is full. But it </w:t>
+            </w:r>
+            <w:proofErr w:type="gramStart"/>
+            <w:r>
+              <w:rPr>
+                <w:iCs/>
+              </w:rPr>
+              <w:t>takes into account</w:t>
+            </w:r>
+            <w:proofErr w:type="gramEnd"/>
+            <w:r>
+              <w:rPr>
+                <w:iCs/>
+              </w:rPr>
+              <w:t xml:space="preserve"> all factors, so it can properly adjust what action the Sim needs to take. For example, if hunger is empty, but bladder is near full, the Sim will get food before using the restroom. Or if their fun meter is empty, they may decide to do something fun before eating.</w:t>
             </w:r>
           </w:p>
         </w:tc>
@@ -3276,7 +3440,21 @@
               <w:rPr>
                 <w:iCs/>
               </w:rPr>
-              <w:t>The algorithm always chooses the node with the lowest f-cost to explore next, and continues to do so until it reaches the goal / end point, then it traces back through the nodes to create the shortest path.</w:t>
+              <w:t xml:space="preserve">The algorithm always chooses the node with the lowest f-cost to explore </w:t>
+            </w:r>
+            <w:proofErr w:type="gramStart"/>
+            <w:r>
+              <w:rPr>
+                <w:iCs/>
+              </w:rPr>
+              <w:t>next, and</w:t>
+            </w:r>
+            <w:proofErr w:type="gramEnd"/>
+            <w:r>
+              <w:rPr>
+                <w:iCs/>
+              </w:rPr>
+              <w:t xml:space="preserve"> continues to do so until it reaches the goal / end point, then it traces back through the nodes to create the shortest path.</w:t>
             </w:r>
           </w:p>
         </w:tc>
@@ -3612,6 +3790,7 @@
               <w:t xml:space="preserve">can move into the path chosen, requiring the NPC to stop and re-evaluate </w:t>
             </w:r>
             <w:proofErr w:type="spellStart"/>
+            <w:proofErr w:type="gramStart"/>
             <w:r>
               <w:rPr>
                 <w:iCs/>
@@ -3619,6 +3798,7 @@
               <w:t>it’s</w:t>
             </w:r>
             <w:proofErr w:type="spellEnd"/>
+            <w:proofErr w:type="gramEnd"/>
             <w:r>
               <w:rPr>
                 <w:iCs/>
@@ -3770,7 +3950,7 @@
               </w:rPr>
               <w:t xml:space="preserve">Source: </w:t>
             </w:r>
-            <w:hyperlink r:id="rId12" w:history="1">
+            <w:hyperlink r:id="rId12" w:anchor="History" w:history="1">
               <w:r>
                 <w:rPr>
                   <w:rStyle w:val="Hyperlink"/>
@@ -4013,7 +4193,21 @@
               <w:rPr>
                 <w:iCs/>
               </w:rPr>
-              <w:t xml:space="preserve">n. It creates a connected convex polygons over these areas, ensuring that every point inside a polygon is </w:t>
+              <w:t xml:space="preserve">n. It creates a </w:t>
+            </w:r>
+            <w:proofErr w:type="gramStart"/>
+            <w:r>
+              <w:rPr>
+                <w:iCs/>
+              </w:rPr>
+              <w:t>connected convex polygons</w:t>
+            </w:r>
+            <w:proofErr w:type="gramEnd"/>
+            <w:r>
+              <w:rPr>
+                <w:iCs/>
+              </w:rPr>
+              <w:t xml:space="preserve"> over these areas, ensuring that every point inside a polygon is </w:t>
             </w:r>
             <w:r>
               <w:rPr>
@@ -4806,7 +5000,7 @@
               </w:rPr>
               <w:t xml:space="preserve">Source: </w:t>
             </w:r>
-            <w:hyperlink r:id="rId13" w:history="1">
+            <w:hyperlink r:id="rId13" w:anchor="History" w:history="1">
               <w:r>
                 <w:rPr>
                   <w:rStyle w:val="Hyperlink"/>
@@ -4962,7 +5156,21 @@
         <w:rPr>
           <w:iCs/>
         </w:rPr>
-        <w:t>Game Engines are complex and multi-faceted pieces of software with a large number of moving parts and systems. For this part of the assignment, you will need to research how a game engine is put together, identify what the common components of a game engine are, and explain what they each do.</w:t>
+        <w:t xml:space="preserve">Game Engines are complex and multi-faceted pieces of software with </w:t>
+      </w:r>
+      <w:proofErr w:type="gramStart"/>
+      <w:r>
+        <w:rPr>
+          <w:iCs/>
+        </w:rPr>
+        <w:t>a large number of</w:t>
+      </w:r>
+      <w:proofErr w:type="gramEnd"/>
+      <w:r>
+        <w:rPr>
+          <w:iCs/>
+        </w:rPr>
+        <w:t xml:space="preserve"> moving parts and systems. For this part of the assignment, you will need to research how a game engine is put together, identify what the common components of a game engine are, and explain what they each do.</w:t>
       </w:r>
     </w:p>
     <w:p>
@@ -6111,7 +6319,21 @@
               <w:rPr>
                 <w:iCs/>
               </w:rPr>
-              <w:t>Less built in support for high end graphics and large projects</w:t>
+              <w:t xml:space="preserve">Less </w:t>
+            </w:r>
+            <w:proofErr w:type="gramStart"/>
+            <w:r>
+              <w:rPr>
+                <w:iCs/>
+              </w:rPr>
+              <w:t>built in</w:t>
+            </w:r>
+            <w:proofErr w:type="gramEnd"/>
+            <w:r>
+              <w:rPr>
+                <w:iCs/>
+              </w:rPr>
+              <w:t xml:space="preserve"> support for high end graphics and large projects</w:t>
             </w:r>
           </w:p>
           <w:p>
@@ -6230,32 +6452,13 @@
           <w:iCs/>
         </w:rPr>
       </w:pPr>
-    </w:p>
-    <w:p>
-      <w:pPr>
-        <w:spacing w:line="240" w:lineRule="auto"/>
-        <w:rPr>
-          <w:b/>
-          <w:bCs w:val="0"/>
-          <w:iCs/>
-        </w:rPr>
-      </w:pPr>
-    </w:p>
-    <w:p>
-      <w:pPr>
-        <w:spacing w:line="240" w:lineRule="auto"/>
-        <w:rPr>
-          <w:b/>
-          <w:bCs w:val="0"/>
-          <w:iCs/>
-        </w:rPr>
-      </w:pPr>
-      <w:r>
-        <w:rPr>
-          <w:b/>
-          <w:bCs w:val="0"/>
-          <w:iCs/>
-        </w:rPr>
+      <w:r>
+        <w:rPr>
+          <w:b/>
+          <w:bCs w:val="0"/>
+          <w:iCs/>
+        </w:rPr>
+        <w:lastRenderedPageBreak/>
         <w:t>3</w:t>
       </w:r>
       <w:r>
@@ -6264,7 +6467,25 @@
           <w:bCs w:val="0"/>
           <w:iCs/>
         </w:rPr>
-        <w:t>. Open Source Development</w:t>
+        <w:t xml:space="preserve">. </w:t>
+      </w:r>
+      <w:proofErr w:type="gramStart"/>
+      <w:r>
+        <w:rPr>
+          <w:b/>
+          <w:bCs w:val="0"/>
+          <w:iCs/>
+        </w:rPr>
+        <w:t>Open Source</w:t>
+      </w:r>
+      <w:proofErr w:type="gramEnd"/>
+      <w:r>
+        <w:rPr>
+          <w:b/>
+          <w:bCs w:val="0"/>
+          <w:iCs/>
+        </w:rPr>
+        <w:t xml:space="preserve"> Development</w:t>
       </w:r>
       <w:r>
         <w:rPr>
@@ -6294,7 +6515,21 @@
         <w:rPr>
           <w:iCs/>
         </w:rPr>
-        <w:t>In modern development, more and more open-source development tools are being created for the development of software and games</w:t>
+        <w:t xml:space="preserve">In modern development, </w:t>
+      </w:r>
+      <w:proofErr w:type="gramStart"/>
+      <w:r>
+        <w:rPr>
+          <w:iCs/>
+        </w:rPr>
+        <w:t>more and more</w:t>
+      </w:r>
+      <w:proofErr w:type="gramEnd"/>
+      <w:r>
+        <w:rPr>
+          <w:iCs/>
+        </w:rPr>
+        <w:t xml:space="preserve"> open-source development tools are being created for the development of software and games</w:t>
       </w:r>
     </w:p>
     <w:p>
@@ -6340,26 +6575,12 @@
                 <w:iCs/>
               </w:rPr>
             </w:pPr>
-          </w:p>
-          <w:p>
-            <w:pPr>
-              <w:pStyle w:val="ListParagraph"/>
-              <w:spacing w:line="240" w:lineRule="auto"/>
-              <w:ind w:left="0"/>
-              <w:rPr>
-                <w:iCs/>
-              </w:rPr>
-            </w:pPr>
-          </w:p>
-          <w:p>
-            <w:pPr>
-              <w:pStyle w:val="ListParagraph"/>
-              <w:spacing w:line="240" w:lineRule="auto"/>
-              <w:ind w:left="0"/>
-              <w:rPr>
-                <w:iCs/>
-              </w:rPr>
-            </w:pPr>
+            <w:r>
+              <w:rPr>
+                <w:iCs/>
+              </w:rPr>
+              <w:t>Open-source in this context means the source code of a program or game is publicly available and free for anyone to view, modify and possibly distribute with the right attributions according to the open-source license (like an MIT license, for example).</w:t>
+            </w:r>
           </w:p>
         </w:tc>
       </w:tr>
@@ -6389,7 +6610,21 @@
         <w:rPr>
           <w:iCs/>
         </w:rPr>
-        <w:t>Choose one example of an open-source game engine and provide a brief description of what it is and what it’s capabilities are</w:t>
+        <w:t xml:space="preserve">Choose one example of an open-source game engine and provide a brief description of what it is and what </w:t>
+      </w:r>
+      <w:proofErr w:type="gramStart"/>
+      <w:r>
+        <w:rPr>
+          <w:iCs/>
+        </w:rPr>
+        <w:t>it’s</w:t>
+      </w:r>
+      <w:proofErr w:type="gramEnd"/>
+      <w:r>
+        <w:rPr>
+          <w:iCs/>
+        </w:rPr>
+        <w:t xml:space="preserve"> capabilities are</w:t>
       </w:r>
       <w:r>
         <w:rPr>
@@ -6436,26 +6671,74 @@
                 <w:iCs/>
               </w:rPr>
             </w:pPr>
-          </w:p>
-          <w:p>
-            <w:pPr>
-              <w:pStyle w:val="ListParagraph"/>
-              <w:spacing w:line="240" w:lineRule="auto"/>
-              <w:ind w:left="0"/>
-              <w:rPr>
-                <w:iCs/>
-              </w:rPr>
-            </w:pPr>
-          </w:p>
-          <w:p>
-            <w:pPr>
-              <w:pStyle w:val="ListParagraph"/>
-              <w:spacing w:line="240" w:lineRule="auto"/>
-              <w:ind w:left="0"/>
-              <w:rPr>
-                <w:iCs/>
-              </w:rPr>
-            </w:pPr>
+            <w:r>
+              <w:rPr>
+                <w:iCs/>
+              </w:rPr>
+              <w:t xml:space="preserve">Godot is an open-source game engine. It can be used to create 2D and 3D games and provides a complete set of tools to build a game, such as a </w:t>
+            </w:r>
+            <w:proofErr w:type="gramStart"/>
+            <w:r>
+              <w:rPr>
+                <w:iCs/>
+              </w:rPr>
+              <w:t>scene based</w:t>
+            </w:r>
+            <w:proofErr w:type="gramEnd"/>
+            <w:r>
+              <w:rPr>
+                <w:iCs/>
+              </w:rPr>
+              <w:t xml:space="preserve"> editor, animation system, physics engine</w:t>
+            </w:r>
+            <w:r>
+              <w:rPr>
+                <w:iCs/>
+              </w:rPr>
+              <w:t xml:space="preserve"> </w:t>
+            </w:r>
+            <w:proofErr w:type="gramStart"/>
+            <w:r>
+              <w:rPr>
+                <w:iCs/>
+              </w:rPr>
+              <w:t>and also</w:t>
+            </w:r>
+            <w:proofErr w:type="gramEnd"/>
+            <w:r>
+              <w:rPr>
+                <w:iCs/>
+              </w:rPr>
+              <w:t xml:space="preserve"> supports cross platform exporting to Windows, Mac, Linux, Android, iOS and even web platforms. Scripting in Godot can done in </w:t>
+            </w:r>
+            <w:proofErr w:type="gramStart"/>
+            <w:r>
+              <w:rPr>
+                <w:iCs/>
+              </w:rPr>
+              <w:t>it’s</w:t>
+            </w:r>
+            <w:proofErr w:type="gramEnd"/>
+            <w:r>
+              <w:rPr>
+                <w:iCs/>
+              </w:rPr>
+              <w:t xml:space="preserve"> own language, </w:t>
+            </w:r>
+            <w:proofErr w:type="spellStart"/>
+            <w:r>
+              <w:rPr>
+                <w:iCs/>
+              </w:rPr>
+              <w:t>GDScript</w:t>
+            </w:r>
+            <w:proofErr w:type="spellEnd"/>
+            <w:r>
+              <w:rPr>
+                <w:iCs/>
+              </w:rPr>
+              <w:t xml:space="preserve"> or C# / C++, with the developer being able to access and modify the engines source code.</w:t>
+            </w:r>
           </w:p>
         </w:tc>
       </w:tr>
@@ -6639,31 +6922,7 @@
           <w:bCs w:val="0"/>
           <w:iCs/>
         </w:rPr>
-        <w:t>[</w:t>
-      </w:r>
-      <w:r>
-        <w:rPr>
-          <w:b/>
-          <w:bCs w:val="0"/>
-          <w:iCs/>
-        </w:rPr>
-        <w:t xml:space="preserve">Platform </w:t>
-      </w:r>
-      <w:r>
-        <w:rPr>
-          <w:b/>
-          <w:bCs w:val="0"/>
-          <w:iCs/>
-        </w:rPr>
-        <w:t>Name</w:t>
-      </w:r>
-      <w:r>
-        <w:rPr>
-          <w:b/>
-          <w:bCs w:val="0"/>
-          <w:iCs/>
-        </w:rPr>
-        <w:t>]</w:t>
+        <w:t>PC (Windows)</w:t>
       </w:r>
     </w:p>
     <w:tbl>
@@ -6690,6 +6949,59 @@
                 <w:iCs/>
               </w:rPr>
             </w:pPr>
+            <w:r>
+              <w:rPr>
+                <w:noProof/>
+              </w:rPr>
+              <w:drawing>
+                <wp:inline distT="0" distB="0" distL="0" distR="0" wp14:anchorId="3C39B328" wp14:editId="1480EB98">
+                  <wp:extent cx="991590" cy="991590"/>
+                  <wp:effectExtent l="0" t="0" r="0" b="0"/>
+                  <wp:docPr id="1569473037" name="Picture 1" descr="Wireless Gaming Keyboard and Mouse Combo,2.4G Type C/USB Dual Receiver,Full  Size Chroma RGB Backlit,Rechargeable 4200mAh,Silent Mice,Mousepad for ..."/>
+                  <wp:cNvGraphicFramePr>
+                    <a:graphicFrameLocks xmlns:a="http://schemas.openxmlformats.org/drawingml/2006/main" noChangeAspect="1"/>
+                  </wp:cNvGraphicFramePr>
+                  <a:graphic xmlns:a="http://schemas.openxmlformats.org/drawingml/2006/main">
+                    <a:graphicData uri="http://schemas.openxmlformats.org/drawingml/2006/picture">
+                      <pic:pic xmlns:pic="http://schemas.openxmlformats.org/drawingml/2006/picture">
+                        <pic:nvPicPr>
+                          <pic:cNvPr id="0" name="Picture 1" descr="Wireless Gaming Keyboard and Mouse Combo,2.4G Type C/USB Dual Receiver,Full  Size Chroma RGB Backlit,Rechargeable 4200mAh,Silent Mice,Mousepad for ..."/>
+                          <pic:cNvPicPr>
+                            <a:picLocks noChangeAspect="1" noChangeArrowheads="1"/>
+                          </pic:cNvPicPr>
+                        </pic:nvPicPr>
+                        <pic:blipFill>
+                          <a:blip r:embed="rId14" cstate="print">
+                            <a:extLst>
+                              <a:ext uri="{28A0092B-C50C-407E-A947-70E740481C1C}">
+                                <a14:useLocalDpi xmlns:a14="http://schemas.microsoft.com/office/drawing/2010/main" val="0"/>
+                              </a:ext>
+                            </a:extLst>
+                          </a:blip>
+                          <a:srcRect/>
+                          <a:stretch>
+                            <a:fillRect/>
+                          </a:stretch>
+                        </pic:blipFill>
+                        <pic:spPr bwMode="auto">
+                          <a:xfrm>
+                            <a:off x="0" y="0"/>
+                            <a:ext cx="998399" cy="998399"/>
+                          </a:xfrm>
+                          <a:prstGeom prst="rect">
+                            <a:avLst/>
+                          </a:prstGeom>
+                          <a:noFill/>
+                          <a:ln>
+                            <a:noFill/>
+                          </a:ln>
+                        </pic:spPr>
+                      </pic:pic>
+                    </a:graphicData>
+                  </a:graphic>
+                </wp:inline>
+              </w:drawing>
+            </w:r>
           </w:p>
         </w:tc>
       </w:tr>
@@ -6721,39 +7033,7 @@
           <w:bCs w:val="0"/>
           <w:iCs/>
         </w:rPr>
-        <w:t>[</w:t>
-      </w:r>
-      <w:r>
-        <w:rPr>
-          <w:b/>
-          <w:bCs w:val="0"/>
-          <w:iCs/>
-        </w:rPr>
-        <w:t>Input Scheme</w:t>
-      </w:r>
-      <w:r>
-        <w:rPr>
-          <w:b/>
-          <w:bCs w:val="0"/>
-          <w:iCs/>
-        </w:rPr>
-        <w:t xml:space="preserve"> Name</w:t>
-      </w:r>
-      <w:r>
-        <w:rPr>
-          <w:b/>
-          <w:bCs w:val="0"/>
-          <w:iCs/>
-        </w:rPr>
-        <w:t xml:space="preserve"> and Layout</w:t>
-      </w:r>
-      <w:r>
-        <w:rPr>
-          <w:b/>
-          <w:bCs w:val="0"/>
-          <w:iCs/>
-        </w:rPr>
-        <w:t>]</w:t>
+        <w:t>Keyboard and Mouse</w:t>
       </w:r>
     </w:p>
     <w:tbl>
@@ -6780,10 +7060,226 @@
                 <w:iCs/>
               </w:rPr>
             </w:pPr>
+            <w:r>
+              <w:rPr>
+                <w:iCs/>
+              </w:rPr>
+              <w:t xml:space="preserve">On PC, games are usually controlled </w:t>
+            </w:r>
+            <w:r>
+              <w:rPr>
+                <w:iCs/>
+              </w:rPr>
+              <w:t>by</w:t>
+            </w:r>
+            <w:r>
+              <w:rPr>
+                <w:iCs/>
+              </w:rPr>
+              <w:t xml:space="preserve"> using a keyboard and mouse. Various games use different control schemes and layouts, some games use WASD for movement and the mouse for changing the camera </w:t>
+            </w:r>
+            <w:proofErr w:type="gramStart"/>
+            <w:r>
+              <w:rPr>
+                <w:iCs/>
+              </w:rPr>
+              <w:t>view point</w:t>
+            </w:r>
+            <w:proofErr w:type="gramEnd"/>
+            <w:r>
+              <w:rPr>
+                <w:iCs/>
+              </w:rPr>
+              <w:t>, where others can use the mouse for movement and the keyboard for other tasks, like choosing power ups.</w:t>
+            </w:r>
+          </w:p>
+          <w:p>
+            <w:pPr>
+              <w:pStyle w:val="ListParagraph"/>
+              <w:spacing w:line="240" w:lineRule="auto"/>
+              <w:ind w:left="0"/>
+              <w:rPr>
+                <w:iCs/>
+              </w:rPr>
+            </w:pPr>
+          </w:p>
+          <w:p>
+            <w:pPr>
+              <w:pStyle w:val="ListParagraph"/>
+              <w:spacing w:line="240" w:lineRule="auto"/>
+              <w:ind w:left="0"/>
+              <w:rPr>
+                <w:iCs/>
+              </w:rPr>
+            </w:pPr>
+            <w:r>
+              <w:rPr>
+                <w:iCs/>
+              </w:rPr>
+              <w:t xml:space="preserve">This input scheme allows for very high precision, especially in first person shooter games, or high actions per minute in strategy games, but also offers versatility in less </w:t>
+            </w:r>
+            <w:proofErr w:type="gramStart"/>
+            <w:r>
+              <w:rPr>
+                <w:iCs/>
+              </w:rPr>
+              <w:t>action packed</w:t>
+            </w:r>
+            <w:proofErr w:type="gramEnd"/>
+            <w:r>
+              <w:rPr>
+                <w:iCs/>
+              </w:rPr>
+              <w:t xml:space="preserve"> games, like flight simulators. Because the player has many keys at their literal fingertips, developers can map </w:t>
+            </w:r>
+            <w:proofErr w:type="gramStart"/>
+            <w:r>
+              <w:rPr>
+                <w:iCs/>
+              </w:rPr>
+              <w:t>a large number of</w:t>
+            </w:r>
+            <w:proofErr w:type="gramEnd"/>
+            <w:r>
+              <w:rPr>
+                <w:iCs/>
+              </w:rPr>
+              <w:t xml:space="preserve"> actions without needing to worry about combo button presses or going into menus and changing control layouts.</w:t>
+            </w:r>
           </w:p>
         </w:tc>
       </w:tr>
     </w:tbl>
+    <w:p>
+      <w:pPr>
+        <w:pStyle w:val="ListParagraph"/>
+        <w:spacing w:line="240" w:lineRule="auto"/>
+        <w:ind w:left="1080"/>
+        <w:rPr>
+          <w:iCs/>
+        </w:rPr>
+      </w:pPr>
+    </w:p>
+    <w:p>
+      <w:pPr>
+        <w:pStyle w:val="ListParagraph"/>
+        <w:spacing w:line="240" w:lineRule="auto"/>
+        <w:ind w:left="1080"/>
+        <w:rPr>
+          <w:iCs/>
+        </w:rPr>
+      </w:pPr>
+    </w:p>
+    <w:p>
+      <w:pPr>
+        <w:pStyle w:val="ListParagraph"/>
+        <w:spacing w:line="240" w:lineRule="auto"/>
+        <w:ind w:left="1080"/>
+        <w:rPr>
+          <w:iCs/>
+        </w:rPr>
+      </w:pPr>
+    </w:p>
+    <w:p>
+      <w:pPr>
+        <w:pStyle w:val="ListParagraph"/>
+        <w:spacing w:line="240" w:lineRule="auto"/>
+        <w:ind w:left="1080"/>
+        <w:rPr>
+          <w:iCs/>
+        </w:rPr>
+      </w:pPr>
+    </w:p>
+    <w:p>
+      <w:pPr>
+        <w:pStyle w:val="ListParagraph"/>
+        <w:spacing w:line="240" w:lineRule="auto"/>
+        <w:ind w:left="1080"/>
+        <w:rPr>
+          <w:iCs/>
+        </w:rPr>
+      </w:pPr>
+    </w:p>
+    <w:p>
+      <w:pPr>
+        <w:pStyle w:val="ListParagraph"/>
+        <w:spacing w:line="240" w:lineRule="auto"/>
+        <w:ind w:left="1080"/>
+        <w:rPr>
+          <w:iCs/>
+        </w:rPr>
+      </w:pPr>
+    </w:p>
+    <w:p>
+      <w:pPr>
+        <w:pStyle w:val="ListParagraph"/>
+        <w:spacing w:line="240" w:lineRule="auto"/>
+        <w:ind w:left="1080"/>
+        <w:rPr>
+          <w:iCs/>
+        </w:rPr>
+      </w:pPr>
+    </w:p>
+    <w:p>
+      <w:pPr>
+        <w:pStyle w:val="ListParagraph"/>
+        <w:spacing w:line="240" w:lineRule="auto"/>
+        <w:ind w:left="1080"/>
+        <w:rPr>
+          <w:iCs/>
+        </w:rPr>
+      </w:pPr>
+    </w:p>
+    <w:p>
+      <w:pPr>
+        <w:pStyle w:val="ListParagraph"/>
+        <w:spacing w:line="240" w:lineRule="auto"/>
+        <w:ind w:left="1080"/>
+        <w:rPr>
+          <w:iCs/>
+        </w:rPr>
+      </w:pPr>
+    </w:p>
+    <w:p>
+      <w:pPr>
+        <w:pStyle w:val="ListParagraph"/>
+        <w:spacing w:line="240" w:lineRule="auto"/>
+        <w:ind w:left="1080"/>
+        <w:rPr>
+          <w:iCs/>
+        </w:rPr>
+      </w:pPr>
+    </w:p>
+    <w:p>
+      <w:pPr>
+        <w:pStyle w:val="ListParagraph"/>
+        <w:spacing w:line="240" w:lineRule="auto"/>
+        <w:ind w:left="1080"/>
+        <w:rPr>
+          <w:iCs/>
+        </w:rPr>
+      </w:pPr>
+    </w:p>
+    <w:p>
+      <w:pPr>
+        <w:pStyle w:val="ListParagraph"/>
+        <w:spacing w:line="240" w:lineRule="auto"/>
+        <w:ind w:left="1080"/>
+        <w:rPr>
+          <w:iCs/>
+        </w:rPr>
+      </w:pPr>
+    </w:p>
+    <w:p>
+      <w:pPr>
+        <w:pStyle w:val="ListParagraph"/>
+        <w:spacing w:line="240" w:lineRule="auto"/>
+        <w:ind w:left="1080"/>
+        <w:rPr>
+          <w:iCs/>
+        </w:rPr>
+      </w:pPr>
+    </w:p>
     <w:p>
       <w:pPr>
         <w:pStyle w:val="ListParagraph"/>
@@ -6814,15 +7310,8 @@
           <w:bCs w:val="0"/>
           <w:iCs/>
         </w:rPr>
-        <w:t>[</w:t>
-      </w:r>
-      <w:r>
-        <w:rPr>
-          <w:b/>
-          <w:bCs w:val="0"/>
-          <w:iCs/>
-        </w:rPr>
-        <w:t>Platform Name]</w:t>
+        <w:lastRenderedPageBreak/>
+        <w:t>Console (PlayStation 5)</w:t>
       </w:r>
     </w:p>
     <w:tbl>
@@ -6849,6 +7338,46 @@
                 <w:iCs/>
               </w:rPr>
             </w:pPr>
+            <w:r>
+              <w:rPr>
+                <w:noProof/>
+              </w:rPr>
+              <w:drawing>
+                <wp:inline distT="0" distB="0" distL="0" distR="0" wp14:anchorId="75E321F2" wp14:editId="03D86B73">
+                  <wp:extent cx="1904031" cy="1052591"/>
+                  <wp:effectExtent l="0" t="0" r="1270" b="0"/>
+                  <wp:docPr id="1630984616" name="Picture 1"/>
+                  <wp:cNvGraphicFramePr>
+                    <a:graphicFrameLocks xmlns:a="http://schemas.openxmlformats.org/drawingml/2006/main" noChangeAspect="1"/>
+                  </wp:cNvGraphicFramePr>
+                  <a:graphic xmlns:a="http://schemas.openxmlformats.org/drawingml/2006/main">
+                    <a:graphicData uri="http://schemas.openxmlformats.org/drawingml/2006/picture">
+                      <pic:pic xmlns:pic="http://schemas.openxmlformats.org/drawingml/2006/picture">
+                        <pic:nvPicPr>
+                          <pic:cNvPr id="1630984616" name=""/>
+                          <pic:cNvPicPr/>
+                        </pic:nvPicPr>
+                        <pic:blipFill>
+                          <a:blip r:embed="rId15"/>
+                          <a:stretch>
+                            <a:fillRect/>
+                          </a:stretch>
+                        </pic:blipFill>
+                        <pic:spPr>
+                          <a:xfrm>
+                            <a:off x="0" y="0"/>
+                            <a:ext cx="1923010" cy="1063083"/>
+                          </a:xfrm>
+                          <a:prstGeom prst="rect">
+                            <a:avLst/>
+                          </a:prstGeom>
+                        </pic:spPr>
+                      </pic:pic>
+                    </a:graphicData>
+                  </a:graphic>
+                </wp:inline>
+              </w:drawing>
+            </w:r>
           </w:p>
         </w:tc>
       </w:tr>
@@ -6880,15 +7409,25 @@
           <w:bCs w:val="0"/>
           <w:iCs/>
         </w:rPr>
-        <w:t>[</w:t>
-      </w:r>
-      <w:r>
-        <w:rPr>
-          <w:b/>
-          <w:bCs w:val="0"/>
-          <w:iCs/>
-        </w:rPr>
-        <w:t>Input Scheme Name and Layout]</w:t>
+        <w:t>Game Controller (</w:t>
+      </w:r>
+      <w:proofErr w:type="spellStart"/>
+      <w:r>
+        <w:rPr>
+          <w:b/>
+          <w:bCs w:val="0"/>
+          <w:iCs/>
+        </w:rPr>
+        <w:t>DualSense</w:t>
+      </w:r>
+      <w:proofErr w:type="spellEnd"/>
+      <w:r>
+        <w:rPr>
+          <w:b/>
+          <w:bCs w:val="0"/>
+          <w:iCs/>
+        </w:rPr>
+        <w:t>)</w:t>
       </w:r>
     </w:p>
     <w:tbl>
@@ -6915,10 +7454,256 @@
                 <w:iCs/>
               </w:rPr>
             </w:pPr>
+            <w:r>
+              <w:rPr>
+                <w:iCs/>
+              </w:rPr>
+              <w:t xml:space="preserve">The PlayStation 5 controller is a handheld device with analogue sticks, face buttons, rear triggers and shoulder buttons. </w:t>
+            </w:r>
+            <w:r>
+              <w:rPr>
+                <w:iCs/>
+              </w:rPr>
+              <w:t xml:space="preserve">Compared to a keyboard and mouse combo, controllers offer less precision but provide a more comfortable standardised input method for players. This can impact game design as it encourages developers to stick to the “what users are most use to” type of button layout. But it does allow a single button to do more than 1 task, given the situation in game. </w:t>
+            </w:r>
+            <w:proofErr w:type="gramStart"/>
+            <w:r>
+              <w:rPr>
+                <w:iCs/>
+              </w:rPr>
+              <w:t>Other advantages of a controller,</w:t>
+            </w:r>
+            <w:proofErr w:type="gramEnd"/>
+            <w:r>
+              <w:rPr>
+                <w:iCs/>
+              </w:rPr>
+              <w:t xml:space="preserve"> is haptic feedback and adaptive touch on the rear of the controller. These can make the player feel like they are part of the game, by feeling their controller shake in their hands as their driving a race car, or picking a lock using the adaptive touch panel, these features can really add to the players immersion. </w:t>
+            </w:r>
           </w:p>
         </w:tc>
       </w:tr>
     </w:tbl>
+    <w:p>
+      <w:pPr>
+        <w:pStyle w:val="ListParagraph"/>
+        <w:spacing w:line="240" w:lineRule="auto"/>
+        <w:ind w:left="1080"/>
+        <w:rPr>
+          <w:iCs/>
+        </w:rPr>
+      </w:pPr>
+    </w:p>
+    <w:p>
+      <w:pPr>
+        <w:pStyle w:val="ListParagraph"/>
+        <w:spacing w:line="240" w:lineRule="auto"/>
+        <w:ind w:left="1080"/>
+        <w:rPr>
+          <w:iCs/>
+        </w:rPr>
+      </w:pPr>
+    </w:p>
+    <w:p>
+      <w:pPr>
+        <w:pStyle w:val="ListParagraph"/>
+        <w:spacing w:line="240" w:lineRule="auto"/>
+        <w:ind w:left="1080"/>
+        <w:rPr>
+          <w:iCs/>
+        </w:rPr>
+      </w:pPr>
+    </w:p>
+    <w:p>
+      <w:pPr>
+        <w:pStyle w:val="ListParagraph"/>
+        <w:spacing w:line="240" w:lineRule="auto"/>
+        <w:ind w:left="1080"/>
+        <w:rPr>
+          <w:iCs/>
+        </w:rPr>
+      </w:pPr>
+    </w:p>
+    <w:p>
+      <w:pPr>
+        <w:pStyle w:val="ListParagraph"/>
+        <w:spacing w:line="240" w:lineRule="auto"/>
+        <w:ind w:left="1080"/>
+        <w:rPr>
+          <w:iCs/>
+        </w:rPr>
+      </w:pPr>
+    </w:p>
+    <w:p>
+      <w:pPr>
+        <w:pStyle w:val="ListParagraph"/>
+        <w:spacing w:line="240" w:lineRule="auto"/>
+        <w:ind w:left="1080"/>
+        <w:rPr>
+          <w:iCs/>
+        </w:rPr>
+      </w:pPr>
+    </w:p>
+    <w:p>
+      <w:pPr>
+        <w:pStyle w:val="ListParagraph"/>
+        <w:spacing w:line="240" w:lineRule="auto"/>
+        <w:ind w:left="1080"/>
+        <w:rPr>
+          <w:iCs/>
+        </w:rPr>
+      </w:pPr>
+    </w:p>
+    <w:p>
+      <w:pPr>
+        <w:pStyle w:val="ListParagraph"/>
+        <w:spacing w:line="240" w:lineRule="auto"/>
+        <w:ind w:left="1080"/>
+        <w:rPr>
+          <w:iCs/>
+        </w:rPr>
+      </w:pPr>
+    </w:p>
+    <w:p>
+      <w:pPr>
+        <w:pStyle w:val="ListParagraph"/>
+        <w:spacing w:line="240" w:lineRule="auto"/>
+        <w:ind w:left="1080"/>
+        <w:rPr>
+          <w:iCs/>
+        </w:rPr>
+      </w:pPr>
+    </w:p>
+    <w:p>
+      <w:pPr>
+        <w:pStyle w:val="ListParagraph"/>
+        <w:spacing w:line="240" w:lineRule="auto"/>
+        <w:ind w:left="1080"/>
+        <w:rPr>
+          <w:iCs/>
+        </w:rPr>
+      </w:pPr>
+    </w:p>
+    <w:p>
+      <w:pPr>
+        <w:pStyle w:val="ListParagraph"/>
+        <w:spacing w:line="240" w:lineRule="auto"/>
+        <w:ind w:left="1080"/>
+        <w:rPr>
+          <w:iCs/>
+        </w:rPr>
+      </w:pPr>
+    </w:p>
+    <w:p>
+      <w:pPr>
+        <w:pStyle w:val="ListParagraph"/>
+        <w:spacing w:line="240" w:lineRule="auto"/>
+        <w:ind w:left="1080"/>
+        <w:rPr>
+          <w:iCs/>
+        </w:rPr>
+      </w:pPr>
+    </w:p>
+    <w:p>
+      <w:pPr>
+        <w:pStyle w:val="ListParagraph"/>
+        <w:spacing w:line="240" w:lineRule="auto"/>
+        <w:ind w:left="1080"/>
+        <w:rPr>
+          <w:iCs/>
+        </w:rPr>
+      </w:pPr>
+    </w:p>
+    <w:p>
+      <w:pPr>
+        <w:pStyle w:val="ListParagraph"/>
+        <w:spacing w:line="240" w:lineRule="auto"/>
+        <w:ind w:left="1080"/>
+        <w:rPr>
+          <w:iCs/>
+        </w:rPr>
+      </w:pPr>
+    </w:p>
+    <w:p>
+      <w:pPr>
+        <w:pStyle w:val="ListParagraph"/>
+        <w:spacing w:line="240" w:lineRule="auto"/>
+        <w:ind w:left="1080"/>
+        <w:rPr>
+          <w:iCs/>
+        </w:rPr>
+      </w:pPr>
+    </w:p>
+    <w:p>
+      <w:pPr>
+        <w:pStyle w:val="ListParagraph"/>
+        <w:spacing w:line="240" w:lineRule="auto"/>
+        <w:ind w:left="1080"/>
+        <w:rPr>
+          <w:iCs/>
+        </w:rPr>
+      </w:pPr>
+    </w:p>
+    <w:p>
+      <w:pPr>
+        <w:pStyle w:val="ListParagraph"/>
+        <w:spacing w:line="240" w:lineRule="auto"/>
+        <w:ind w:left="1080"/>
+        <w:rPr>
+          <w:iCs/>
+        </w:rPr>
+      </w:pPr>
+    </w:p>
+    <w:p>
+      <w:pPr>
+        <w:pStyle w:val="ListParagraph"/>
+        <w:spacing w:line="240" w:lineRule="auto"/>
+        <w:ind w:left="1080"/>
+        <w:rPr>
+          <w:iCs/>
+        </w:rPr>
+      </w:pPr>
+    </w:p>
+    <w:p>
+      <w:pPr>
+        <w:pStyle w:val="ListParagraph"/>
+        <w:spacing w:line="240" w:lineRule="auto"/>
+        <w:ind w:left="1080"/>
+        <w:rPr>
+          <w:iCs/>
+        </w:rPr>
+      </w:pPr>
+    </w:p>
+    <w:p>
+      <w:pPr>
+        <w:pStyle w:val="ListParagraph"/>
+        <w:spacing w:line="240" w:lineRule="auto"/>
+        <w:ind w:left="1080"/>
+        <w:rPr>
+          <w:iCs/>
+        </w:rPr>
+      </w:pPr>
+    </w:p>
+    <w:p>
+      <w:pPr>
+        <w:pStyle w:val="ListParagraph"/>
+        <w:spacing w:line="240" w:lineRule="auto"/>
+        <w:ind w:left="1080"/>
+        <w:rPr>
+          <w:iCs/>
+        </w:rPr>
+      </w:pPr>
+    </w:p>
+    <w:p>
+      <w:pPr>
+        <w:pStyle w:val="ListParagraph"/>
+        <w:spacing w:line="240" w:lineRule="auto"/>
+        <w:ind w:left="1080"/>
+        <w:rPr>
+          <w:iCs/>
+        </w:rPr>
+      </w:pPr>
+    </w:p>
     <w:p>
       <w:pPr>
         <w:pStyle w:val="ListParagraph"/>
@@ -6949,15 +7734,26 @@
           <w:bCs w:val="0"/>
           <w:iCs/>
         </w:rPr>
-        <w:t>[</w:t>
-      </w:r>
-      <w:r>
-        <w:rPr>
-          <w:b/>
-          <w:bCs w:val="0"/>
-          <w:iCs/>
-        </w:rPr>
-        <w:t>Platform Name]</w:t>
+        <w:lastRenderedPageBreak/>
+        <w:t>Virtual Reality (</w:t>
+      </w:r>
+      <w:proofErr w:type="spellStart"/>
+      <w:r>
+        <w:rPr>
+          <w:b/>
+          <w:bCs w:val="0"/>
+          <w:iCs/>
+        </w:rPr>
+        <w:t>MetaQuest</w:t>
+      </w:r>
+      <w:proofErr w:type="spellEnd"/>
+      <w:r>
+        <w:rPr>
+          <w:b/>
+          <w:bCs w:val="0"/>
+          <w:iCs/>
+        </w:rPr>
+        <w:t xml:space="preserve"> 3)</w:t>
       </w:r>
     </w:p>
     <w:tbl>
@@ -6984,6 +7780,46 @@
                 <w:iCs/>
               </w:rPr>
             </w:pPr>
+            <w:r>
+              <w:rPr>
+                <w:noProof/>
+              </w:rPr>
+              <w:drawing>
+                <wp:inline distT="0" distB="0" distL="0" distR="0" wp14:anchorId="32A38CBC" wp14:editId="176337E5">
+                  <wp:extent cx="1633476" cy="1343999"/>
+                  <wp:effectExtent l="0" t="0" r="5080" b="8890"/>
+                  <wp:docPr id="1509323719" name="Picture 1"/>
+                  <wp:cNvGraphicFramePr>
+                    <a:graphicFrameLocks xmlns:a="http://schemas.openxmlformats.org/drawingml/2006/main" noChangeAspect="1"/>
+                  </wp:cNvGraphicFramePr>
+                  <a:graphic xmlns:a="http://schemas.openxmlformats.org/drawingml/2006/main">
+                    <a:graphicData uri="http://schemas.openxmlformats.org/drawingml/2006/picture">
+                      <pic:pic xmlns:pic="http://schemas.openxmlformats.org/drawingml/2006/picture">
+                        <pic:nvPicPr>
+                          <pic:cNvPr id="1509323719" name=""/>
+                          <pic:cNvPicPr/>
+                        </pic:nvPicPr>
+                        <pic:blipFill>
+                          <a:blip r:embed="rId16"/>
+                          <a:stretch>
+                            <a:fillRect/>
+                          </a:stretch>
+                        </pic:blipFill>
+                        <pic:spPr>
+                          <a:xfrm>
+                            <a:off x="0" y="0"/>
+                            <a:ext cx="1642334" cy="1351287"/>
+                          </a:xfrm>
+                          <a:prstGeom prst="rect">
+                            <a:avLst/>
+                          </a:prstGeom>
+                        </pic:spPr>
+                      </pic:pic>
+                    </a:graphicData>
+                  </a:graphic>
+                </wp:inline>
+              </w:drawing>
+            </w:r>
           </w:p>
         </w:tc>
       </w:tr>
@@ -7015,15 +7851,7 @@
           <w:bCs w:val="0"/>
           <w:iCs/>
         </w:rPr>
-        <w:t>[</w:t>
-      </w:r>
-      <w:r>
-        <w:rPr>
-          <w:b/>
-          <w:bCs w:val="0"/>
-          <w:iCs/>
-        </w:rPr>
-        <w:t>Input Scheme Name and Layout]</w:t>
+        <w:t>Motion / Head tracking and Controllers</w:t>
       </w:r>
     </w:p>
     <w:tbl>
@@ -7050,6 +7878,104 @@
                 <w:iCs/>
               </w:rPr>
             </w:pPr>
+            <w:r>
+              <w:rPr>
+                <w:iCs/>
+              </w:rPr>
+              <w:t>Virtual Reality games can use a wide variety of control schemes. Some headsets don’t even require controllers, and can function with just hand gestures, where others you can wear a full body tracking suit, rolling floor and head tracking gear to mimic real world body movement.</w:t>
+            </w:r>
+          </w:p>
+          <w:p>
+            <w:pPr>
+              <w:pStyle w:val="ListParagraph"/>
+              <w:spacing w:line="240" w:lineRule="auto"/>
+              <w:ind w:left="0"/>
+              <w:rPr>
+                <w:iCs/>
+              </w:rPr>
+            </w:pPr>
+          </w:p>
+          <w:p>
+            <w:pPr>
+              <w:pStyle w:val="ListParagraph"/>
+              <w:spacing w:line="240" w:lineRule="auto"/>
+              <w:ind w:left="0"/>
+              <w:rPr>
+                <w:iCs/>
+              </w:rPr>
+            </w:pPr>
+            <w:r>
+              <w:rPr>
+                <w:iCs/>
+              </w:rPr>
+              <w:t xml:space="preserve">These differ greatly from a standard control input like a keyboard or a console controller, as almost all actions in virtual reality are a physical movement from the user, like slicing a sword to cut fruit. But because of this, game design focuses heavily on immersion and environment interaction, like picking up items in the game world, throwing them or modifying them in </w:t>
+            </w:r>
+            <w:proofErr w:type="spellStart"/>
+            <w:r>
+              <w:rPr>
+                <w:iCs/>
+              </w:rPr>
+              <w:t>someway</w:t>
+            </w:r>
+            <w:proofErr w:type="spellEnd"/>
+            <w:r>
+              <w:rPr>
+                <w:iCs/>
+              </w:rPr>
+              <w:t>, but it isn’t limited to this, first person shooters are also popular in virtual reality, where the player can really feel like a solider being fully immersed.</w:t>
+            </w:r>
+            <w:r>
+              <w:rPr>
+                <w:iCs/>
+              </w:rPr>
+              <w:t xml:space="preserve"> </w:t>
+            </w:r>
+            <w:proofErr w:type="gramStart"/>
+            <w:r>
+              <w:rPr>
+                <w:iCs/>
+              </w:rPr>
+              <w:t>Similar to</w:t>
+            </w:r>
+            <w:proofErr w:type="gramEnd"/>
+            <w:r>
+              <w:rPr>
+                <w:iCs/>
+              </w:rPr>
+              <w:t xml:space="preserve"> the console controller, control scheme is generally kept to a “what the user is most used to” when using the physical virtual reality controllers.</w:t>
+            </w:r>
+          </w:p>
+          <w:p>
+            <w:pPr>
+              <w:pStyle w:val="ListParagraph"/>
+              <w:spacing w:line="240" w:lineRule="auto"/>
+              <w:ind w:left="0"/>
+              <w:rPr>
+                <w:iCs/>
+              </w:rPr>
+            </w:pPr>
+          </w:p>
+          <w:p>
+            <w:pPr>
+              <w:pStyle w:val="ListParagraph"/>
+              <w:spacing w:line="240" w:lineRule="auto"/>
+              <w:ind w:left="0"/>
+              <w:rPr>
+                <w:iCs/>
+              </w:rPr>
+            </w:pPr>
+            <w:r>
+              <w:rPr>
+                <w:iCs/>
+              </w:rPr>
+              <w:t>A downside though, developers need to consider motion sickness</w:t>
+            </w:r>
+            <w:r>
+              <w:rPr>
+                <w:iCs/>
+              </w:rPr>
+              <w:t>, physical play area required, fatigue of the player and fast camera movements.</w:t>
+            </w:r>
           </w:p>
         </w:tc>
       </w:tr>
@@ -7175,13 +8101,29 @@
     </w:p>
     <w:p>
       <w:r>
-        <w:t xml:space="preserve">For this section, please explain what AI and pathfinding systems you have decided to use for this particular project and why. </w:t>
+        <w:t xml:space="preserve">For this section, please explain what AI and pathfinding systems you have decided to use for this </w:t>
+      </w:r>
+      <w:proofErr w:type="gramStart"/>
+      <w:r>
+        <w:t>particular project</w:t>
+      </w:r>
+      <w:proofErr w:type="gramEnd"/>
+      <w:r>
+        <w:t xml:space="preserve"> and why. </w:t>
       </w:r>
     </w:p>
     <w:p/>
     <w:p>
       <w:r>
-        <w:t>Please outline, at a basic level, what the systems are and the basic idea of how they work. Explain why you believe these systems are suited to the particular game systems in the brief referring to the project requirements and limitations</w:t>
+        <w:t xml:space="preserve">Please outline, at a basic level, what the systems are and the basic idea of how they work. Explain why you believe these systems are suited to the </w:t>
+      </w:r>
+      <w:proofErr w:type="gramStart"/>
+      <w:r>
+        <w:t>particular game</w:t>
+      </w:r>
+      <w:proofErr w:type="gramEnd"/>
+      <w:r>
+        <w:t xml:space="preserve"> systems in the brief referring to the project requirements and limitations</w:t>
       </w:r>
       <w:r>
         <w:t>.</w:t>
@@ -7283,6 +8225,9 @@
               <w:pStyle w:val="ListParagraph"/>
               <w:ind w:left="0"/>
             </w:pPr>
+            <w:r>
+              <w:t>GOAP is an AI system where NPC’s plan their actions based on a set of goals and available actions. Each action has preconditions and effects, and the AI dynamically chooses the sequence of actions that will achieve its current goal. This makes behaviour more flexible and realistic as the AI can adapt to changes in the environment rather than following a fixed script.</w:t>
+            </w:r>
           </w:p>
           <w:p>
             <w:pPr>
@@ -7295,6 +8240,17 @@
               <w:pStyle w:val="ListParagraph"/>
               <w:ind w:left="0"/>
             </w:pPr>
+            <w:r>
+              <w:t xml:space="preserve">GOAP is suited to this project because it allows </w:t>
+            </w:r>
+            <w:proofErr w:type="gramStart"/>
+            <w:r>
+              <w:t>NPC’s</w:t>
+            </w:r>
+            <w:proofErr w:type="gramEnd"/>
+            <w:r>
+              <w:t xml:space="preserve"> to make decisions in response to what is required in the world, such as getting more wood, or planting more crops.</w:t>
+            </w:r>
           </w:p>
         </w:tc>
       </w:tr>
@@ -7344,36 +8300,48 @@
               <w:pStyle w:val="ListParagraph"/>
               <w:ind w:left="0"/>
             </w:pPr>
-          </w:p>
-          <w:p>
-            <w:pPr>
-              <w:pStyle w:val="ListParagraph"/>
-              <w:ind w:left="0"/>
-            </w:pPr>
-          </w:p>
-          <w:p>
-            <w:pPr>
-              <w:pStyle w:val="ListParagraph"/>
-              <w:ind w:left="0"/>
-            </w:pPr>
+            <w:r>
+              <w:t xml:space="preserve">Utility AI works by scoring different possible actions based on how “useful” they are in the current situation. The AI then selects the action with the highest score. This system allows for prioritisation between multiple competing behaviours, such as deciding whether an NPC should plant crops, chop wood or </w:t>
+            </w:r>
+            <w:proofErr w:type="gramStart"/>
+            <w:r>
+              <w:t>mine</w:t>
+            </w:r>
+            <w:proofErr w:type="gramEnd"/>
+            <w:r>
+              <w:t xml:space="preserve"> stone.</w:t>
+            </w:r>
+            <w:r>
+              <w:br/>
+            </w:r>
+            <w:r>
+              <w:br/>
+              <w:t>Utility AI is suited to this project because it can handle complex decision making with minimal scripting, which allows for dynamic and responsive NPCs.</w:t>
+            </w:r>
           </w:p>
         </w:tc>
       </w:tr>
     </w:tbl>
     <w:p/>
     <w:p/>
-    <w:p>
-      <w:pPr>
-        <w:rPr>
-          <w:b/>
-          <w:bCs w:val="0"/>
-        </w:rPr>
-      </w:pPr>
-      <w:r>
-        <w:rPr>
-          <w:b/>
-          <w:bCs w:val="0"/>
-        </w:rPr>
+    <w:p/>
+    <w:p/>
+    <w:p/>
+    <w:p/>
+    <w:p/>
+    <w:p>
+      <w:pPr>
+        <w:rPr>
+          <w:b/>
+          <w:bCs w:val="0"/>
+        </w:rPr>
+      </w:pPr>
+      <w:r>
+        <w:rPr>
+          <w:b/>
+          <w:bCs w:val="0"/>
+        </w:rPr>
+        <w:lastRenderedPageBreak/>
         <w:t xml:space="preserve">Pathfinding </w:t>
       </w:r>
       <w:r>
@@ -7436,18 +8404,31 @@
               <w:pStyle w:val="ListParagraph"/>
               <w:ind w:left="0"/>
             </w:pPr>
-          </w:p>
-          <w:p>
-            <w:pPr>
-              <w:pStyle w:val="ListParagraph"/>
-              <w:ind w:left="0"/>
-            </w:pPr>
-          </w:p>
-          <w:p>
-            <w:pPr>
-              <w:pStyle w:val="ListParagraph"/>
-              <w:ind w:left="0"/>
-            </w:pPr>
+            <w:proofErr w:type="spellStart"/>
+            <w:r>
+              <w:t>Navmesh</w:t>
+            </w:r>
+            <w:proofErr w:type="spellEnd"/>
+            <w:r>
+              <w:t xml:space="preserve"> is a system that defines the walkable area of a game environment, using polygons. NPCs use the mesh to determine where they can move and what obstacles they need to avoid</w:t>
+            </w:r>
+            <w:r>
+              <w:t xml:space="preserve"> while still staying on the correct path.</w:t>
+            </w:r>
+            <w:r>
+              <w:br/>
+            </w:r>
+            <w:r>
+              <w:br/>
+            </w:r>
+            <w:proofErr w:type="spellStart"/>
+            <w:r>
+              <w:t>Navmesh</w:t>
+            </w:r>
+            <w:proofErr w:type="spellEnd"/>
+            <w:r>
+              <w:t xml:space="preserve"> is suited for this project because the environment will contain different buildings and objects that the NPCs can’t walk through, so this allows them to understand the environment and where they can step</w:t>
+            </w:r>
           </w:p>
         </w:tc>
       </w:tr>
@@ -7497,18 +8478,24 @@
               <w:pStyle w:val="ListParagraph"/>
               <w:ind w:left="0"/>
             </w:pPr>
-          </w:p>
-          <w:p>
-            <w:pPr>
-              <w:pStyle w:val="ListParagraph"/>
-              <w:ind w:left="0"/>
-            </w:pPr>
-          </w:p>
-          <w:p>
-            <w:pPr>
-              <w:pStyle w:val="ListParagraph"/>
-              <w:ind w:left="0"/>
-            </w:pPr>
+            <w:r>
+              <w:t xml:space="preserve">A* is a pathfinding algorithm that calculates the shortest path from a start point to a target point, using a </w:t>
+            </w:r>
+            <w:proofErr w:type="gramStart"/>
+            <w:r>
+              <w:t>cost based</w:t>
+            </w:r>
+            <w:proofErr w:type="gramEnd"/>
+            <w:r>
+              <w:t xml:space="preserve"> system. It evaluates possible paths and selects the one with the lowest combined distance and movement cost.</w:t>
+            </w:r>
+            <w:r>
+              <w:br/>
+            </w:r>
+            <w:r>
+              <w:br/>
+              <w:t>A* is suitable for this project because NPCs will be travelling between different locations, and it needs to get to each location in an efficient way, rather than taking a restricted or scripted path to the destinations.</w:t>
+            </w:r>
           </w:p>
         </w:tc>
       </w:tr>
@@ -7532,15 +8519,206 @@
           <w:iCs/>
         </w:rPr>
       </w:pPr>
-      <w:r>
-        <w:rPr>
-          <w:b/>
-          <w:bCs w:val="0"/>
-          <w:iCs/>
-        </w:rPr>
-        <w:lastRenderedPageBreak/>
-        <w:br w:type="page"/>
-      </w:r>
+    </w:p>
+    <w:p>
+      <w:pPr>
+        <w:spacing w:line="240" w:lineRule="auto"/>
+        <w:rPr>
+          <w:b/>
+          <w:bCs w:val="0"/>
+          <w:iCs/>
+        </w:rPr>
+      </w:pPr>
+    </w:p>
+    <w:p>
+      <w:pPr>
+        <w:spacing w:line="240" w:lineRule="auto"/>
+        <w:rPr>
+          <w:b/>
+          <w:bCs w:val="0"/>
+          <w:iCs/>
+        </w:rPr>
+      </w:pPr>
+    </w:p>
+    <w:p>
+      <w:pPr>
+        <w:spacing w:line="240" w:lineRule="auto"/>
+        <w:rPr>
+          <w:b/>
+          <w:bCs w:val="0"/>
+          <w:iCs/>
+        </w:rPr>
+      </w:pPr>
+    </w:p>
+    <w:p>
+      <w:pPr>
+        <w:spacing w:line="240" w:lineRule="auto"/>
+        <w:rPr>
+          <w:b/>
+          <w:bCs w:val="0"/>
+          <w:iCs/>
+        </w:rPr>
+      </w:pPr>
+    </w:p>
+    <w:p>
+      <w:pPr>
+        <w:spacing w:line="240" w:lineRule="auto"/>
+        <w:rPr>
+          <w:b/>
+          <w:bCs w:val="0"/>
+          <w:iCs/>
+        </w:rPr>
+      </w:pPr>
+    </w:p>
+    <w:p>
+      <w:pPr>
+        <w:spacing w:line="240" w:lineRule="auto"/>
+        <w:rPr>
+          <w:b/>
+          <w:bCs w:val="0"/>
+          <w:iCs/>
+        </w:rPr>
+      </w:pPr>
+    </w:p>
+    <w:p>
+      <w:pPr>
+        <w:spacing w:line="240" w:lineRule="auto"/>
+        <w:rPr>
+          <w:b/>
+          <w:bCs w:val="0"/>
+          <w:iCs/>
+        </w:rPr>
+      </w:pPr>
+    </w:p>
+    <w:p>
+      <w:pPr>
+        <w:spacing w:line="240" w:lineRule="auto"/>
+        <w:rPr>
+          <w:b/>
+          <w:bCs w:val="0"/>
+          <w:iCs/>
+        </w:rPr>
+      </w:pPr>
+    </w:p>
+    <w:p>
+      <w:pPr>
+        <w:spacing w:line="240" w:lineRule="auto"/>
+        <w:rPr>
+          <w:b/>
+          <w:bCs w:val="0"/>
+          <w:iCs/>
+        </w:rPr>
+      </w:pPr>
+    </w:p>
+    <w:p>
+      <w:pPr>
+        <w:spacing w:line="240" w:lineRule="auto"/>
+        <w:rPr>
+          <w:b/>
+          <w:bCs w:val="0"/>
+          <w:iCs/>
+        </w:rPr>
+      </w:pPr>
+    </w:p>
+    <w:p>
+      <w:pPr>
+        <w:spacing w:line="240" w:lineRule="auto"/>
+        <w:rPr>
+          <w:b/>
+          <w:bCs w:val="0"/>
+          <w:iCs/>
+        </w:rPr>
+      </w:pPr>
+    </w:p>
+    <w:p>
+      <w:pPr>
+        <w:spacing w:line="240" w:lineRule="auto"/>
+        <w:rPr>
+          <w:b/>
+          <w:bCs w:val="0"/>
+          <w:iCs/>
+        </w:rPr>
+      </w:pPr>
+    </w:p>
+    <w:p>
+      <w:pPr>
+        <w:spacing w:line="240" w:lineRule="auto"/>
+        <w:rPr>
+          <w:b/>
+          <w:bCs w:val="0"/>
+          <w:iCs/>
+        </w:rPr>
+      </w:pPr>
+    </w:p>
+    <w:p>
+      <w:pPr>
+        <w:spacing w:line="240" w:lineRule="auto"/>
+        <w:rPr>
+          <w:b/>
+          <w:bCs w:val="0"/>
+          <w:iCs/>
+        </w:rPr>
+      </w:pPr>
+    </w:p>
+    <w:p>
+      <w:pPr>
+        <w:spacing w:line="240" w:lineRule="auto"/>
+        <w:rPr>
+          <w:b/>
+          <w:bCs w:val="0"/>
+          <w:iCs/>
+        </w:rPr>
+      </w:pPr>
+    </w:p>
+    <w:p>
+      <w:pPr>
+        <w:spacing w:line="240" w:lineRule="auto"/>
+        <w:rPr>
+          <w:b/>
+          <w:bCs w:val="0"/>
+          <w:iCs/>
+        </w:rPr>
+      </w:pPr>
+    </w:p>
+    <w:p>
+      <w:pPr>
+        <w:spacing w:line="240" w:lineRule="auto"/>
+        <w:rPr>
+          <w:b/>
+          <w:bCs w:val="0"/>
+          <w:iCs/>
+        </w:rPr>
+      </w:pPr>
+    </w:p>
+    <w:p>
+      <w:pPr>
+        <w:spacing w:line="240" w:lineRule="auto"/>
+        <w:rPr>
+          <w:b/>
+          <w:bCs w:val="0"/>
+          <w:iCs/>
+        </w:rPr>
+      </w:pPr>
+    </w:p>
+    <w:p>
+      <w:pPr>
+        <w:spacing w:line="240" w:lineRule="auto"/>
+        <w:rPr>
+          <w:b/>
+          <w:bCs w:val="0"/>
+          <w:iCs/>
+        </w:rPr>
+      </w:pPr>
+    </w:p>
+    <w:p>
+      <w:pPr>
+        <w:spacing w:line="240" w:lineRule="auto"/>
+        <w:rPr>
+          <w:b/>
+          <w:bCs w:val="0"/>
+          <w:iCs/>
+        </w:rPr>
+      </w:pPr>
     </w:p>
     <w:p>
       <w:pPr>
@@ -7723,22 +8901,54 @@
                 <w:iCs/>
               </w:rPr>
             </w:pPr>
-          </w:p>
-          <w:p>
-            <w:pPr>
-              <w:spacing w:line="240" w:lineRule="auto"/>
-              <w:rPr>
-                <w:iCs/>
-              </w:rPr>
-            </w:pPr>
-          </w:p>
-          <w:p>
-            <w:pPr>
-              <w:spacing w:line="240" w:lineRule="auto"/>
-              <w:rPr>
-                <w:iCs/>
-              </w:rPr>
-            </w:pPr>
+            <w:r>
+              <w:rPr>
+                <w:iCs/>
+              </w:rPr>
+              <w:t>The GUI for this project needs to communicate to the player the current game state in a clear and accessible way. This includes things like, displaying the current resources, such as wood, food, stone, etc, what NPCs are currently doing and how far away from a game over or game win condition the player is, such as “need X resources to win” or “NPCs will starve in X days”.</w:t>
+            </w:r>
+          </w:p>
+          <w:p>
+            <w:pPr>
+              <w:spacing w:line="240" w:lineRule="auto"/>
+              <w:rPr>
+                <w:iCs/>
+              </w:rPr>
+            </w:pPr>
+          </w:p>
+          <w:p>
+            <w:pPr>
+              <w:spacing w:line="240" w:lineRule="auto"/>
+              <w:rPr>
+                <w:iCs/>
+              </w:rPr>
+            </w:pPr>
+            <w:r>
+              <w:rPr>
+                <w:iCs/>
+              </w:rPr>
+              <w:t xml:space="preserve">How I’ll meet these requirements can be tricky, because it’s a balancing act between a busy screen and not being able to see the game world. </w:t>
+            </w:r>
+            <w:r>
+              <w:rPr>
+                <w:iCs/>
+              </w:rPr>
+              <w:t xml:space="preserve">Ideally, resources will be displayed on a toolbar on the top of the screen, with quick views of current </w:t>
+            </w:r>
+            <w:proofErr w:type="gramStart"/>
+            <w:r>
+              <w:rPr>
+                <w:iCs/>
+              </w:rPr>
+              <w:t>stock pile</w:t>
+            </w:r>
+            <w:proofErr w:type="gramEnd"/>
+            <w:r>
+              <w:rPr>
+                <w:iCs/>
+              </w:rPr>
+              <w:t xml:space="preserve"> of resources. Viewing the NPCs and their current tasks would need to be a popup window, accessed by pressing a button on the same toolbar. Once it pops up, it would display the bare minimum to get the point across, such as the NPCs name, their current task, if they’re carrying anything and any stats relating to the NPC, like woodcutting level, health, stamina, hunger.</w:t>
+            </w:r>
           </w:p>
           <w:p>
             <w:pPr>
@@ -7900,30 +9110,61 @@
                 <w:iCs/>
               </w:rPr>
             </w:pPr>
-          </w:p>
-          <w:p>
-            <w:pPr>
-              <w:pStyle w:val="ListParagraph"/>
-              <w:spacing w:line="240" w:lineRule="auto"/>
-              <w:ind w:left="0"/>
-              <w:rPr>
-                <w:iCs/>
-              </w:rPr>
-            </w:pPr>
-          </w:p>
-          <w:p>
-            <w:pPr>
-              <w:pStyle w:val="ListParagraph"/>
-              <w:spacing w:line="240" w:lineRule="auto"/>
-              <w:ind w:left="0"/>
-              <w:rPr>
-                <w:iCs/>
-              </w:rPr>
-            </w:pPr>
+            <w:r>
+              <w:rPr>
+                <w:iCs/>
+              </w:rPr>
+              <w:t>Canvas is the main system used for creating in game user interfaces. It works by placing UI elements, like buttons, panels, text, images, etc onto a “canvas” object, which can be rendered in screen space or world space. This is suitable for creating menus, HUDs, health bars and other important game information.</w:t>
+            </w:r>
           </w:p>
         </w:tc>
       </w:tr>
     </w:tbl>
+    <w:p>
+      <w:pPr>
+        <w:pStyle w:val="ListParagraph"/>
+        <w:spacing w:line="240" w:lineRule="auto"/>
+        <w:rPr>
+          <w:iCs/>
+        </w:rPr>
+      </w:pPr>
+    </w:p>
+    <w:p>
+      <w:pPr>
+        <w:pStyle w:val="ListParagraph"/>
+        <w:spacing w:line="240" w:lineRule="auto"/>
+        <w:rPr>
+          <w:iCs/>
+        </w:rPr>
+      </w:pPr>
+    </w:p>
+    <w:p>
+      <w:pPr>
+        <w:pStyle w:val="ListParagraph"/>
+        <w:spacing w:line="240" w:lineRule="auto"/>
+        <w:rPr>
+          <w:iCs/>
+        </w:rPr>
+      </w:pPr>
+    </w:p>
+    <w:p>
+      <w:pPr>
+        <w:pStyle w:val="ListParagraph"/>
+        <w:spacing w:line="240" w:lineRule="auto"/>
+        <w:rPr>
+          <w:iCs/>
+        </w:rPr>
+      </w:pPr>
+    </w:p>
+    <w:p>
+      <w:pPr>
+        <w:pStyle w:val="ListParagraph"/>
+        <w:spacing w:line="240" w:lineRule="auto"/>
+        <w:rPr>
+          <w:iCs/>
+        </w:rPr>
+      </w:pPr>
+    </w:p>
     <w:p>
       <w:pPr>
         <w:pStyle w:val="ListParagraph"/>
@@ -7953,6 +9194,7 @@
           <w:bCs w:val="0"/>
           <w:iCs/>
         </w:rPr>
+        <w:lastRenderedPageBreak/>
         <w:t>IMGUI</w:t>
       </w:r>
     </w:p>
@@ -7980,26 +9222,46 @@
                 <w:iCs/>
               </w:rPr>
             </w:pPr>
-          </w:p>
-          <w:p>
-            <w:pPr>
-              <w:pStyle w:val="ListParagraph"/>
-              <w:spacing w:line="240" w:lineRule="auto"/>
-              <w:ind w:left="0"/>
-              <w:rPr>
-                <w:iCs/>
-              </w:rPr>
-            </w:pPr>
-          </w:p>
-          <w:p>
-            <w:pPr>
-              <w:pStyle w:val="ListParagraph"/>
-              <w:spacing w:line="240" w:lineRule="auto"/>
-              <w:ind w:left="0"/>
-              <w:rPr>
-                <w:iCs/>
-              </w:rPr>
-            </w:pPr>
+            <w:r>
+              <w:rPr>
+                <w:iCs/>
+              </w:rPr>
+              <w:t>IMGUI is an older Unity GUI system. It works by drawing interfaces directly during each frame in the “</w:t>
+            </w:r>
+            <w:proofErr w:type="spellStart"/>
+            <w:proofErr w:type="gramStart"/>
+            <w:r>
+              <w:rPr>
+                <w:iCs/>
+              </w:rPr>
+              <w:t>OnGui</w:t>
+            </w:r>
+            <w:proofErr w:type="spellEnd"/>
+            <w:r>
+              <w:rPr>
+                <w:iCs/>
+              </w:rPr>
+              <w:t>(</w:t>
+            </w:r>
+            <w:proofErr w:type="gramEnd"/>
+            <w:r>
+              <w:rPr>
+                <w:iCs/>
+              </w:rPr>
+              <w:t>)” function. It is mainly used for creating editor tools, debugging panels and temporary runtime displays rather than final game interfaces. Because it updates every frame and is code driven, IMGUI is less suited for HU</w:t>
+            </w:r>
+            <w:r>
+              <w:rPr>
+                <w:iCs/>
+              </w:rPr>
+              <w:t>D</w:t>
+            </w:r>
+            <w:r>
+              <w:rPr>
+                <w:iCs/>
+              </w:rPr>
+              <w:t>s, but it is quick to implement for testing purposes.</w:t>
+            </w:r>
           </w:p>
         </w:tc>
       </w:tr>
@@ -8060,26 +9322,46 @@
                 <w:iCs/>
               </w:rPr>
             </w:pPr>
-          </w:p>
-          <w:p>
-            <w:pPr>
-              <w:pStyle w:val="ListParagraph"/>
-              <w:spacing w:line="240" w:lineRule="auto"/>
-              <w:ind w:left="0"/>
-              <w:rPr>
-                <w:iCs/>
-              </w:rPr>
-            </w:pPr>
-          </w:p>
-          <w:p>
-            <w:pPr>
-              <w:pStyle w:val="ListParagraph"/>
-              <w:spacing w:line="240" w:lineRule="auto"/>
-              <w:ind w:left="0"/>
-              <w:rPr>
-                <w:iCs/>
-              </w:rPr>
-            </w:pPr>
+            <w:r>
+              <w:rPr>
+                <w:iCs/>
+              </w:rPr>
+              <w:t xml:space="preserve">UI Toolkit is Unity’s newer UI system, combining flexibility and performance with structure </w:t>
+            </w:r>
+            <w:proofErr w:type="gramStart"/>
+            <w:r>
+              <w:rPr>
+                <w:iCs/>
+              </w:rPr>
+              <w:t>similar to</w:t>
+            </w:r>
+            <w:proofErr w:type="gramEnd"/>
+            <w:r>
+              <w:rPr>
+                <w:iCs/>
+              </w:rPr>
+              <w:t xml:space="preserve"> web development</w:t>
+            </w:r>
+            <w:r>
+              <w:rPr>
+                <w:iCs/>
+              </w:rPr>
+              <w:t xml:space="preserve">. It uses visual elements, USS (like CSS in web development) and UXML to define and style UI components. UI Toolkit can be used for both runtime and editor tools. It’s </w:t>
+            </w:r>
+            <w:proofErr w:type="gramStart"/>
+            <w:r>
+              <w:rPr>
+                <w:iCs/>
+              </w:rPr>
+              <w:t>particular good</w:t>
+            </w:r>
+            <w:proofErr w:type="gramEnd"/>
+            <w:r>
+              <w:rPr>
+                <w:iCs/>
+              </w:rPr>
+              <w:t xml:space="preserve"> for creating scalable, reusable UI components and is more efficient for complex interfaces, which allows for easier styling and dynamic layouts compared to Canvas</w:t>
+            </w:r>
           </w:p>
         </w:tc>
       </w:tr>
@@ -8143,30 +9425,34 @@
                 <w:iCs/>
               </w:rPr>
             </w:pPr>
-          </w:p>
-          <w:p>
-            <w:pPr>
-              <w:spacing w:line="240" w:lineRule="auto"/>
-              <w:rPr>
-                <w:iCs/>
-              </w:rPr>
-            </w:pPr>
-          </w:p>
-          <w:p>
-            <w:pPr>
-              <w:spacing w:line="240" w:lineRule="auto"/>
-              <w:rPr>
-                <w:iCs/>
-              </w:rPr>
-            </w:pPr>
-          </w:p>
-          <w:p>
-            <w:pPr>
-              <w:spacing w:line="240" w:lineRule="auto"/>
-              <w:rPr>
-                <w:iCs/>
-              </w:rPr>
-            </w:pPr>
+            <w:r>
+              <w:rPr>
+                <w:iCs/>
+              </w:rPr>
+              <w:t>Canvas is the most suitable for this project because it’s designed for in game user interfaces, like the HUD, menus, pop-up windows etc, which directly relates to what the project requires. Canvas also integrates well with the Unity event system, allowing the player to press buttons and quickly spawn new NPCs or opening information panels.</w:t>
+            </w:r>
+          </w:p>
+          <w:p>
+            <w:pPr>
+              <w:spacing w:line="240" w:lineRule="auto"/>
+              <w:rPr>
+                <w:iCs/>
+              </w:rPr>
+            </w:pPr>
+          </w:p>
+          <w:p>
+            <w:pPr>
+              <w:spacing w:line="240" w:lineRule="auto"/>
+              <w:rPr>
+                <w:iCs/>
+              </w:rPr>
+            </w:pPr>
+            <w:r>
+              <w:rPr>
+                <w:iCs/>
+              </w:rPr>
+              <w:t>It’s also what I’m most used to using</w:t>
+            </w:r>
           </w:p>
         </w:tc>
       </w:tr>
@@ -8270,22 +9556,12 @@
                 <w:iCs/>
               </w:rPr>
             </w:pPr>
-          </w:p>
-          <w:p>
-            <w:pPr>
-              <w:spacing w:line="240" w:lineRule="auto"/>
-              <w:rPr>
-                <w:iCs/>
-              </w:rPr>
-            </w:pPr>
-          </w:p>
-          <w:p>
-            <w:pPr>
-              <w:spacing w:line="240" w:lineRule="auto"/>
-              <w:rPr>
-                <w:iCs/>
-              </w:rPr>
-            </w:pPr>
+            <w:r>
+              <w:rPr>
+                <w:iCs/>
+              </w:rPr>
+              <w:t>I’ll be using Unity’s Scripting system with C# scripts. This lets me extend the Unity editor without effecting the final game build. By creating custom inspectors and editor windows, I can speed up common tasks like tweaking NPC behaviours, adjusting AI values, quickly adjusting in game resources (increase / decrease wood, food, etc) and testing pathfinding quickly.</w:t>
+            </w:r>
           </w:p>
           <w:p>
             <w:pPr>
@@ -8326,17 +9602,66 @@
       <w:pPr>
         <w:spacing w:line="240" w:lineRule="auto"/>
         <w:rPr>
-          <w:b/>
-          <w:bCs w:val="0"/>
-          <w:iCs/>
-        </w:rPr>
-      </w:pPr>
-      <w:r>
-        <w:rPr>
-          <w:b/>
-          <w:bCs w:val="0"/>
-          <w:iCs/>
-        </w:rPr>
+          <w:iCs/>
+        </w:rPr>
+      </w:pPr>
+    </w:p>
+    <w:p>
+      <w:pPr>
+        <w:spacing w:line="240" w:lineRule="auto"/>
+        <w:rPr>
+          <w:iCs/>
+        </w:rPr>
+      </w:pPr>
+    </w:p>
+    <w:p>
+      <w:pPr>
+        <w:spacing w:line="240" w:lineRule="auto"/>
+        <w:rPr>
+          <w:iCs/>
+        </w:rPr>
+      </w:pPr>
+    </w:p>
+    <w:p>
+      <w:pPr>
+        <w:spacing w:line="240" w:lineRule="auto"/>
+        <w:rPr>
+          <w:iCs/>
+        </w:rPr>
+      </w:pPr>
+    </w:p>
+    <w:p>
+      <w:pPr>
+        <w:spacing w:line="240" w:lineRule="auto"/>
+        <w:rPr>
+          <w:iCs/>
+        </w:rPr>
+      </w:pPr>
+    </w:p>
+    <w:p>
+      <w:pPr>
+        <w:spacing w:line="240" w:lineRule="auto"/>
+        <w:rPr>
+          <w:iCs/>
+        </w:rPr>
+      </w:pPr>
+    </w:p>
+    <w:p>
+      <w:pPr>
+        <w:spacing w:line="240" w:lineRule="auto"/>
+        <w:rPr>
+          <w:b/>
+          <w:bCs w:val="0"/>
+          <w:iCs/>
+        </w:rPr>
+      </w:pPr>
+      <w:r>
+        <w:rPr>
+          <w:b/>
+          <w:bCs w:val="0"/>
+          <w:iCs/>
+        </w:rPr>
+        <w:lastRenderedPageBreak/>
         <w:t xml:space="preserve">GUI Design </w:t>
       </w:r>
       <w:proofErr w:type="spellStart"/>
@@ -8369,7 +9694,21 @@
         <w:rPr>
           <w:iCs/>
         </w:rPr>
-        <w:t>The last phase of planning here is to actually create a prototype or mock-up version of your GUI.</w:t>
+        <w:t xml:space="preserve">The last phase of planning here is to </w:t>
+      </w:r>
+      <w:proofErr w:type="gramStart"/>
+      <w:r>
+        <w:rPr>
+          <w:iCs/>
+        </w:rPr>
+        <w:t>actually create</w:t>
+      </w:r>
+      <w:proofErr w:type="gramEnd"/>
+      <w:r>
+        <w:rPr>
+          <w:iCs/>
+        </w:rPr>
+        <w:t xml:space="preserve"> a prototype or mock-up version of your GUI.</w:t>
       </w:r>
     </w:p>
     <w:p>
@@ -8452,6 +9791,7 @@
         <w:t xml:space="preserve">Have a small description of each of the elements presented in the GUI below the image to clearly explain everything that you have placed in the design and </w:t>
       </w:r>
       <w:proofErr w:type="spellStart"/>
+      <w:proofErr w:type="gramStart"/>
       <w:r>
         <w:rPr>
           <w:iCs/>
@@ -8459,6 +9799,7 @@
         <w:t>it’s</w:t>
       </w:r>
       <w:proofErr w:type="spellEnd"/>
+      <w:proofErr w:type="gramEnd"/>
       <w:r>
         <w:rPr>
           <w:iCs/>
@@ -8507,43 +9848,212 @@
                 <w:iCs/>
               </w:rPr>
             </w:pPr>
-          </w:p>
-          <w:p>
-            <w:pPr>
-              <w:spacing w:line="240" w:lineRule="auto"/>
-              <w:jc w:val="center"/>
+            <w:r>
               <w:rPr>
                 <w:b/>
                 <w:bCs w:val="0"/>
                 <w:iCs/>
               </w:rPr>
-            </w:pPr>
-            <w:r>
+              <w:t>Main Menu:</w:t>
+            </w:r>
+          </w:p>
+          <w:p>
+            <w:pPr>
+              <w:spacing w:line="240" w:lineRule="auto"/>
+              <w:rPr>
+                <w:iCs/>
+              </w:rPr>
+            </w:pPr>
+            <w:r>
+              <w:rPr>
+                <w:noProof/>
+              </w:rPr>
+              <w:drawing>
+                <wp:inline distT="0" distB="0" distL="0" distR="0" wp14:anchorId="7D691483" wp14:editId="4344DFCC">
+                  <wp:extent cx="2447925" cy="2362200"/>
+                  <wp:effectExtent l="0" t="0" r="9525" b="0"/>
+                  <wp:docPr id="1483760810" name="Picture 1"/>
+                  <wp:cNvGraphicFramePr>
+                    <a:graphicFrameLocks xmlns:a="http://schemas.openxmlformats.org/drawingml/2006/main" noChangeAspect="1"/>
+                  </wp:cNvGraphicFramePr>
+                  <a:graphic xmlns:a="http://schemas.openxmlformats.org/drawingml/2006/main">
+                    <a:graphicData uri="http://schemas.openxmlformats.org/drawingml/2006/picture">
+                      <pic:pic xmlns:pic="http://schemas.openxmlformats.org/drawingml/2006/picture">
+                        <pic:nvPicPr>
+                          <pic:cNvPr id="1483760810" name=""/>
+                          <pic:cNvPicPr/>
+                        </pic:nvPicPr>
+                        <pic:blipFill>
+                          <a:blip r:embed="rId17"/>
+                          <a:stretch>
+                            <a:fillRect/>
+                          </a:stretch>
+                        </pic:blipFill>
+                        <pic:spPr>
+                          <a:xfrm>
+                            <a:off x="0" y="0"/>
+                            <a:ext cx="2447925" cy="2362200"/>
+                          </a:xfrm>
+                          <a:prstGeom prst="rect">
+                            <a:avLst/>
+                          </a:prstGeom>
+                        </pic:spPr>
+                      </pic:pic>
+                    </a:graphicData>
+                  </a:graphic>
+                </wp:inline>
+              </w:drawing>
+            </w:r>
+          </w:p>
+          <w:p>
+            <w:pPr>
+              <w:spacing w:line="240" w:lineRule="auto"/>
+              <w:rPr>
+                <w:iCs/>
+              </w:rPr>
+            </w:pPr>
+          </w:p>
+          <w:p>
+            <w:pPr>
+              <w:spacing w:line="240" w:lineRule="auto"/>
               <w:rPr>
                 <w:b/>
                 <w:bCs w:val="0"/>
                 <w:iCs/>
               </w:rPr>
-              <w:t>[</w:t>
-            </w:r>
-            <w:proofErr w:type="spellStart"/>
+            </w:pPr>
             <w:r>
               <w:rPr>
                 <w:b/>
                 <w:bCs w:val="0"/>
                 <w:iCs/>
               </w:rPr>
-              <w:t>Mockup</w:t>
-            </w:r>
-            <w:proofErr w:type="spellEnd"/>
+              <w:t>Element 1: Start Game Button</w:t>
+            </w:r>
+          </w:p>
+          <w:p>
+            <w:pPr>
+              <w:spacing w:line="240" w:lineRule="auto"/>
+              <w:rPr>
+                <w:iCs/>
+              </w:rPr>
+            </w:pPr>
+            <w:r>
+              <w:rPr>
+                <w:iCs/>
+              </w:rPr>
+              <w:t>Begins the game</w:t>
+            </w:r>
+          </w:p>
+          <w:p>
+            <w:pPr>
+              <w:spacing w:line="240" w:lineRule="auto"/>
+              <w:rPr>
+                <w:iCs/>
+              </w:rPr>
+            </w:pPr>
+          </w:p>
+          <w:p>
+            <w:pPr>
+              <w:spacing w:line="240" w:lineRule="auto"/>
+              <w:rPr>
+                <w:iCs/>
+              </w:rPr>
+            </w:pPr>
             <w:r>
               <w:rPr>
                 <w:b/>
                 <w:bCs w:val="0"/>
                 <w:iCs/>
               </w:rPr>
-              <w:t>]</w:t>
-            </w:r>
+              <w:t>Element 2: Quit Button</w:t>
+            </w:r>
+          </w:p>
+          <w:p>
+            <w:pPr>
+              <w:spacing w:line="240" w:lineRule="auto"/>
+              <w:rPr>
+                <w:iCs/>
+              </w:rPr>
+            </w:pPr>
+            <w:r>
+              <w:rPr>
+                <w:iCs/>
+              </w:rPr>
+              <w:t>Exits the game</w:t>
+            </w:r>
+          </w:p>
+          <w:p>
+            <w:pPr>
+              <w:spacing w:line="240" w:lineRule="auto"/>
+              <w:rPr>
+                <w:iCs/>
+              </w:rPr>
+            </w:pPr>
+          </w:p>
+          <w:p>
+            <w:pPr>
+              <w:spacing w:line="240" w:lineRule="auto"/>
+              <w:rPr>
+                <w:iCs/>
+              </w:rPr>
+            </w:pPr>
+          </w:p>
+          <w:p>
+            <w:pPr>
+              <w:spacing w:line="240" w:lineRule="auto"/>
+              <w:rPr>
+                <w:iCs/>
+              </w:rPr>
+            </w:pPr>
+          </w:p>
+          <w:p>
+            <w:pPr>
+              <w:spacing w:line="240" w:lineRule="auto"/>
+              <w:rPr>
+                <w:iCs/>
+              </w:rPr>
+            </w:pPr>
+          </w:p>
+          <w:p>
+            <w:pPr>
+              <w:spacing w:line="240" w:lineRule="auto"/>
+              <w:rPr>
+                <w:iCs/>
+              </w:rPr>
+            </w:pPr>
+          </w:p>
+          <w:p>
+            <w:pPr>
+              <w:spacing w:line="240" w:lineRule="auto"/>
+              <w:rPr>
+                <w:iCs/>
+              </w:rPr>
+            </w:pPr>
+          </w:p>
+          <w:p>
+            <w:pPr>
+              <w:spacing w:line="240" w:lineRule="auto"/>
+              <w:rPr>
+                <w:iCs/>
+              </w:rPr>
+            </w:pPr>
+          </w:p>
+          <w:p>
+            <w:pPr>
+              <w:spacing w:line="240" w:lineRule="auto"/>
+              <w:rPr>
+                <w:iCs/>
+              </w:rPr>
+            </w:pPr>
+          </w:p>
+          <w:p>
+            <w:pPr>
+              <w:spacing w:line="240" w:lineRule="auto"/>
+              <w:rPr>
+                <w:iCs/>
+              </w:rPr>
+            </w:pPr>
           </w:p>
           <w:p>
             <w:pPr>
@@ -8584,46 +10094,70 @@
                 <w:bCs w:val="0"/>
                 <w:iCs/>
               </w:rPr>
-              <w:t>[</w:t>
-            </w:r>
-            <w:r>
+              <w:lastRenderedPageBreak/>
+              <w:t>Game GUI:</w:t>
+            </w:r>
+          </w:p>
+          <w:p>
+            <w:pPr>
+              <w:spacing w:line="240" w:lineRule="auto"/>
+            </w:pPr>
+            <w:r>
+              <w:object w:dxaOrig="4320" w:dyaOrig="2546" w14:anchorId="25BF6637">
+                <v:shapetype id="_x0000_t75" coordsize="21600,21600" o:spt="75" o:preferrelative="t" path="m@4@5l@4@11@9@11@9@5xe" filled="f" stroked="f">
+                  <v:stroke joinstyle="miter"/>
+                  <v:formulas>
+                    <v:f eqn="if lineDrawn pixelLineWidth 0"/>
+                    <v:f eqn="sum @0 1 0"/>
+                    <v:f eqn="sum 0 0 @1"/>
+                    <v:f eqn="prod @2 1 2"/>
+                    <v:f eqn="prod @3 21600 pixelWidth"/>
+                    <v:f eqn="prod @3 21600 pixelHeight"/>
+                    <v:f eqn="sum @0 0 1"/>
+                    <v:f eqn="prod @6 1 2"/>
+                    <v:f eqn="prod @7 21600 pixelWidth"/>
+                    <v:f eqn="sum @8 21600 0"/>
+                    <v:f eqn="prod @7 21600 pixelHeight"/>
+                    <v:f eqn="sum @10 21600 0"/>
+                  </v:formulas>
+                  <v:path o:extrusionok="f" gradientshapeok="t" o:connecttype="rect"/>
+                  <o:lock v:ext="edit" aspectratio="t"/>
+                </v:shapetype>
+                <v:shape id="_x0000_i1029" type="#_x0000_t75" style="width:433.85pt;height:255.25pt" o:ole="">
+                  <v:imagedata r:id="rId18" o:title=""/>
+                </v:shape>
+                <o:OLEObject Type="Embed" ProgID="PBrush" ShapeID="_x0000_i1029" DrawAspect="Content" ObjectID="_1832837115" r:id="rId19"/>
+              </w:object>
+            </w:r>
+          </w:p>
+          <w:p>
+            <w:pPr>
+              <w:spacing w:line="240" w:lineRule="auto"/>
+            </w:pPr>
+          </w:p>
+          <w:p>
+            <w:pPr>
+              <w:spacing w:line="240" w:lineRule="auto"/>
               <w:rPr>
                 <w:b/>
                 <w:bCs w:val="0"/>
-                <w:iCs/>
-              </w:rPr>
-              <w:t>Element 1</w:t>
-            </w:r>
+              </w:rPr>
+            </w:pPr>
             <w:r>
               <w:rPr>
                 <w:b/>
                 <w:bCs w:val="0"/>
-                <w:iCs/>
-              </w:rPr>
-              <w:t>]</w:t>
-            </w:r>
-          </w:p>
-          <w:p>
-            <w:pPr>
-              <w:spacing w:line="240" w:lineRule="auto"/>
-              <w:rPr>
-                <w:iCs/>
-              </w:rPr>
-            </w:pPr>
-            <w:r>
-              <w:rPr>
-                <w:iCs/>
-              </w:rPr>
-              <w:t>[Element 1 Description]</w:t>
-            </w:r>
-          </w:p>
-          <w:p>
-            <w:pPr>
-              <w:spacing w:line="240" w:lineRule="auto"/>
-              <w:rPr>
-                <w:iCs/>
-              </w:rPr>
-            </w:pPr>
+              </w:rPr>
+              <w:t>Element 1:</w:t>
+            </w:r>
+          </w:p>
+          <w:p>
+            <w:pPr>
+              <w:spacing w:line="240" w:lineRule="auto"/>
+            </w:pPr>
+            <w:r>
+              <w:t>Return to main menu button, returns the player to the main menu</w:t>
+            </w:r>
           </w:p>
           <w:p>
             <w:pPr>
@@ -8631,140 +10165,264 @@
               <w:rPr>
                 <w:b/>
                 <w:bCs w:val="0"/>
-                <w:iCs/>
-              </w:rPr>
-            </w:pPr>
-            <w:r>
+              </w:rPr>
+            </w:pPr>
+          </w:p>
+          <w:p>
+            <w:pPr>
+              <w:spacing w:line="240" w:lineRule="auto"/>
               <w:rPr>
                 <w:b/>
                 <w:bCs w:val="0"/>
-                <w:iCs/>
-              </w:rPr>
-              <w:t>[</w:t>
-            </w:r>
+              </w:rPr>
+            </w:pPr>
             <w:r>
               <w:rPr>
                 <w:b/>
                 <w:bCs w:val="0"/>
-                <w:iCs/>
-              </w:rPr>
-              <w:t>Element 2</w:t>
+              </w:rPr>
+              <w:t xml:space="preserve">Element </w:t>
             </w:r>
             <w:r>
               <w:rPr>
                 <w:b/>
                 <w:bCs w:val="0"/>
-                <w:iCs/>
-              </w:rPr>
-              <w:t>]</w:t>
-            </w:r>
-          </w:p>
-          <w:p>
-            <w:pPr>
-              <w:spacing w:line="240" w:lineRule="auto"/>
-              <w:rPr>
-                <w:iCs/>
-              </w:rPr>
-            </w:pPr>
-            <w:r>
-              <w:rPr>
-                <w:iCs/>
-              </w:rPr>
-              <w:t>[Element 2 Description]</w:t>
-            </w:r>
-          </w:p>
-          <w:p>
-            <w:pPr>
-              <w:spacing w:line="240" w:lineRule="auto"/>
-              <w:rPr>
-                <w:iCs/>
-              </w:rPr>
-            </w:pPr>
-          </w:p>
-          <w:p>
-            <w:pPr>
-              <w:spacing w:line="240" w:lineRule="auto"/>
+              </w:rPr>
+              <w:t>2</w:t>
+            </w:r>
+            <w:r>
               <w:rPr>
                 <w:b/>
                 <w:bCs w:val="0"/>
-                <w:iCs/>
-              </w:rPr>
-            </w:pPr>
-            <w:r>
+              </w:rPr>
+              <w:t>:</w:t>
+            </w:r>
+          </w:p>
+          <w:p>
+            <w:pPr>
+              <w:spacing w:line="240" w:lineRule="auto"/>
+              <w:rPr>
+                <w:iCs/>
+              </w:rPr>
+            </w:pPr>
+            <w:r>
+              <w:rPr>
+                <w:iCs/>
+              </w:rPr>
+              <w:t>Current resource count for the colony, W for wood, S for stone, F for food and N for NPCs</w:t>
+            </w:r>
+          </w:p>
+          <w:p>
+            <w:pPr>
+              <w:spacing w:line="240" w:lineRule="auto"/>
               <w:rPr>
                 <w:b/>
                 <w:bCs w:val="0"/>
                 <w:iCs/>
               </w:rPr>
-              <w:t>[</w:t>
-            </w:r>
-            <w:r>
+            </w:pPr>
+          </w:p>
+          <w:p>
+            <w:pPr>
+              <w:spacing w:line="240" w:lineRule="auto"/>
               <w:rPr>
                 <w:b/>
                 <w:bCs w:val="0"/>
                 <w:iCs/>
               </w:rPr>
-              <w:t>Element 3</w:t>
-            </w:r>
+            </w:pPr>
             <w:r>
               <w:rPr>
                 <w:b/>
                 <w:bCs w:val="0"/>
-                <w:iCs/>
-              </w:rPr>
-              <w:t xml:space="preserve"> etc…</w:t>
+              </w:rPr>
+              <w:t xml:space="preserve">Element </w:t>
             </w:r>
             <w:r>
               <w:rPr>
                 <w:b/>
                 <w:bCs w:val="0"/>
-                <w:iCs/>
-              </w:rPr>
-              <w:t>]</w:t>
-            </w:r>
-          </w:p>
-          <w:p>
-            <w:pPr>
-              <w:spacing w:line="240" w:lineRule="auto"/>
-              <w:rPr>
-                <w:iCs/>
-              </w:rPr>
-            </w:pPr>
-            <w:r>
-              <w:rPr>
-                <w:iCs/>
-              </w:rPr>
-              <w:t xml:space="preserve">[Element </w:t>
-            </w:r>
-            <w:r>
-              <w:rPr>
-                <w:iCs/>
               </w:rPr>
               <w:t>3</w:t>
             </w:r>
             <w:r>
               <w:rPr>
-                <w:iCs/>
-              </w:rPr>
-              <w:t xml:space="preserve"> Description</w:t>
-            </w:r>
-            <w:r>
-              <w:rPr>
-                <w:iCs/>
-              </w:rPr>
-              <w:t xml:space="preserve"> etc…</w:t>
-            </w:r>
-            <w:r>
-              <w:rPr>
-                <w:iCs/>
-              </w:rPr>
-              <w:t>]</w:t>
-            </w:r>
-          </w:p>
-          <w:p>
-            <w:pPr>
-              <w:spacing w:line="240" w:lineRule="auto"/>
-              <w:rPr>
+                <w:b/>
+                <w:bCs w:val="0"/>
+              </w:rPr>
+              <w:t>:</w:t>
+            </w:r>
+          </w:p>
+          <w:p>
+            <w:pPr>
+              <w:spacing w:line="240" w:lineRule="auto"/>
+              <w:rPr>
+                <w:iCs/>
+              </w:rPr>
+            </w:pPr>
+            <w:r>
+              <w:rPr>
+                <w:iCs/>
+              </w:rPr>
+              <w:t xml:space="preserve">Information popup window button, opens and closes </w:t>
+            </w:r>
+            <w:r>
+              <w:rPr>
+                <w:b/>
+                <w:bCs w:val="0"/>
+                <w:iCs/>
+              </w:rPr>
+              <w:t>Element 4</w:t>
+            </w:r>
+          </w:p>
+          <w:p>
+            <w:pPr>
+              <w:spacing w:line="240" w:lineRule="auto"/>
+              <w:rPr>
+                <w:b/>
+                <w:bCs w:val="0"/>
+                <w:iCs/>
+              </w:rPr>
+            </w:pPr>
+          </w:p>
+          <w:p>
+            <w:pPr>
+              <w:spacing w:line="240" w:lineRule="auto"/>
+              <w:rPr>
+                <w:b/>
+                <w:bCs w:val="0"/>
+              </w:rPr>
+            </w:pPr>
+            <w:r>
+              <w:rPr>
+                <w:b/>
+                <w:bCs w:val="0"/>
+              </w:rPr>
+              <w:t>E</w:t>
+            </w:r>
+            <w:r>
+              <w:rPr>
+                <w:b/>
+                <w:bCs w:val="0"/>
+              </w:rPr>
+              <w:t>l</w:t>
+            </w:r>
+            <w:r>
+              <w:rPr>
+                <w:b/>
+                <w:bCs w:val="0"/>
+              </w:rPr>
+              <w:t xml:space="preserve">ement </w:t>
+            </w:r>
+            <w:r>
+              <w:rPr>
+                <w:b/>
+                <w:bCs w:val="0"/>
+              </w:rPr>
+              <w:t>4</w:t>
+            </w:r>
+            <w:r>
+              <w:rPr>
+                <w:b/>
+                <w:bCs w:val="0"/>
+              </w:rPr>
+              <w:t>:</w:t>
+            </w:r>
+          </w:p>
+          <w:p>
+            <w:pPr>
+              <w:spacing w:line="240" w:lineRule="auto"/>
+            </w:pPr>
+            <w:r>
+              <w:t xml:space="preserve">Information popup for the colony. Shows in more detail how many of each resource the colony has, along with </w:t>
+            </w:r>
+            <w:proofErr w:type="gramStart"/>
+            <w:r>
+              <w:t>amount</w:t>
+            </w:r>
+            <w:proofErr w:type="gramEnd"/>
+            <w:r>
+              <w:t xml:space="preserve"> of spawned NPCs. Will contain additional data, like number of miners, woodcutters, farmers, number of dead NPCs etc</w:t>
+            </w:r>
+          </w:p>
+          <w:p>
+            <w:pPr>
+              <w:spacing w:line="240" w:lineRule="auto"/>
+              <w:rPr>
+                <w:b/>
+                <w:bCs w:val="0"/>
+              </w:rPr>
+            </w:pPr>
+          </w:p>
+          <w:p>
+            <w:pPr>
+              <w:spacing w:line="240" w:lineRule="auto"/>
+              <w:rPr>
+                <w:b/>
+                <w:bCs w:val="0"/>
+                <w:iCs/>
+              </w:rPr>
+            </w:pPr>
+            <w:r>
+              <w:rPr>
+                <w:b/>
+                <w:bCs w:val="0"/>
+              </w:rPr>
+              <w:t xml:space="preserve">Element </w:t>
+            </w:r>
+            <w:r>
+              <w:rPr>
+                <w:b/>
+                <w:bCs w:val="0"/>
+              </w:rPr>
+              <w:t>5</w:t>
+            </w:r>
+            <w:r>
+              <w:rPr>
+                <w:b/>
+                <w:bCs w:val="0"/>
+              </w:rPr>
+              <w:t>:</w:t>
+            </w:r>
+          </w:p>
+          <w:p>
+            <w:pPr>
+              <w:spacing w:line="240" w:lineRule="auto"/>
+              <w:rPr>
+                <w:iCs/>
+              </w:rPr>
+            </w:pPr>
+            <w:r>
+              <w:rPr>
+                <w:iCs/>
+              </w:rPr>
+              <w:t xml:space="preserve">Return to game button, closes the information popup window, works the same as </w:t>
+            </w:r>
+            <w:r>
+              <w:rPr>
+                <w:b/>
+                <w:bCs w:val="0"/>
+                <w:iCs/>
+              </w:rPr>
+              <w:t>Element 3</w:t>
+            </w:r>
+          </w:p>
+          <w:p>
+            <w:pPr>
+              <w:spacing w:line="240" w:lineRule="auto"/>
+              <w:rPr>
+                <w:b/>
+                <w:bCs w:val="0"/>
+                <w:iCs/>
+              </w:rPr>
+            </w:pPr>
+          </w:p>
+          <w:p>
+            <w:pPr>
+              <w:spacing w:line="240" w:lineRule="auto"/>
+              <w:rPr>
+                <w:b/>
+                <w:bCs w:val="0"/>
                 <w:iCs/>
               </w:rPr>
             </w:pPr>
@@ -8803,12 +10461,22 @@
           <w:iCs/>
         </w:rPr>
       </w:pPr>
-      <w:r>
-        <w:rPr>
-          <w:iCs/>
-        </w:rPr>
-        <w:br w:type="page"/>
-      </w:r>
+    </w:p>
+    <w:p>
+      <w:pPr>
+        <w:spacing w:line="240" w:lineRule="auto"/>
+        <w:rPr>
+          <w:iCs/>
+        </w:rPr>
+      </w:pPr>
+    </w:p>
+    <w:p>
+      <w:pPr>
+        <w:spacing w:line="240" w:lineRule="auto"/>
+        <w:rPr>
+          <w:iCs/>
+        </w:rPr>
+      </w:pPr>
     </w:p>
     <w:p>
       <w:pPr>
@@ -8902,7 +10570,15 @@
     <w:p/>
     <w:p>
       <w:r>
-        <w:t>Then, take each of those larger chunks and break them down further into individual itemizable tasks to complete in order to complete the larger task.</w:t>
+        <w:t xml:space="preserve">Then, take each of those larger chunks and break them down further into individual itemizable tasks to complete </w:t>
+      </w:r>
+      <w:proofErr w:type="gramStart"/>
+      <w:r>
+        <w:t>in order to</w:t>
+      </w:r>
+      <w:proofErr w:type="gramEnd"/>
+      <w:r>
+        <w:t xml:space="preserve"> complete the larger task.</w:t>
       </w:r>
     </w:p>
     <w:p/>
@@ -9843,8 +11519,8 @@
     <w:p/>
     <w:p/>
     <w:sectPr>
-      <w:headerReference w:type="default" r:id="rId14"/>
-      <w:footerReference w:type="default" r:id="rId15"/>
+      <w:headerReference w:type="default" r:id="rId20"/>
+      <w:footerReference w:type="default" r:id="rId21"/>
       <w:pgSz w:w="11906" w:h="16838" w:code="9"/>
       <w:pgMar w:top="851" w:right="851" w:bottom="851" w:left="851" w:header="567" w:footer="342" w:gutter="0"/>
       <w:cols w:space="720"/>
@@ -15795,6 +17471,7 @@
   <w:rsids>
     <w:rsidRoot w:val="001C0F3D"/>
     <w:rsid w:val="00056126"/>
+    <w:rsid w:val="000642B5"/>
     <w:rsid w:val="000F7AA8"/>
     <w:rsid w:val="001267A7"/>
     <w:rsid w:val="001C0F3D"/>
@@ -15804,6 +17481,7 @@
     <w:rsid w:val="004033F8"/>
     <w:rsid w:val="00434508"/>
     <w:rsid w:val="004B1DFD"/>
+    <w:rsid w:val="004E0A43"/>
     <w:rsid w:val="00546C8A"/>
     <w:rsid w:val="005B62FA"/>
     <w:rsid w:val="005D56E3"/>
@@ -15811,6 +17489,7 @@
     <w:rsid w:val="0066722D"/>
     <w:rsid w:val="00670EF4"/>
     <w:rsid w:val="008C3B4E"/>
+    <w:rsid w:val="00A708B5"/>
     <w:rsid w:val="00AE7E0D"/>
     <w:rsid w:val="00C5646E"/>
     <w:rsid w:val="00DF4D8D"/>
@@ -16587,7 +18266,36 @@
 </file>
 
 <file path=customXml/item1.xml><?xml version="1.0" encoding="utf-8"?>
-<LongProperties xmlns="http://schemas.microsoft.com/office/2006/metadata/longProperties"/>
+<p:properties xmlns:p="http://schemas.microsoft.com/office/2006/metadata/properties" xmlns:xsi="http://www.w3.org/2001/XMLSchema-instance" xmlns:pc="http://schemas.microsoft.com/office/infopath/2007/PartnerControls">
+  <documentManagement>
+    <CostCentre xmlns="c369ec6e-e776-4cfb-9aab-85bbb2d3059b">XQD Quality and Development</CostCentre>
+    <Tag xmlns="c369ec6e-e776-4cfb-9aab-85bbb2d3059b" xsi:nil="true"/>
+    <Suffix xmlns="c369ec6e-e776-4cfb-9aab-85bbb2d3059b">12</Suffix>
+    <NameKeywords xmlns="c369ec6e-e776-4cfb-9aab-85bbb2d3059b">Assessment Task Tool instruction resource instrument</NameKeywords>
+    <Corpex xmlns="c369ec6e-e776-4cfb-9aab-85bbb2d3059b">false</Corpex>
+    <ByWhom xmlns="c369ec6e-e776-4cfb-9aab-85bbb2d3059b">Manager, VET Curriculum and Quality Assurance</ByWhom>
+    <Prefix xmlns="c369ec6e-e776-4cfb-9aab-85bbb2d3059b">Form</Prefix>
+    <UploadDate xmlns="c369ec6e-e776-4cfb-9aab-85bbb2d3059b">2020-02-02T16:00:00+00:00</UploadDate>
+    <ActionRequired xmlns="c369ec6e-e776-4cfb-9aab-85bbb2d3059b">Review</ActionRequired>
+    <Links xmlns="c369ec6e-e776-4cfb-9aab-85bbb2d3059b" xsi:nil="true"/>
+    <IssueNum xmlns="c369ec6e-e776-4cfb-9aab-85bbb2d3059b" xsi:nil="true"/>
+    <Division xmlns="c369ec6e-e776-4cfb-9aab-85bbb2d3059b">Training Services</Division>
+    <IssueDate xmlns="c369ec6e-e776-4cfb-9aab-85bbb2d3059b">2020-02-02T16:00:00+00:00</IssueDate>
+    <Pathway xmlns="7f1ed7a5-13c4-4640-91cb-37295ecf9af4">Academic</Pathway>
+    <CentralStatus xmlns="c369ec6e-e776-4cfb-9aab-85bbb2d3059b" xsi:nil="true"/>
+    <ProposedTitle xmlns="c369ec6e-e776-4cfb-9aab-85bbb2d3059b">Assessment Task Tool (F122A12)</ProposedTitle>
+    <Frequently xmlns="c369ec6e-e776-4cfb-9aab-85bbb2d3059b">false</Frequently>
+    <OtherReferences xmlns="c369ec6e-e776-4cfb-9aab-85bbb2d3059b" xsi:nil="true"/>
+    <CergDate xmlns="c369ec6e-e776-4cfb-9aab-85bbb2d3059b" xsi:nil="true"/>
+    <International xmlns="c369ec6e-e776-4cfb-9aab-85bbb2d3059b" xsi:nil="true"/>
+    <Portal xmlns="c369ec6e-e776-4cfb-9aab-85bbb2d3059b">false</Portal>
+    <PolicyNum xmlns="c369ec6e-e776-4cfb-9aab-85bbb2d3059b">122</PolicyNum>
+    <CorpexDate xmlns="c369ec6e-e776-4cfb-9aab-85bbb2d3059b" xsi:nil="true"/>
+    <ReviewDate xmlns="c369ec6e-e776-4cfb-9aab-85bbb2d3059b">03/02/2021</ReviewDate>
+    <Comments xmlns="http://schemas.microsoft.com/sharepoint/v3">03/02/2020 received from Fiona Ion to upload see HPE</Comments>
+    <Cerg xmlns="c369ec6e-e776-4cfb-9aab-85bbb2d3059b" xsi:nil="true"/>
+  </documentManagement>
+</p:properties>
 </file>
 
 <file path=customXml/item2.xml><?xml version="1.0" encoding="utf-8"?>
@@ -16900,43 +18608,10 @@
 </file>
 
 <file path=customXml/item3.xml><?xml version="1.0" encoding="utf-8"?>
-<p:properties xmlns:p="http://schemas.microsoft.com/office/2006/metadata/properties" xmlns:xsi="http://www.w3.org/2001/XMLSchema-instance" xmlns:pc="http://schemas.microsoft.com/office/infopath/2007/PartnerControls">
-  <documentManagement>
-    <CostCentre xmlns="c369ec6e-e776-4cfb-9aab-85bbb2d3059b">XQD Quality and Development</CostCentre>
-    <Tag xmlns="c369ec6e-e776-4cfb-9aab-85bbb2d3059b" xsi:nil="true"/>
-    <Suffix xmlns="c369ec6e-e776-4cfb-9aab-85bbb2d3059b">12</Suffix>
-    <NameKeywords xmlns="c369ec6e-e776-4cfb-9aab-85bbb2d3059b">Assessment Task Tool instruction resource instrument</NameKeywords>
-    <Corpex xmlns="c369ec6e-e776-4cfb-9aab-85bbb2d3059b">false</Corpex>
-    <ByWhom xmlns="c369ec6e-e776-4cfb-9aab-85bbb2d3059b">Manager, VET Curriculum and Quality Assurance</ByWhom>
-    <Prefix xmlns="c369ec6e-e776-4cfb-9aab-85bbb2d3059b">Form</Prefix>
-    <UploadDate xmlns="c369ec6e-e776-4cfb-9aab-85bbb2d3059b">2020-02-02T16:00:00+00:00</UploadDate>
-    <ActionRequired xmlns="c369ec6e-e776-4cfb-9aab-85bbb2d3059b">Review</ActionRequired>
-    <Links xmlns="c369ec6e-e776-4cfb-9aab-85bbb2d3059b" xsi:nil="true"/>
-    <IssueNum xmlns="c369ec6e-e776-4cfb-9aab-85bbb2d3059b" xsi:nil="true"/>
-    <Division xmlns="c369ec6e-e776-4cfb-9aab-85bbb2d3059b">Training Services</Division>
-    <IssueDate xmlns="c369ec6e-e776-4cfb-9aab-85bbb2d3059b">2020-02-02T16:00:00+00:00</IssueDate>
-    <Pathway xmlns="7f1ed7a5-13c4-4640-91cb-37295ecf9af4">Academic</Pathway>
-    <CentralStatus xmlns="c369ec6e-e776-4cfb-9aab-85bbb2d3059b" xsi:nil="true"/>
-    <ProposedTitle xmlns="c369ec6e-e776-4cfb-9aab-85bbb2d3059b">Assessment Task Tool (F122A12)</ProposedTitle>
-    <Frequently xmlns="c369ec6e-e776-4cfb-9aab-85bbb2d3059b">false</Frequently>
-    <OtherReferences xmlns="c369ec6e-e776-4cfb-9aab-85bbb2d3059b" xsi:nil="true"/>
-    <CergDate xmlns="c369ec6e-e776-4cfb-9aab-85bbb2d3059b" xsi:nil="true"/>
-    <International xmlns="c369ec6e-e776-4cfb-9aab-85bbb2d3059b" xsi:nil="true"/>
-    <Portal xmlns="c369ec6e-e776-4cfb-9aab-85bbb2d3059b">false</Portal>
-    <PolicyNum xmlns="c369ec6e-e776-4cfb-9aab-85bbb2d3059b">122</PolicyNum>
-    <CorpexDate xmlns="c369ec6e-e776-4cfb-9aab-85bbb2d3059b" xsi:nil="true"/>
-    <ReviewDate xmlns="c369ec6e-e776-4cfb-9aab-85bbb2d3059b">03/02/2021</ReviewDate>
-    <Comments xmlns="http://schemas.microsoft.com/sharepoint/v3">03/02/2020 received from Fiona Ion to upload see HPE</Comments>
-    <Cerg xmlns="c369ec6e-e776-4cfb-9aab-85bbb2d3059b" xsi:nil="true"/>
-  </documentManagement>
-</p:properties>
+<LongProperties xmlns="http://schemas.microsoft.com/office/2006/metadata/longProperties"/>
 </file>
 
 <file path=customXml/item4.xml><?xml version="1.0" encoding="utf-8"?>
-<b:Sources xmlns:b="http://schemas.openxmlformats.org/officeDocument/2006/bibliography" xmlns="http://schemas.openxmlformats.org/officeDocument/2006/bibliography" SelectedStyle="\APA.XSL" StyleName="APA"/>
-</file>
-
-<file path=customXml/item5.xml><?xml version="1.0" encoding="utf-8"?>
 <?mso-contentType ?>
 <FormTemplates xmlns="http://schemas.microsoft.com/sharepoint/v3/contenttype/forms">
   <Display>DocumentLibraryForm</Display>
@@ -16945,10 +18620,18 @@
 </FormTemplates>
 </file>
 
+<file path=customXml/item5.xml><?xml version="1.0" encoding="utf-8"?>
+<b:Sources xmlns:b="http://schemas.openxmlformats.org/officeDocument/2006/bibliography" xmlns="http://schemas.openxmlformats.org/officeDocument/2006/bibliography" SelectedStyle="\APA.XSL" StyleName="APA"/>
+</file>
+
 <file path=customXml/itemProps1.xml><?xml version="1.0" encoding="utf-8"?>
-<ds:datastoreItem xmlns:ds="http://schemas.openxmlformats.org/officeDocument/2006/customXml" ds:itemID="{ED9C3AC7-65F6-444B-AAD9-BED76FF91658}">
+<ds:datastoreItem xmlns:ds="http://schemas.openxmlformats.org/officeDocument/2006/customXml" ds:itemID="{A16F99D5-FAF9-47B7-BB2E-CAC1EF9F3B71}">
   <ds:schemaRefs>
-    <ds:schemaRef ds:uri="http://schemas.microsoft.com/office/2006/metadata/longProperties"/>
+    <ds:schemaRef ds:uri="http://schemas.microsoft.com/office/2006/metadata/properties"/>
+    <ds:schemaRef ds:uri="http://schemas.microsoft.com/office/infopath/2007/PartnerControls"/>
+    <ds:schemaRef ds:uri="c369ec6e-e776-4cfb-9aab-85bbb2d3059b"/>
+    <ds:schemaRef ds:uri="7f1ed7a5-13c4-4640-91cb-37295ecf9af4"/>
+    <ds:schemaRef ds:uri="http://schemas.microsoft.com/sharepoint/v3"/>
   </ds:schemaRefs>
 </ds:datastoreItem>
 </file>
@@ -16974,29 +18657,25 @@
 </file>
 
 <file path=customXml/itemProps3.xml><?xml version="1.0" encoding="utf-8"?>
-<ds:datastoreItem xmlns:ds="http://schemas.openxmlformats.org/officeDocument/2006/customXml" ds:itemID="{A16F99D5-FAF9-47B7-BB2E-CAC1EF9F3B71}">
+<ds:datastoreItem xmlns:ds="http://schemas.openxmlformats.org/officeDocument/2006/customXml" ds:itemID="{ED9C3AC7-65F6-444B-AAD9-BED76FF91658}">
   <ds:schemaRefs>
-    <ds:schemaRef ds:uri="http://schemas.microsoft.com/office/2006/metadata/properties"/>
-    <ds:schemaRef ds:uri="http://schemas.microsoft.com/office/infopath/2007/PartnerControls"/>
-    <ds:schemaRef ds:uri="c369ec6e-e776-4cfb-9aab-85bbb2d3059b"/>
-    <ds:schemaRef ds:uri="7f1ed7a5-13c4-4640-91cb-37295ecf9af4"/>
-    <ds:schemaRef ds:uri="http://schemas.microsoft.com/sharepoint/v3"/>
+    <ds:schemaRef ds:uri="http://schemas.microsoft.com/office/2006/metadata/longProperties"/>
   </ds:schemaRefs>
 </ds:datastoreItem>
 </file>
 
 <file path=customXml/itemProps4.xml><?xml version="1.0" encoding="utf-8"?>
+<ds:datastoreItem xmlns:ds="http://schemas.openxmlformats.org/officeDocument/2006/customXml" ds:itemID="{96001339-1F25-4BDD-94F9-AA3400008571}">
+  <ds:schemaRefs>
+    <ds:schemaRef ds:uri="http://schemas.microsoft.com/sharepoint/v3/contenttype/forms"/>
+  </ds:schemaRefs>
+</ds:datastoreItem>
+</file>
+
+<file path=customXml/itemProps5.xml><?xml version="1.0" encoding="utf-8"?>
 <ds:datastoreItem xmlns:ds="http://schemas.openxmlformats.org/officeDocument/2006/customXml" ds:itemID="{270A1387-5032-421F-ABE8-3776CE5E5F42}">
   <ds:schemaRefs>
     <ds:schemaRef ds:uri="http://schemas.openxmlformats.org/officeDocument/2006/bibliography"/>
   </ds:schemaRefs>
 </ds:datastoreItem>
-</file>
-
-<file path=customXml/itemProps5.xml><?xml version="1.0" encoding="utf-8"?>
-<ds:datastoreItem xmlns:ds="http://schemas.openxmlformats.org/officeDocument/2006/customXml" ds:itemID="{96001339-1F25-4BDD-94F9-AA3400008571}">
-  <ds:schemaRefs>
-    <ds:schemaRef ds:uri="http://schemas.microsoft.com/sharepoint/v3/contenttype/forms"/>
-  </ds:schemaRefs>
-</ds:datastoreItem>
 </file>
</xml_diff>